<commit_message>
Created function to add  multiple inventor information tables for 'applicationdata_new2' merge.
</commit_message>
<xml_diff>
--- a/project/documents/formaldocuments/ApplicationDataSheet_NEW2.docx
+++ b/project/documents/formaldocuments/ApplicationDataSheet_NEW2.docx
@@ -4,1820 +4,8 @@
   <w:body>
     <w:p>
       <w:pPr>
-        <w:spacing w:before="27" w:after="0" w:line="240" w:lineRule="auto"/>
-        <w:ind w:left="134" w:right="-20"/>
-        <w:rPr>
-          <w:rFonts w:eastAsia="Arial" w:cstheme="minorHAnsi"/>
-          <w:sz w:val="28"/>
-          <w:szCs w:val="28"/>
-        </w:rPr>
-      </w:pPr>
-      <w:r>
-        <w:rPr>
-          <w:rFonts w:eastAsia="Arial" w:cstheme="minorHAnsi"/>
-          <w:b/>
-          <w:bCs/>
-          <w:sz w:val="28"/>
-          <w:szCs w:val="28"/>
-        </w:rPr>
-        <w:t>Secrecy Order</w:t>
-      </w:r>
-      <w:r>
-        <w:rPr>
-          <w:rFonts w:eastAsia="Arial" w:cstheme="minorHAnsi"/>
-          <w:b/>
-          <w:bCs/>
-          <w:spacing w:val="52"/>
-          <w:sz w:val="28"/>
-          <w:szCs w:val="28"/>
-        </w:rPr>
-        <w:t xml:space="preserve"> </w:t>
-      </w:r>
-      <w:r>
-        <w:rPr>
-          <w:rFonts w:eastAsia="Arial" w:cstheme="minorHAnsi"/>
-          <w:b/>
-          <w:bCs/>
-          <w:sz w:val="28"/>
-          <w:szCs w:val="28"/>
-        </w:rPr>
-        <w:t>37</w:t>
-      </w:r>
-      <w:r>
-        <w:rPr>
-          <w:rFonts w:eastAsia="Arial" w:cstheme="minorHAnsi"/>
-          <w:b/>
-          <w:bCs/>
-          <w:spacing w:val="23"/>
-          <w:sz w:val="28"/>
-          <w:szCs w:val="28"/>
-        </w:rPr>
-        <w:t xml:space="preserve"> </w:t>
-      </w:r>
-      <w:r>
-        <w:rPr>
-          <w:rFonts w:eastAsia="Arial" w:cstheme="minorHAnsi"/>
-          <w:b/>
-          <w:bCs/>
-          <w:sz w:val="28"/>
-          <w:szCs w:val="28"/>
-        </w:rPr>
-        <w:t>CFR</w:t>
-      </w:r>
-      <w:r>
-        <w:rPr>
-          <w:rFonts w:eastAsia="Arial" w:cstheme="minorHAnsi"/>
-          <w:b/>
-          <w:bCs/>
-          <w:spacing w:val="40"/>
-          <w:sz w:val="28"/>
-          <w:szCs w:val="28"/>
-        </w:rPr>
-        <w:t xml:space="preserve"> </w:t>
-      </w:r>
-      <w:r>
-        <w:rPr>
-          <w:rFonts w:eastAsia="Arial" w:cstheme="minorHAnsi"/>
-          <w:b/>
-          <w:bCs/>
-          <w:w w:val="110"/>
-          <w:sz w:val="28"/>
-          <w:szCs w:val="28"/>
-        </w:rPr>
-        <w:t>5.2</w:t>
-      </w:r>
-      <w:r>
-        <w:rPr>
-          <w:rFonts w:eastAsia="Arial" w:cstheme="minorHAnsi"/>
-          <w:b/>
-          <w:bCs/>
-          <w:w w:val="110"/>
-          <w:sz w:val="28"/>
-          <w:szCs w:val="28"/>
-        </w:rPr>
-        <w:t>:</w:t>
-      </w:r>
-    </w:p>
-    <w:tbl>
-      <w:tblPr>
-        <w:tblStyle w:val="TableGrid"/>
-        <w:tblW w:w="0" w:type="auto"/>
-        <w:tblInd w:w="85" w:type="dxa"/>
-        <w:tblLook w:val="04A0" w:firstRow="1" w:lastRow="0" w:firstColumn="1" w:lastColumn="0" w:noHBand="0" w:noVBand="1"/>
-      </w:tblPr>
-      <w:tblGrid>
-        <w:gridCol w:w="10905"/>
-      </w:tblGrid>
-      <w:tr>
-        <w:trPr>
-          <w:trHeight w:val="577"/>
-        </w:trPr>
-        <w:tc>
-          <w:tcPr>
-            <w:tcW w:w="10905" w:type="dxa"/>
-          </w:tcPr>
-          <w:p>
-            <w:pPr>
-              <w:widowControl/>
-              <w:autoSpaceDE w:val="0"/>
-              <w:autoSpaceDN w:val="0"/>
-              <w:adjustRightInd w:val="0"/>
-              <w:rPr>
-                <w:rFonts w:cstheme="minorHAnsi"/>
-                <w:b/>
-              </w:rPr>
-            </w:pPr>
-            <w:sdt>
-              <w:sdtPr>
-                <w:rPr>
-                  <w:rFonts w:eastAsia="Arial" w:cstheme="minorHAnsi"/>
-                  <w:b/>
-                  <w:bCs/>
-                  <w:sz w:val="28"/>
-                  <w:szCs w:val="28"/>
-                </w:rPr>
-                <w:id w:val="580801411"/>
-                <w14:checkbox>
-                  <w14:checked w14:val="0"/>
-                  <w14:checkedState w14:val="2612" w14:font="MS Gothic"/>
-                  <w14:uncheckedState w14:val="2610" w14:font="MS Gothic"/>
-                </w14:checkbox>
-              </w:sdtPr>
-              <w:sdtEndPr/>
-              <w:sdtContent>
-                <w:r>
-                  <w:rPr>
-                    <w:rFonts w:ascii="MS Gothic" w:eastAsia="MS Gothic" w:hAnsi="MS Gothic" w:cstheme="minorHAnsi" w:hint="eastAsia"/>
-                    <w:b/>
-                    <w:bCs/>
-                    <w:sz w:val="28"/>
-                    <w:szCs w:val="28"/>
-                  </w:rPr>
-                  <w:t>☐</w:t>
-                </w:r>
-              </w:sdtContent>
-            </w:sdt>
-            <w:r>
-              <w:rPr>
-                <w:rFonts w:cstheme="minorHAnsi"/>
-                <w:b/>
-                <w:sz w:val="18"/>
-                <w:szCs w:val="18"/>
-              </w:rPr>
-              <w:t xml:space="preserve"> </w:t>
-            </w:r>
-            <w:r>
-              <w:rPr>
-                <w:rFonts w:cstheme="minorHAnsi"/>
-                <w:b/>
-                <w:sz w:val="18"/>
-                <w:szCs w:val="18"/>
-              </w:rPr>
-              <w:t xml:space="preserve"> </w:t>
-            </w:r>
-            <w:r>
-              <w:rPr>
-                <w:rFonts w:cstheme="minorHAnsi"/>
-                <w:b/>
-              </w:rPr>
-              <w:t>Portions or all of the application associated with this Application Data Sheet may fall under a Secrecy Order pursuant to</w:t>
-            </w:r>
-            <w:r>
-              <w:rPr>
-                <w:rFonts w:cstheme="minorHAnsi"/>
-                <w:b/>
-              </w:rPr>
-              <w:t xml:space="preserve"> </w:t>
-            </w:r>
-            <w:r>
-              <w:rPr>
-                <w:rFonts w:cstheme="minorHAnsi"/>
-                <w:b/>
-              </w:rPr>
-              <w:t>37 CFR 5.2 (Paper filers only. Applications that fall under Secrecy Order may not be filed electronically.)</w:t>
-            </w:r>
-          </w:p>
-        </w:tc>
-      </w:tr>
-    </w:tbl>
-    <w:p>
-      <w:pPr>
-        <w:tabs>
-          <w:tab w:val="left" w:pos="7800"/>
-        </w:tabs>
-        <w:spacing w:before="44" w:after="0" w:line="417" w:lineRule="exact"/>
-        <w:ind w:right="-20" w:firstLine="180"/>
-        <w:rPr>
-          <w:rFonts w:eastAsia="Arial" w:cstheme="minorHAnsi"/>
-          <w:sz w:val="28"/>
-          <w:szCs w:val="28"/>
-        </w:rPr>
-      </w:pPr>
-      <w:r>
-        <w:rPr>
-          <w:rFonts w:eastAsia="Arial" w:cstheme="minorHAnsi"/>
-          <w:b/>
-          <w:bCs/>
-          <w:w w:val="92"/>
-          <w:position w:val="-1"/>
-          <w:sz w:val="28"/>
-          <w:szCs w:val="28"/>
-        </w:rPr>
-        <w:t>Inventor</w:t>
-      </w:r>
-      <w:r>
-        <w:rPr>
-          <w:rFonts w:eastAsia="Arial" w:cstheme="minorHAnsi"/>
-          <w:b/>
-          <w:bCs/>
-          <w:w w:val="92"/>
-          <w:position w:val="-1"/>
-          <w:sz w:val="28"/>
-          <w:szCs w:val="28"/>
-        </w:rPr>
-        <w:t xml:space="preserve"> Information:</w:t>
-      </w:r>
-      <w:r>
-        <w:rPr>
-          <w:rFonts w:eastAsia="Arial" w:cstheme="minorHAnsi"/>
-          <w:b/>
-          <w:bCs/>
-          <w:w w:val="92"/>
-          <w:position w:val="-1"/>
-          <w:sz w:val="28"/>
-          <w:szCs w:val="28"/>
-        </w:rPr>
-        <w:tab/>
-      </w:r>
-    </w:p>
-    <w:tbl>
-      <w:tblPr>
-        <w:tblW w:w="10902" w:type="dxa"/>
-        <w:tblInd w:w="101" w:type="dxa"/>
-        <w:tblBorders>
-          <w:top w:val="single" w:sz="2" w:space="0" w:color="000000"/>
-          <w:left w:val="single" w:sz="2" w:space="0" w:color="000000"/>
-          <w:bottom w:val="single" w:sz="2" w:space="0" w:color="000000"/>
-          <w:right w:val="single" w:sz="2" w:space="0" w:color="000000"/>
-          <w:insideH w:val="single" w:sz="2" w:space="0" w:color="000000"/>
-          <w:insideV w:val="single" w:sz="2" w:space="0" w:color="000000"/>
-        </w:tblBorders>
-        <w:tblLayout w:type="fixed"/>
-        <w:tblCellMar>
-          <w:left w:w="0" w:type="dxa"/>
-          <w:right w:w="0" w:type="dxa"/>
-        </w:tblCellMar>
-        <w:tblLook w:val="01E0" w:firstRow="1" w:lastRow="1" w:firstColumn="1" w:lastColumn="1" w:noHBand="0" w:noVBand="0"/>
-      </w:tblPr>
-      <w:tblGrid>
-        <w:gridCol w:w="619"/>
-        <w:gridCol w:w="444"/>
-        <w:gridCol w:w="9"/>
-        <w:gridCol w:w="1159"/>
-        <w:gridCol w:w="14"/>
-        <w:gridCol w:w="717"/>
-        <w:gridCol w:w="1101"/>
-        <w:gridCol w:w="607"/>
-        <w:gridCol w:w="441"/>
-        <w:gridCol w:w="1170"/>
-        <w:gridCol w:w="371"/>
-        <w:gridCol w:w="268"/>
-        <w:gridCol w:w="92"/>
-        <w:gridCol w:w="1170"/>
-        <w:gridCol w:w="808"/>
-        <w:gridCol w:w="1912"/>
-      </w:tblGrid>
-      <w:tr>
-        <w:trPr>
-          <w:trHeight w:hRule="exact" w:val="374"/>
-        </w:trPr>
-        <w:tc>
-          <w:tcPr>
-            <w:tcW w:w="10902" w:type="dxa"/>
-            <w:gridSpan w:val="16"/>
-            <w:tcBorders>
-              <w:top w:val="single" w:sz="18" w:space="0" w:color="000000"/>
-              <w:left w:val="single" w:sz="18" w:space="0" w:color="000000"/>
-              <w:bottom w:val="single" w:sz="18" w:space="0" w:color="000000"/>
-              <w:right w:val="single" w:sz="18" w:space="0" w:color="000000"/>
-            </w:tcBorders>
-            <w:vAlign w:val="center"/>
-          </w:tcPr>
-          <w:p>
-            <w:pPr>
-              <w:keepNext/>
-              <w:widowControl/>
-              <w:tabs>
-                <w:tab w:val="left" w:pos="8620"/>
-              </w:tabs>
-              <w:spacing w:after="0" w:line="240" w:lineRule="auto"/>
-              <w:ind w:left="144" w:right="-14"/>
-              <w:rPr>
-                <w:rFonts w:eastAsia="Arial" w:cstheme="minorHAnsi"/>
-                <w:sz w:val="24"/>
-                <w:szCs w:val="24"/>
-              </w:rPr>
-            </w:pPr>
-            <w:r>
-              <w:rPr>
-                <w:rFonts w:eastAsia="Arial" w:cstheme="minorHAnsi"/>
-                <w:b/>
-                <w:bCs/>
-                <w:spacing w:val="-43"/>
-                <w:position w:val="-4"/>
-                <w:sz w:val="24"/>
-                <w:szCs w:val="24"/>
-              </w:rPr>
-              <w:t xml:space="preserve">  </w:t>
-            </w:r>
-            <w:r>
-              <w:rPr>
-                <w:rFonts w:cstheme="minorHAnsi"/>
-                <w:b/>
-                <w:bCs/>
-                <w:sz w:val="24"/>
-                <w:szCs w:val="24"/>
-              </w:rPr>
-              <w:t>&lt;&lt;inventorCnt&gt;&gt;</w:t>
-            </w:r>
-            <w:r>
-              <w:rPr>
-                <w:rFonts w:cstheme="minorHAnsi"/>
-                <w:b/>
-                <w:bCs/>
-              </w:rPr>
-              <w:t xml:space="preserve"> </w:t>
-            </w:r>
-            <w:r>
-              <w:rPr>
-                <w:rFonts w:cstheme="minorHAnsi"/>
-                <w:b/>
-                <w:bCs/>
-              </w:rPr>
-              <w:t xml:space="preserve">  </w:t>
-            </w:r>
-            <w:r>
-              <w:rPr>
-                <w:rFonts w:cstheme="minorHAnsi"/>
-                <w:bCs/>
-              </w:rPr>
-              <w:t>&lt;&lt;inventor&gt;&gt;</w:t>
-            </w:r>
-          </w:p>
-        </w:tc>
-      </w:tr>
-      <w:tr>
-        <w:trPr>
-          <w:trHeight w:hRule="exact" w:val="346"/>
-        </w:trPr>
-        <w:tc>
-          <w:tcPr>
-            <w:tcW w:w="10902" w:type="dxa"/>
-            <w:gridSpan w:val="16"/>
-            <w:tcBorders>
-              <w:top w:val="single" w:sz="18" w:space="0" w:color="000000"/>
-            </w:tcBorders>
-            <w:vAlign w:val="center"/>
-          </w:tcPr>
-          <w:p>
-            <w:pPr>
-              <w:keepNext/>
-              <w:widowControl/>
-              <w:spacing w:before="21" w:after="0" w:line="240" w:lineRule="auto"/>
-              <w:ind w:left="137" w:right="-57"/>
-              <w:rPr>
-                <w:rFonts w:eastAsia="Arial" w:cstheme="minorHAnsi"/>
-                <w:b/>
-                <w:bCs/>
-                <w:w w:val="106"/>
-                <w:sz w:val="24"/>
-                <w:szCs w:val="24"/>
-              </w:rPr>
-            </w:pPr>
-            <w:r>
-              <w:rPr>
-                <w:rFonts w:eastAsia="Arial" w:cstheme="minorHAnsi"/>
-                <w:b/>
-                <w:bCs/>
-                <w:w w:val="106"/>
-                <w:sz w:val="24"/>
-                <w:szCs w:val="24"/>
-              </w:rPr>
-              <w:t>Legal Name</w:t>
-            </w:r>
-          </w:p>
-        </w:tc>
-      </w:tr>
-      <w:tr>
-        <w:trPr>
-          <w:trHeight w:hRule="exact" w:val="346"/>
-        </w:trPr>
-        <w:tc>
-          <w:tcPr>
-            <w:tcW w:w="1072" w:type="dxa"/>
-            <w:gridSpan w:val="3"/>
-            <w:vAlign w:val="center"/>
-          </w:tcPr>
-          <w:p>
-            <w:pPr>
-              <w:keepNext/>
-              <w:widowControl/>
-              <w:spacing w:after="0" w:line="240" w:lineRule="auto"/>
-              <w:ind w:left="144"/>
-              <w:rPr>
-                <w:rFonts w:eastAsia="Arial" w:cstheme="minorHAnsi"/>
-              </w:rPr>
-            </w:pPr>
-            <w:r>
-              <w:rPr>
-                <w:rFonts w:eastAsia="Arial" w:cstheme="minorHAnsi"/>
-                <w:b/>
-                <w:bCs/>
-                <w:w w:val="104"/>
-              </w:rPr>
-              <w:t>Prefix</w:t>
-            </w:r>
-          </w:p>
-        </w:tc>
-        <w:tc>
-          <w:tcPr>
-            <w:tcW w:w="2991" w:type="dxa"/>
-            <w:gridSpan w:val="4"/>
-            <w:vAlign w:val="center"/>
-          </w:tcPr>
-          <w:p>
-            <w:pPr>
-              <w:keepNext/>
-              <w:widowControl/>
-              <w:spacing w:after="0" w:line="240" w:lineRule="auto"/>
-              <w:ind w:left="43"/>
-              <w:rPr>
-                <w:rFonts w:eastAsia="Arial" w:cstheme="minorHAnsi"/>
-              </w:rPr>
-            </w:pPr>
-            <w:r>
-              <w:rPr>
-                <w:rFonts w:eastAsia="Arial" w:cstheme="minorHAnsi"/>
-                <w:b/>
-                <w:bCs/>
-              </w:rPr>
-              <w:t>Given</w:t>
-            </w:r>
-            <w:r>
-              <w:rPr>
-                <w:rFonts w:eastAsia="Arial" w:cstheme="minorHAnsi"/>
-                <w:b/>
-                <w:bCs/>
-                <w:spacing w:val="31"/>
-              </w:rPr>
-              <w:t xml:space="preserve"> </w:t>
-            </w:r>
-            <w:r>
-              <w:rPr>
-                <w:rFonts w:eastAsia="Arial" w:cstheme="minorHAnsi"/>
-                <w:b/>
-                <w:bCs/>
-                <w:w w:val="107"/>
-              </w:rPr>
-              <w:t>Name</w:t>
-            </w:r>
-          </w:p>
-        </w:tc>
-        <w:tc>
-          <w:tcPr>
-            <w:tcW w:w="2589" w:type="dxa"/>
-            <w:gridSpan w:val="4"/>
-            <w:vAlign w:val="center"/>
-          </w:tcPr>
-          <w:p>
-            <w:pPr>
-              <w:keepNext/>
-              <w:widowControl/>
-              <w:spacing w:after="0" w:line="240" w:lineRule="auto"/>
-              <w:ind w:left="144"/>
-              <w:rPr>
-                <w:rFonts w:eastAsia="Arial" w:cstheme="minorHAnsi"/>
-              </w:rPr>
-            </w:pPr>
-            <w:r>
-              <w:rPr>
-                <w:rFonts w:eastAsia="Arial" w:cstheme="minorHAnsi"/>
-                <w:b/>
-                <w:bCs/>
-              </w:rPr>
-              <w:t>Middle</w:t>
-            </w:r>
-            <w:r>
-              <w:rPr>
-                <w:rFonts w:eastAsia="Arial" w:cstheme="minorHAnsi"/>
-                <w:b/>
-                <w:bCs/>
-                <w:spacing w:val="34"/>
-              </w:rPr>
-              <w:t xml:space="preserve"> </w:t>
-            </w:r>
-            <w:r>
-              <w:rPr>
-                <w:rFonts w:eastAsia="Arial" w:cstheme="minorHAnsi"/>
-                <w:b/>
-                <w:bCs/>
-                <w:w w:val="106"/>
-              </w:rPr>
-              <w:t>Name</w:t>
-            </w:r>
-          </w:p>
-        </w:tc>
-        <w:tc>
-          <w:tcPr>
-            <w:tcW w:w="2338" w:type="dxa"/>
-            <w:gridSpan w:val="4"/>
-            <w:vAlign w:val="center"/>
-          </w:tcPr>
-          <w:p>
-            <w:pPr>
-              <w:keepNext/>
-              <w:widowControl/>
-              <w:spacing w:after="0" w:line="240" w:lineRule="auto"/>
-              <w:ind w:left="144"/>
-              <w:rPr>
-                <w:rFonts w:eastAsia="Arial" w:cstheme="minorHAnsi"/>
-              </w:rPr>
-            </w:pPr>
-            <w:r>
-              <w:rPr>
-                <w:rFonts w:eastAsia="Arial" w:cstheme="minorHAnsi"/>
-                <w:b/>
-                <w:bCs/>
-              </w:rPr>
-              <w:t>Family</w:t>
-            </w:r>
-            <w:r>
-              <w:rPr>
-                <w:rFonts w:eastAsia="Arial" w:cstheme="minorHAnsi"/>
-                <w:b/>
-                <w:bCs/>
-                <w:spacing w:val="32"/>
-              </w:rPr>
-              <w:t xml:space="preserve"> </w:t>
-            </w:r>
-            <w:r>
-              <w:rPr>
-                <w:rFonts w:eastAsia="Arial" w:cstheme="minorHAnsi"/>
-                <w:b/>
-                <w:bCs/>
-                <w:w w:val="106"/>
-              </w:rPr>
-              <w:t>Name</w:t>
-            </w:r>
-          </w:p>
-        </w:tc>
-        <w:tc>
-          <w:tcPr>
-            <w:tcW w:w="1912" w:type="dxa"/>
-            <w:vAlign w:val="center"/>
-          </w:tcPr>
-          <w:p>
-            <w:pPr>
-              <w:keepNext/>
-              <w:widowControl/>
-              <w:spacing w:after="0" w:line="240" w:lineRule="auto"/>
-              <w:ind w:left="144"/>
-              <w:rPr>
-                <w:rFonts w:eastAsia="Arial" w:cstheme="minorHAnsi"/>
-              </w:rPr>
-            </w:pPr>
-            <w:r>
-              <w:rPr>
-                <w:rFonts w:eastAsia="Arial" w:cstheme="minorHAnsi"/>
-                <w:b/>
-                <w:bCs/>
-                <w:w w:val="106"/>
-              </w:rPr>
-              <w:t>Suffix</w:t>
-            </w:r>
-          </w:p>
-        </w:tc>
-      </w:tr>
-      <w:tr>
-        <w:trPr>
-          <w:trHeight w:hRule="exact" w:val="394"/>
-        </w:trPr>
-        <w:tc>
-          <w:tcPr>
-            <w:tcW w:w="1072" w:type="dxa"/>
-            <w:gridSpan w:val="3"/>
-            <w:vAlign w:val="center"/>
-          </w:tcPr>
-          <w:p>
-            <w:pPr>
-              <w:keepNext/>
-              <w:widowControl/>
-              <w:spacing w:after="0" w:line="240" w:lineRule="auto"/>
-              <w:jc w:val="center"/>
-              <w:rPr>
-                <w:rFonts w:eastAsia="Times New Roman" w:cstheme="minorHAnsi"/>
-              </w:rPr>
-            </w:pPr>
-            <w:r>
-              <w:rPr>
-                <w:rFonts w:eastAsia="Times New Roman" w:cstheme="minorHAnsi"/>
-              </w:rPr>
-              <w:t>&lt;</w:t>
-            </w:r>
-            <w:r>
-              <w:rPr>
-                <w:rFonts w:eastAsia="Times New Roman" w:cstheme="minorHAnsi"/>
-              </w:rPr>
-              <w:t>&lt;invpre&gt;&gt;</w:t>
-            </w:r>
-          </w:p>
-        </w:tc>
-        <w:tc>
-          <w:tcPr>
-            <w:tcW w:w="2991" w:type="dxa"/>
-            <w:gridSpan w:val="4"/>
-            <w:vAlign w:val="center"/>
-          </w:tcPr>
-          <w:p>
-            <w:pPr>
-              <w:keepNext/>
-              <w:widowControl/>
-              <w:spacing w:after="0" w:line="240" w:lineRule="auto"/>
-              <w:ind w:left="43"/>
-              <w:rPr>
-                <w:rFonts w:cstheme="minorHAnsi"/>
-              </w:rPr>
-            </w:pPr>
-            <w:r>
-              <w:rPr>
-                <w:rFonts w:cstheme="minorHAnsi"/>
-                <w:bCs/>
-              </w:rPr>
-              <w:t>&lt;</w:t>
-            </w:r>
-            <w:r>
-              <w:rPr>
-                <w:rFonts w:cstheme="minorHAnsi"/>
-                <w:bCs/>
-              </w:rPr>
-              <w:t>&lt;inventorFirstName&gt;&gt;</w:t>
-            </w:r>
-          </w:p>
-        </w:tc>
-        <w:tc>
-          <w:tcPr>
-            <w:tcW w:w="2589" w:type="dxa"/>
-            <w:gridSpan w:val="4"/>
-            <w:vAlign w:val="center"/>
-          </w:tcPr>
-          <w:p>
-            <w:pPr>
-              <w:keepNext/>
-              <w:widowControl/>
-              <w:spacing w:after="0" w:line="240" w:lineRule="auto"/>
-              <w:ind w:left="43"/>
-              <w:rPr>
-                <w:rFonts w:cstheme="minorHAnsi"/>
-              </w:rPr>
-            </w:pPr>
-            <w:r>
-              <w:rPr>
-                <w:rFonts w:cstheme="minorHAnsi"/>
-              </w:rPr>
-              <w:t>&lt;&lt;inventorMiddleInitial&gt;&gt;</w:t>
-            </w:r>
-          </w:p>
-        </w:tc>
-        <w:tc>
-          <w:tcPr>
-            <w:tcW w:w="2338" w:type="dxa"/>
-            <w:gridSpan w:val="4"/>
-            <w:vAlign w:val="center"/>
-          </w:tcPr>
-          <w:p>
-            <w:pPr>
-              <w:keepNext/>
-              <w:widowControl/>
-              <w:spacing w:after="0" w:line="240" w:lineRule="auto"/>
-              <w:ind w:left="43"/>
-              <w:rPr>
-                <w:rFonts w:cstheme="minorHAnsi"/>
-              </w:rPr>
-            </w:pPr>
-            <w:r>
-              <w:rPr>
-                <w:rFonts w:cstheme="minorHAnsi"/>
-                <w:bCs/>
-              </w:rPr>
-              <w:t>&lt;</w:t>
-            </w:r>
-            <w:r>
-              <w:rPr>
-                <w:rFonts w:cstheme="minorHAnsi"/>
-                <w:bCs/>
-              </w:rPr>
-              <w:t>&lt;inventorLastName&gt;&gt;</w:t>
-            </w:r>
-          </w:p>
-        </w:tc>
-        <w:tc>
-          <w:tcPr>
-            <w:tcW w:w="1912" w:type="dxa"/>
-            <w:vAlign w:val="center"/>
-          </w:tcPr>
-          <w:p>
-            <w:pPr>
-              <w:keepNext/>
-              <w:widowControl/>
-              <w:spacing w:after="0" w:line="240" w:lineRule="auto"/>
-              <w:ind w:left="43"/>
-              <w:rPr>
-                <w:rFonts w:eastAsia="Times New Roman" w:cstheme="minorHAnsi"/>
-              </w:rPr>
-            </w:pPr>
-            <w:r>
-              <w:rPr>
-                <w:rFonts w:eastAsia="Times New Roman" w:cstheme="minorHAnsi"/>
-              </w:rPr>
-              <w:t>&lt;&lt;inventorSuffix&gt;&gt;</w:t>
-            </w:r>
-          </w:p>
-        </w:tc>
-      </w:tr>
-      <w:tr>
-        <w:trPr>
-          <w:trHeight w:hRule="exact" w:val="673"/>
-        </w:trPr>
-        <w:tc>
-          <w:tcPr>
-            <w:tcW w:w="10902" w:type="dxa"/>
-            <w:gridSpan w:val="16"/>
-            <w:vAlign w:val="center"/>
-          </w:tcPr>
-          <w:p>
-            <w:pPr>
-              <w:tabs>
-                <w:tab w:val="left" w:pos="5500"/>
-                <w:tab w:val="left" w:pos="7660"/>
-              </w:tabs>
-              <w:spacing w:after="0" w:line="261" w:lineRule="exact"/>
-              <w:ind w:right="-20"/>
-              <w:rPr>
-                <w:rFonts w:eastAsia="Arial" w:cstheme="minorHAnsi"/>
-                <w:b/>
-                <w:bCs/>
-                <w:position w:val="2"/>
-              </w:rPr>
-            </w:pPr>
-            <w:r>
-              <w:rPr>
-                <w:rFonts w:eastAsia="Arial" w:cstheme="minorHAnsi"/>
-                <w:b/>
-                <w:bCs/>
-                <w:position w:val="2"/>
-              </w:rPr>
-              <w:t xml:space="preserve">  </w:t>
-            </w:r>
-            <w:r>
-              <w:rPr>
-                <w:rFonts w:eastAsia="Arial" w:cstheme="minorHAnsi"/>
-                <w:b/>
-                <w:bCs/>
-                <w:position w:val="2"/>
-              </w:rPr>
-              <w:t>Residence</w:t>
-            </w:r>
-            <w:r>
-              <w:rPr>
-                <w:rFonts w:eastAsia="Arial" w:cstheme="minorHAnsi"/>
-                <w:b/>
-                <w:bCs/>
-                <w:spacing w:val="37"/>
-                <w:position w:val="2"/>
-              </w:rPr>
-              <w:t xml:space="preserve"> </w:t>
-            </w:r>
-            <w:r>
-              <w:rPr>
-                <w:rFonts w:eastAsia="Arial" w:cstheme="minorHAnsi"/>
-                <w:b/>
-                <w:bCs/>
-                <w:position w:val="2"/>
-              </w:rPr>
-              <w:t>Information</w:t>
-            </w:r>
-            <w:r>
-              <w:rPr>
-                <w:rFonts w:eastAsia="Arial" w:cstheme="minorHAnsi"/>
-                <w:b/>
-                <w:bCs/>
-                <w:spacing w:val="45"/>
-                <w:position w:val="2"/>
-              </w:rPr>
-              <w:t xml:space="preserve"> </w:t>
-            </w:r>
-            <w:r>
-              <w:rPr>
-                <w:rFonts w:eastAsia="Arial" w:cstheme="minorHAnsi"/>
-                <w:b/>
-                <w:bCs/>
-                <w:position w:val="2"/>
-              </w:rPr>
-              <w:t>(Select</w:t>
-            </w:r>
-            <w:r>
-              <w:rPr>
-                <w:rFonts w:eastAsia="Arial" w:cstheme="minorHAnsi"/>
-                <w:b/>
-                <w:bCs/>
-                <w:spacing w:val="25"/>
-                <w:position w:val="2"/>
-              </w:rPr>
-              <w:t xml:space="preserve"> </w:t>
-            </w:r>
-            <w:r>
-              <w:rPr>
-                <w:rFonts w:eastAsia="Arial" w:cstheme="minorHAnsi"/>
-                <w:b/>
-                <w:bCs/>
-                <w:position w:val="2"/>
-              </w:rPr>
-              <w:t>One)</w:t>
-            </w:r>
-          </w:p>
-          <w:p>
-            <w:pPr>
-              <w:tabs>
-                <w:tab w:val="left" w:pos="5500"/>
-                <w:tab w:val="left" w:pos="7660"/>
-              </w:tabs>
-              <w:spacing w:after="0" w:line="261" w:lineRule="exact"/>
-              <w:ind w:left="209" w:right="-20"/>
-              <w:rPr>
-                <w:rFonts w:eastAsia="Arial" w:cstheme="minorHAnsi"/>
-                <w:b/>
-              </w:rPr>
-            </w:pPr>
-            <w:r>
-              <w:rPr>
-                <w:rFonts w:eastAsia="Arial" w:cstheme="minorHAnsi"/>
-                <w:b/>
-                <w:bCs/>
-                <w:position w:val="2"/>
-              </w:rPr>
-              <w:t xml:space="preserve">                                         </w:t>
-            </w:r>
-            <w:r>
-              <w:rPr>
-                <w:rFonts w:eastAsia="Arial" w:cstheme="minorHAnsi"/>
-                <w:b/>
-                <w:bCs/>
-                <w:position w:val="2"/>
-              </w:rPr>
-              <w:t xml:space="preserve">                           </w:t>
-            </w:r>
-            <w:sdt>
-              <w:sdtPr>
-                <w:rPr>
-                  <w:rFonts w:eastAsia="Arial" w:cstheme="minorHAnsi"/>
-                  <w:b/>
-                  <w:bCs/>
-                  <w:spacing w:val="13"/>
-                  <w:position w:val="2"/>
-                  <w:sz w:val="24"/>
-                  <w:szCs w:val="24"/>
-                </w:rPr>
-                <w:id w:val="-830977886"/>
-                <w14:checkbox>
-                  <w14:checked w14:val="0"/>
-                  <w14:checkedState w14:val="2612" w14:font="MS Gothic"/>
-                  <w14:uncheckedState w14:val="2610" w14:font="MS Gothic"/>
-                </w14:checkbox>
-              </w:sdtPr>
-              <w:sdtEndPr/>
-              <w:sdtContent>
-                <w:r>
-                  <w:rPr>
-                    <w:rFonts w:ascii="MS Gothic" w:eastAsia="MS Gothic" w:hAnsi="MS Gothic" w:cstheme="minorHAnsi" w:hint="eastAsia"/>
-                    <w:b/>
-                    <w:bCs/>
-                    <w:spacing w:val="13"/>
-                    <w:position w:val="2"/>
-                    <w:sz w:val="24"/>
-                    <w:szCs w:val="24"/>
-                  </w:rPr>
-                  <w:t>☐</w:t>
-                </w:r>
-              </w:sdtContent>
-            </w:sdt>
-            <w:r>
-              <w:rPr>
-                <w:rFonts w:eastAsia="Arial" w:cstheme="minorHAnsi"/>
-                <w:b/>
-                <w:position w:val="4"/>
-              </w:rPr>
-              <w:t>US</w:t>
-            </w:r>
-            <w:r>
-              <w:rPr>
-                <w:rFonts w:eastAsia="Arial" w:cstheme="minorHAnsi"/>
-                <w:b/>
-                <w:spacing w:val="18"/>
-                <w:position w:val="4"/>
-              </w:rPr>
-              <w:t xml:space="preserve"> </w:t>
-            </w:r>
-            <w:r>
-              <w:rPr>
-                <w:rFonts w:eastAsia="Arial" w:cstheme="minorHAnsi"/>
-                <w:b/>
-                <w:position w:val="4"/>
-              </w:rPr>
-              <w:t>Residency</w:t>
-            </w:r>
-            <w:r>
-              <w:rPr>
-                <w:rFonts w:eastAsia="Arial" w:cstheme="minorHAnsi"/>
-                <w:b/>
-                <w:position w:val="4"/>
-              </w:rPr>
-              <w:tab/>
-            </w:r>
-            <w:sdt>
-              <w:sdtPr>
-                <w:rPr>
-                  <w:rFonts w:eastAsia="Arial" w:cstheme="minorHAnsi"/>
-                  <w:b/>
-                  <w:bCs/>
-                  <w:spacing w:val="13"/>
-                  <w:position w:val="2"/>
-                  <w:sz w:val="24"/>
-                  <w:szCs w:val="24"/>
-                </w:rPr>
-                <w:id w:val="-1318641333"/>
-                <w14:checkbox>
-                  <w14:checked w14:val="0"/>
-                  <w14:checkedState w14:val="2612" w14:font="MS Gothic"/>
-                  <w14:uncheckedState w14:val="2610" w14:font="MS Gothic"/>
-                </w14:checkbox>
-              </w:sdtPr>
-              <w:sdtEndPr/>
-              <w:sdtContent>
-                <w:r>
-                  <w:rPr>
-                    <w:rFonts w:ascii="MS Gothic" w:eastAsia="MS Gothic" w:hAnsi="MS Gothic" w:cs="MS Gothic" w:hint="eastAsia"/>
-                    <w:b/>
-                    <w:bCs/>
-                    <w:spacing w:val="13"/>
-                    <w:position w:val="2"/>
-                    <w:sz w:val="24"/>
-                    <w:szCs w:val="24"/>
-                  </w:rPr>
-                  <w:t>☐</w:t>
-                </w:r>
-              </w:sdtContent>
-            </w:sdt>
-            <w:r>
-              <w:rPr>
-                <w:rFonts w:eastAsia="Arial" w:cstheme="minorHAnsi"/>
-                <w:b/>
-                <w:position w:val="4"/>
-              </w:rPr>
-              <w:t>Non US</w:t>
-            </w:r>
-            <w:r>
-              <w:rPr>
-                <w:rFonts w:eastAsia="Arial" w:cstheme="minorHAnsi"/>
-                <w:b/>
-                <w:spacing w:val="18"/>
-                <w:position w:val="4"/>
-              </w:rPr>
-              <w:t xml:space="preserve"> </w:t>
-            </w:r>
-            <w:r>
-              <w:rPr>
-                <w:rFonts w:eastAsia="Arial" w:cstheme="minorHAnsi"/>
-                <w:b/>
-                <w:position w:val="4"/>
-              </w:rPr>
-              <w:t>Residency</w:t>
-            </w:r>
-            <w:r>
-              <w:rPr>
-                <w:rFonts w:eastAsia="Arial" w:cstheme="minorHAnsi"/>
-                <w:b/>
-                <w:position w:val="4"/>
-              </w:rPr>
-              <w:tab/>
-            </w:r>
-            <w:sdt>
-              <w:sdtPr>
-                <w:rPr>
-                  <w:rFonts w:eastAsia="Arial" w:cstheme="minorHAnsi"/>
-                  <w:b/>
-                  <w:bCs/>
-                  <w:spacing w:val="13"/>
-                  <w:position w:val="2"/>
-                  <w:sz w:val="24"/>
-                  <w:szCs w:val="24"/>
-                </w:rPr>
-                <w:id w:val="-1686589593"/>
-                <w14:checkbox>
-                  <w14:checked w14:val="0"/>
-                  <w14:checkedState w14:val="2612" w14:font="MS Gothic"/>
-                  <w14:uncheckedState w14:val="2610" w14:font="MS Gothic"/>
-                </w14:checkbox>
-              </w:sdtPr>
-              <w:sdtEndPr/>
-              <w:sdtContent>
-                <w:r>
-                  <w:rPr>
-                    <w:rFonts w:ascii="MS Gothic" w:eastAsia="MS Gothic" w:hAnsi="MS Gothic" w:cstheme="minorHAnsi" w:hint="eastAsia"/>
-                    <w:b/>
-                    <w:bCs/>
-                    <w:spacing w:val="13"/>
-                    <w:position w:val="2"/>
-                    <w:sz w:val="24"/>
-                    <w:szCs w:val="24"/>
-                  </w:rPr>
-                  <w:t>☐</w:t>
-                </w:r>
-              </w:sdtContent>
-            </w:sdt>
-            <w:r>
-              <w:rPr>
-                <w:rFonts w:eastAsia="Arial" w:cstheme="minorHAnsi"/>
-                <w:b/>
-                <w:position w:val="4"/>
-              </w:rPr>
-              <w:t>Active US Military Service</w:t>
-            </w:r>
-          </w:p>
-        </w:tc>
-      </w:tr>
-      <w:tr>
-        <w:trPr>
-          <w:trHeight w:hRule="exact" w:val="646"/>
-        </w:trPr>
-        <w:tc>
-          <w:tcPr>
-            <w:tcW w:w="619" w:type="dxa"/>
-            <w:vAlign w:val="center"/>
-          </w:tcPr>
-          <w:p>
-            <w:pPr>
-              <w:spacing w:before="36" w:after="0" w:line="240" w:lineRule="auto"/>
-              <w:ind w:left="137" w:right="-20"/>
-              <w:rPr>
-                <w:rFonts w:eastAsia="Arial" w:cstheme="minorHAnsi"/>
-              </w:rPr>
-            </w:pPr>
-            <w:r>
-              <w:rPr>
-                <w:rFonts w:eastAsia="Arial" w:cstheme="minorHAnsi"/>
-                <w:b/>
-                <w:bCs/>
-                <w:w w:val="109"/>
-              </w:rPr>
-              <w:t>City</w:t>
-            </w:r>
-          </w:p>
-        </w:tc>
-        <w:tc>
-          <w:tcPr>
-            <w:tcW w:w="2343" w:type="dxa"/>
-            <w:gridSpan w:val="5"/>
-            <w:vAlign w:val="center"/>
-          </w:tcPr>
-          <w:p>
-            <w:pPr>
-              <w:tabs>
-                <w:tab w:val="left" w:pos="2420"/>
-                <w:tab w:val="left" w:pos="4840"/>
-              </w:tabs>
-              <w:spacing w:before="40" w:after="0" w:line="240" w:lineRule="auto"/>
-              <w:ind w:left="137" w:right="-20"/>
-              <w:rPr>
-                <w:rFonts w:eastAsia="Arial" w:cstheme="minorHAnsi"/>
-              </w:rPr>
-            </w:pPr>
-            <w:r>
-              <w:rPr>
-                <w:rFonts w:eastAsia="Arial" w:cstheme="minorHAnsi"/>
-                <w:bCs/>
-              </w:rPr>
-              <w:t>&lt;&lt;inventorHomeCity&gt;&gt;</w:t>
-            </w:r>
-          </w:p>
-        </w:tc>
-        <w:tc>
-          <w:tcPr>
-            <w:tcW w:w="1708" w:type="dxa"/>
-            <w:gridSpan w:val="2"/>
-            <w:vAlign w:val="center"/>
-          </w:tcPr>
-          <w:p>
-            <w:pPr>
-              <w:tabs>
-                <w:tab w:val="left" w:pos="2420"/>
-                <w:tab w:val="left" w:pos="4840"/>
-              </w:tabs>
-              <w:spacing w:before="40" w:after="0" w:line="240" w:lineRule="auto"/>
-              <w:ind w:left="43" w:right="-14"/>
-              <w:rPr>
-                <w:rFonts w:eastAsia="Arial" w:cstheme="minorHAnsi"/>
-              </w:rPr>
-            </w:pPr>
-            <w:r>
-              <w:rPr>
-                <w:rFonts w:eastAsia="Arial" w:cstheme="minorHAnsi"/>
-                <w:b/>
-                <w:bCs/>
-                <w:w w:val="116"/>
-                <w:position w:val="1"/>
-              </w:rPr>
-              <w:t>State/Province</w:t>
-            </w:r>
-          </w:p>
-        </w:tc>
-        <w:tc>
-          <w:tcPr>
-            <w:tcW w:w="2342" w:type="dxa"/>
-            <w:gridSpan w:val="5"/>
-            <w:vAlign w:val="center"/>
-          </w:tcPr>
-          <w:p>
-            <w:pPr>
-              <w:tabs>
-                <w:tab w:val="left" w:pos="2420"/>
-                <w:tab w:val="left" w:pos="4840"/>
-              </w:tabs>
-              <w:spacing w:before="40" w:after="0" w:line="240" w:lineRule="auto"/>
-              <w:ind w:left="43" w:right="-14"/>
-              <w:rPr>
-                <w:rFonts w:eastAsia="Arial" w:cstheme="minorHAnsi"/>
-              </w:rPr>
-            </w:pPr>
-            <w:r>
-              <w:rPr>
-                <w:rFonts w:eastAsia="Arial" w:cstheme="minorHAnsi"/>
-                <w:bCs/>
-              </w:rPr>
-              <w:t>&lt;&lt;inventorHomeState&gt;&gt;</w:t>
-            </w:r>
-          </w:p>
-        </w:tc>
-        <w:tc>
-          <w:tcPr>
-            <w:tcW w:w="1170" w:type="dxa"/>
-            <w:vAlign w:val="center"/>
-          </w:tcPr>
-          <w:p>
-            <w:pPr>
-              <w:tabs>
-                <w:tab w:val="left" w:pos="2420"/>
-                <w:tab w:val="left" w:pos="4840"/>
-              </w:tabs>
-              <w:spacing w:before="40" w:after="0" w:line="240" w:lineRule="auto"/>
-              <w:ind w:right="-20"/>
-              <w:jc w:val="center"/>
-              <w:rPr>
-                <w:rFonts w:eastAsia="Arial" w:cstheme="minorHAnsi"/>
-              </w:rPr>
-            </w:pPr>
-            <w:r>
-              <w:rPr>
-                <w:rFonts w:eastAsia="Arial" w:cstheme="minorHAnsi"/>
-                <w:b/>
-                <w:bCs/>
-              </w:rPr>
-              <w:t>Country</w:t>
-            </w:r>
-            <w:r>
-              <w:rPr>
-                <w:rFonts w:eastAsia="Arial" w:cstheme="minorHAnsi"/>
-                <w:b/>
-                <w:bCs/>
-                <w:spacing w:val="39"/>
-              </w:rPr>
-              <w:t xml:space="preserve"> </w:t>
-            </w:r>
-            <w:r>
-              <w:rPr>
-                <w:rFonts w:eastAsia="Arial" w:cstheme="minorHAnsi"/>
-                <w:b/>
-                <w:bCs/>
-              </w:rPr>
-              <w:t>of</w:t>
-            </w:r>
-            <w:r>
-              <w:rPr>
-                <w:rFonts w:eastAsia="Arial" w:cstheme="minorHAnsi"/>
-                <w:b/>
-                <w:bCs/>
-                <w:spacing w:val="22"/>
-              </w:rPr>
-              <w:t xml:space="preserve"> </w:t>
-            </w:r>
-            <w:r>
-              <w:rPr>
-                <w:rFonts w:eastAsia="Arial" w:cstheme="minorHAnsi"/>
-                <w:b/>
-                <w:bCs/>
-              </w:rPr>
-              <w:t>Residence</w:t>
-            </w:r>
-          </w:p>
-        </w:tc>
-        <w:tc>
-          <w:tcPr>
-            <w:tcW w:w="2720" w:type="dxa"/>
-            <w:gridSpan w:val="2"/>
-            <w:vAlign w:val="center"/>
-          </w:tcPr>
-          <w:p>
-            <w:pPr>
-              <w:tabs>
-                <w:tab w:val="left" w:pos="2420"/>
-                <w:tab w:val="left" w:pos="4840"/>
-              </w:tabs>
-              <w:spacing w:before="40" w:after="0" w:line="240" w:lineRule="auto"/>
-              <w:ind w:right="-20"/>
-              <w:rPr>
-                <w:rFonts w:eastAsia="Arial" w:cstheme="minorHAnsi"/>
-              </w:rPr>
-            </w:pPr>
-            <w:r>
-              <w:rPr>
-                <w:rFonts w:eastAsia="Arial" w:cstheme="minorHAnsi"/>
-              </w:rPr>
-              <w:t>&lt;&lt;inventorHomeCountry&gt;&gt;</w:t>
-            </w:r>
-          </w:p>
-        </w:tc>
-      </w:tr>
-      <w:tr>
-        <w:trPr>
-          <w:trHeight w:hRule="exact" w:val="403"/>
-        </w:trPr>
-        <w:tc>
-          <w:tcPr>
-            <w:tcW w:w="10902" w:type="dxa"/>
-            <w:gridSpan w:val="16"/>
-            <w:vAlign w:val="center"/>
-          </w:tcPr>
-          <w:p>
-            <w:pPr>
-              <w:spacing w:after="0" w:line="240" w:lineRule="auto"/>
-              <w:ind w:left="144" w:right="-144"/>
-              <w:rPr>
-                <w:rFonts w:eastAsia="Arial" w:cstheme="minorHAnsi"/>
-              </w:rPr>
-            </w:pPr>
-            <w:r>
-              <w:rPr>
-                <w:rFonts w:eastAsia="Arial" w:cstheme="minorHAnsi"/>
-                <w:b/>
-                <w:bCs/>
-              </w:rPr>
-              <w:t>Mailing</w:t>
-            </w:r>
-            <w:r>
-              <w:rPr>
-                <w:rFonts w:eastAsia="Arial" w:cstheme="minorHAnsi"/>
-                <w:b/>
-                <w:bCs/>
-                <w:spacing w:val="18"/>
-              </w:rPr>
-              <w:t xml:space="preserve"> </w:t>
-            </w:r>
-            <w:r>
-              <w:rPr>
-                <w:rFonts w:eastAsia="Arial" w:cstheme="minorHAnsi"/>
-                <w:b/>
-                <w:bCs/>
-              </w:rPr>
-              <w:t>Address</w:t>
-            </w:r>
-            <w:r>
-              <w:rPr>
-                <w:rFonts w:eastAsia="Arial" w:cstheme="minorHAnsi"/>
-                <w:b/>
-                <w:bCs/>
-                <w:spacing w:val="34"/>
-              </w:rPr>
-              <w:t xml:space="preserve"> </w:t>
-            </w:r>
-            <w:r>
-              <w:rPr>
-                <w:rFonts w:eastAsia="Arial" w:cstheme="minorHAnsi"/>
-                <w:b/>
-                <w:bCs/>
-              </w:rPr>
-              <w:t>of</w:t>
-            </w:r>
-            <w:r>
-              <w:rPr>
-                <w:rFonts w:eastAsia="Arial" w:cstheme="minorHAnsi"/>
-                <w:b/>
-                <w:bCs/>
-                <w:spacing w:val="21"/>
-              </w:rPr>
-              <w:t xml:space="preserve"> </w:t>
-            </w:r>
-            <w:r>
-              <w:rPr>
-                <w:rFonts w:eastAsia="Arial" w:cstheme="minorHAnsi"/>
-                <w:b/>
-                <w:bCs/>
-                <w:w w:val="105"/>
-              </w:rPr>
-              <w:t xml:space="preserve">Inventor: </w:t>
-            </w:r>
-          </w:p>
-        </w:tc>
-      </w:tr>
-      <w:tr>
-        <w:trPr>
-          <w:trHeight w:hRule="exact" w:val="346"/>
-        </w:trPr>
-        <w:tc>
-          <w:tcPr>
-            <w:tcW w:w="2245" w:type="dxa"/>
-            <w:gridSpan w:val="5"/>
-            <w:vAlign w:val="center"/>
-          </w:tcPr>
-          <w:p>
-            <w:pPr>
-              <w:spacing w:after="0" w:line="240" w:lineRule="auto"/>
-              <w:ind w:left="144" w:right="-144"/>
-              <w:rPr>
-                <w:rFonts w:eastAsia="Arial" w:cstheme="minorHAnsi"/>
-              </w:rPr>
-            </w:pPr>
-            <w:r>
-              <w:rPr>
-                <w:rFonts w:eastAsia="Arial" w:cstheme="minorHAnsi"/>
-                <w:b/>
-                <w:bCs/>
-              </w:rPr>
-              <w:t>Address</w:t>
-            </w:r>
-            <w:r>
-              <w:rPr>
-                <w:rFonts w:eastAsia="Arial" w:cstheme="minorHAnsi"/>
-                <w:b/>
-                <w:bCs/>
-                <w:spacing w:val="33"/>
-              </w:rPr>
-              <w:t xml:space="preserve"> </w:t>
-            </w:r>
-            <w:r>
-              <w:rPr>
-                <w:rFonts w:eastAsia="Arial" w:cstheme="minorHAnsi"/>
-                <w:b/>
-                <w:bCs/>
-                <w:w w:val="121"/>
-              </w:rPr>
-              <w:t>1</w:t>
-            </w:r>
-          </w:p>
-        </w:tc>
-        <w:tc>
-          <w:tcPr>
-            <w:tcW w:w="8657" w:type="dxa"/>
-            <w:gridSpan w:val="11"/>
-            <w:vAlign w:val="center"/>
-          </w:tcPr>
-          <w:p>
-            <w:pPr>
-              <w:spacing w:after="0" w:line="240" w:lineRule="auto"/>
-              <w:ind w:left="43"/>
-              <w:rPr>
-                <w:rFonts w:cstheme="minorHAnsi"/>
-              </w:rPr>
-            </w:pPr>
-            <w:r>
-              <w:rPr>
-                <w:rFonts w:cs="Arial"/>
-              </w:rPr>
-              <w:t>&lt;</w:t>
-            </w:r>
-            <w:r>
-              <w:rPr>
-                <w:rFonts w:cs="Arial"/>
-              </w:rPr>
-              <w:t>&lt;inventorMailingStreet</w:t>
-            </w:r>
-            <w:r>
-              <w:rPr>
-                <w:rFonts w:cs="Arial"/>
-              </w:rPr>
-              <w:t>1</w:t>
-            </w:r>
-            <w:r>
-              <w:rPr>
-                <w:rFonts w:cs="Arial"/>
-              </w:rPr>
-              <w:t>&gt;&gt;</w:t>
-            </w:r>
-          </w:p>
-        </w:tc>
-      </w:tr>
-      <w:tr>
-        <w:trPr>
-          <w:trHeight w:hRule="exact" w:val="360"/>
-        </w:trPr>
-        <w:tc>
-          <w:tcPr>
-            <w:tcW w:w="2245" w:type="dxa"/>
-            <w:gridSpan w:val="5"/>
-            <w:vAlign w:val="center"/>
-          </w:tcPr>
-          <w:p>
-            <w:pPr>
-              <w:spacing w:after="0" w:line="240" w:lineRule="auto"/>
-              <w:ind w:left="144" w:right="-144"/>
-              <w:rPr>
-                <w:rFonts w:eastAsia="Arial" w:cstheme="minorHAnsi"/>
-              </w:rPr>
-            </w:pPr>
-            <w:r>
-              <w:rPr>
-                <w:rFonts w:eastAsia="Arial" w:cstheme="minorHAnsi"/>
-                <w:b/>
-                <w:bCs/>
-              </w:rPr>
-              <w:t>Address</w:t>
-            </w:r>
-            <w:r>
-              <w:rPr>
-                <w:rFonts w:eastAsia="Arial" w:cstheme="minorHAnsi"/>
-                <w:b/>
-                <w:bCs/>
-                <w:spacing w:val="43"/>
-              </w:rPr>
-              <w:t xml:space="preserve"> </w:t>
-            </w:r>
-            <w:r>
-              <w:rPr>
-                <w:rFonts w:eastAsia="Arial" w:cstheme="minorHAnsi"/>
-                <w:b/>
-                <w:bCs/>
-                <w:w w:val="110"/>
-              </w:rPr>
-              <w:t>2</w:t>
-            </w:r>
-          </w:p>
-        </w:tc>
-        <w:tc>
-          <w:tcPr>
-            <w:tcW w:w="8657" w:type="dxa"/>
-            <w:gridSpan w:val="11"/>
-            <w:vAlign w:val="center"/>
-          </w:tcPr>
-          <w:p>
-            <w:pPr>
-              <w:spacing w:after="0" w:line="240" w:lineRule="auto"/>
-              <w:ind w:right="-144"/>
-              <w:rPr>
-                <w:rFonts w:cstheme="minorHAnsi"/>
-              </w:rPr>
-            </w:pPr>
-            <w:r>
-              <w:rPr>
-                <w:rFonts w:cs="Arial"/>
-              </w:rPr>
-              <w:t xml:space="preserve"> </w:t>
-            </w:r>
-            <w:r>
-              <w:rPr>
-                <w:rFonts w:cs="Arial"/>
-              </w:rPr>
-              <w:t>&lt;&lt;inventorMailingStreet</w:t>
-            </w:r>
-            <w:r>
-              <w:rPr>
-                <w:rFonts w:cs="Arial"/>
-              </w:rPr>
-              <w:t>2</w:t>
-            </w:r>
-            <w:r>
-              <w:rPr>
-                <w:rFonts w:cs="Arial"/>
-              </w:rPr>
-              <w:t>&gt;&gt;</w:t>
-            </w:r>
-          </w:p>
-        </w:tc>
-      </w:tr>
-      <w:tr>
-        <w:trPr>
-          <w:trHeight w:hRule="exact" w:val="360"/>
-        </w:trPr>
-        <w:tc>
-          <w:tcPr>
-            <w:tcW w:w="1063" w:type="dxa"/>
-            <w:gridSpan w:val="2"/>
-            <w:tcBorders>
-              <w:bottom w:val="single" w:sz="2" w:space="0" w:color="000000"/>
-            </w:tcBorders>
-            <w:vAlign w:val="center"/>
-          </w:tcPr>
-          <w:p>
-            <w:pPr>
-              <w:tabs>
-                <w:tab w:val="left" w:pos="1060"/>
-                <w:tab w:val="left" w:pos="5560"/>
-                <w:tab w:val="left" w:pos="7540"/>
-              </w:tabs>
-              <w:spacing w:after="0" w:line="240" w:lineRule="auto"/>
-              <w:ind w:left="144" w:right="-144"/>
-              <w:rPr>
-                <w:rFonts w:eastAsia="Arial" w:cstheme="minorHAnsi"/>
-              </w:rPr>
-            </w:pPr>
-            <w:r>
-              <w:rPr>
-                <w:rFonts w:eastAsia="Arial" w:cstheme="minorHAnsi"/>
-                <w:b/>
-                <w:bCs/>
-                <w:position w:val="6"/>
-              </w:rPr>
-              <w:t>City</w:t>
-            </w:r>
-            <w:r>
-              <w:rPr>
-                <w:rFonts w:eastAsia="Arial" w:cstheme="minorHAnsi"/>
-                <w:b/>
-                <w:bCs/>
-                <w:spacing w:val="-21"/>
-                <w:position w:val="6"/>
-              </w:rPr>
-              <w:t xml:space="preserve"> </w:t>
-            </w:r>
-          </w:p>
-        </w:tc>
-        <w:tc>
-          <w:tcPr>
-            <w:tcW w:w="4048" w:type="dxa"/>
-            <w:gridSpan w:val="7"/>
-            <w:tcBorders>
-              <w:bottom w:val="single" w:sz="2" w:space="0" w:color="000000"/>
-            </w:tcBorders>
-            <w:vAlign w:val="center"/>
-          </w:tcPr>
-          <w:p>
-            <w:pPr>
-              <w:tabs>
-                <w:tab w:val="left" w:pos="1060"/>
-                <w:tab w:val="left" w:pos="5560"/>
-                <w:tab w:val="left" w:pos="7540"/>
-              </w:tabs>
-              <w:spacing w:after="0" w:line="240" w:lineRule="auto"/>
-              <w:ind w:left="43" w:right="-144"/>
-              <w:rPr>
-                <w:rFonts w:eastAsia="Arial" w:cstheme="minorHAnsi"/>
-              </w:rPr>
-            </w:pPr>
-            <w:r>
-              <w:rPr>
-                <w:rFonts w:cs="Arial"/>
-                <w:bCs/>
-              </w:rPr>
-              <w:t>&lt;&lt;inventorMailingCity&gt;&gt;</w:t>
-            </w:r>
-          </w:p>
-        </w:tc>
-        <w:tc>
-          <w:tcPr>
-            <w:tcW w:w="1809" w:type="dxa"/>
-            <w:gridSpan w:val="3"/>
-            <w:tcBorders>
-              <w:bottom w:val="single" w:sz="2" w:space="0" w:color="000000"/>
-            </w:tcBorders>
-            <w:vAlign w:val="center"/>
-          </w:tcPr>
-          <w:p>
-            <w:pPr>
-              <w:tabs>
-                <w:tab w:val="left" w:pos="1060"/>
-                <w:tab w:val="left" w:pos="5560"/>
-                <w:tab w:val="left" w:pos="7540"/>
-              </w:tabs>
-              <w:spacing w:after="0" w:line="240" w:lineRule="auto"/>
-              <w:ind w:left="144" w:right="-144"/>
-              <w:rPr>
-                <w:rFonts w:eastAsia="Arial" w:cstheme="minorHAnsi"/>
-              </w:rPr>
-            </w:pPr>
-            <w:r>
-              <w:rPr>
-                <w:rFonts w:eastAsia="Arial" w:cstheme="minorHAnsi"/>
-                <w:b/>
-                <w:bCs/>
-                <w:w w:val="105"/>
-                <w:position w:val="6"/>
-              </w:rPr>
-              <w:t>State/Provinc</w:t>
-            </w:r>
-            <w:r>
-              <w:rPr>
-                <w:rFonts w:eastAsia="Arial" w:cstheme="minorHAnsi"/>
-                <w:b/>
-                <w:bCs/>
-                <w:w w:val="105"/>
-                <w:position w:val="6"/>
-              </w:rPr>
-              <w:t>e</w:t>
-            </w:r>
-          </w:p>
-        </w:tc>
-        <w:tc>
-          <w:tcPr>
-            <w:tcW w:w="3982" w:type="dxa"/>
-            <w:gridSpan w:val="4"/>
-            <w:tcBorders>
-              <w:bottom w:val="single" w:sz="2" w:space="0" w:color="000000"/>
-            </w:tcBorders>
-            <w:vAlign w:val="center"/>
-          </w:tcPr>
-          <w:p>
-            <w:pPr>
-              <w:tabs>
-                <w:tab w:val="left" w:pos="1060"/>
-                <w:tab w:val="left" w:pos="5560"/>
-                <w:tab w:val="left" w:pos="7540"/>
-              </w:tabs>
-              <w:spacing w:after="0" w:line="240" w:lineRule="auto"/>
-              <w:ind w:left="43" w:right="-144"/>
-              <w:rPr>
-                <w:rFonts w:eastAsia="Arial" w:cstheme="minorHAnsi"/>
-              </w:rPr>
-            </w:pPr>
-            <w:r>
-              <w:rPr>
-                <w:rFonts w:eastAsia="Arial" w:cstheme="minorHAnsi"/>
-                <w:bCs/>
-              </w:rPr>
-              <w:t>&lt;&lt;inventorMailingState&gt;&gt;</w:t>
-            </w:r>
-          </w:p>
-        </w:tc>
-      </w:tr>
-      <w:tr>
-        <w:trPr>
-          <w:trHeight w:hRule="exact" w:val="360"/>
-        </w:trPr>
-        <w:tc>
-          <w:tcPr>
-            <w:tcW w:w="2231" w:type="dxa"/>
-            <w:gridSpan w:val="4"/>
-            <w:tcBorders>
-              <w:bottom w:val="single" w:sz="2" w:space="0" w:color="000000"/>
-            </w:tcBorders>
-            <w:vAlign w:val="center"/>
-          </w:tcPr>
-          <w:p>
-            <w:pPr>
-              <w:tabs>
-                <w:tab w:val="left" w:pos="1060"/>
-                <w:tab w:val="left" w:pos="5560"/>
-                <w:tab w:val="left" w:pos="7540"/>
-              </w:tabs>
-              <w:spacing w:after="0" w:line="240" w:lineRule="auto"/>
-              <w:ind w:left="144"/>
-              <w:rPr>
-                <w:rFonts w:eastAsia="Arial" w:cstheme="minorHAnsi"/>
-              </w:rPr>
-            </w:pPr>
-            <w:r>
-              <w:rPr>
-                <w:rFonts w:eastAsia="Arial" w:cstheme="minorHAnsi"/>
-                <w:b/>
-                <w:bCs/>
-              </w:rPr>
-              <w:t>Postal</w:t>
-            </w:r>
-            <w:r>
-              <w:rPr>
-                <w:rFonts w:eastAsia="Arial" w:cstheme="minorHAnsi"/>
-                <w:b/>
-                <w:bCs/>
-                <w:spacing w:val="23"/>
-              </w:rPr>
-              <w:t xml:space="preserve"> </w:t>
-            </w:r>
-            <w:r>
-              <w:rPr>
-                <w:rFonts w:eastAsia="Arial" w:cstheme="minorHAnsi"/>
-                <w:b/>
-                <w:bCs/>
-                <w:w w:val="106"/>
-              </w:rPr>
-              <w:t>Code</w:t>
-            </w:r>
-          </w:p>
-        </w:tc>
-        <w:tc>
-          <w:tcPr>
-            <w:tcW w:w="2880" w:type="dxa"/>
-            <w:gridSpan w:val="5"/>
-            <w:tcBorders>
-              <w:bottom w:val="single" w:sz="2" w:space="0" w:color="000000"/>
-            </w:tcBorders>
-            <w:vAlign w:val="center"/>
-          </w:tcPr>
-          <w:p>
-            <w:pPr>
-              <w:tabs>
-                <w:tab w:val="left" w:pos="1060"/>
-                <w:tab w:val="left" w:pos="5560"/>
-                <w:tab w:val="left" w:pos="7540"/>
-              </w:tabs>
-              <w:spacing w:after="0" w:line="240" w:lineRule="auto"/>
-              <w:ind w:left="43"/>
-              <w:rPr>
-                <w:rFonts w:eastAsia="Arial" w:cstheme="minorHAnsi"/>
-              </w:rPr>
-            </w:pPr>
-            <w:r>
-              <w:rPr>
-                <w:rFonts w:eastAsia="Arial" w:cstheme="minorHAnsi"/>
-                <w:bCs/>
-              </w:rPr>
-              <w:t>&lt;&lt;inventorMailingZip&gt;&gt;</w:t>
-            </w:r>
-          </w:p>
-        </w:tc>
-        <w:tc>
-          <w:tcPr>
-            <w:tcW w:w="1170" w:type="dxa"/>
-            <w:tcBorders>
-              <w:bottom w:val="single" w:sz="2" w:space="0" w:color="000000"/>
-            </w:tcBorders>
-            <w:vAlign w:val="center"/>
-          </w:tcPr>
-          <w:p>
-            <w:pPr>
-              <w:tabs>
-                <w:tab w:val="left" w:pos="1060"/>
-                <w:tab w:val="left" w:pos="5560"/>
-                <w:tab w:val="left" w:pos="7540"/>
-              </w:tabs>
-              <w:spacing w:after="0" w:line="240" w:lineRule="auto"/>
-              <w:ind w:left="144"/>
-              <w:rPr>
-                <w:rFonts w:eastAsia="Arial" w:cstheme="minorHAnsi"/>
-                <w:b/>
-              </w:rPr>
-            </w:pPr>
-            <w:r>
-              <w:rPr>
-                <w:rFonts w:eastAsia="Arial" w:cstheme="minorHAnsi"/>
-                <w:b/>
-              </w:rPr>
-              <w:t>Country</w:t>
-            </w:r>
-          </w:p>
-        </w:tc>
-        <w:tc>
-          <w:tcPr>
-            <w:tcW w:w="4621" w:type="dxa"/>
-            <w:gridSpan w:val="6"/>
-            <w:tcBorders>
-              <w:bottom w:val="single" w:sz="2" w:space="0" w:color="000000"/>
-            </w:tcBorders>
-            <w:vAlign w:val="center"/>
-          </w:tcPr>
-          <w:p>
-            <w:pPr>
-              <w:tabs>
-                <w:tab w:val="left" w:pos="1060"/>
-                <w:tab w:val="left" w:pos="5560"/>
-                <w:tab w:val="left" w:pos="7540"/>
-              </w:tabs>
-              <w:spacing w:after="0" w:line="240" w:lineRule="auto"/>
-              <w:ind w:left="43"/>
-              <w:rPr>
-                <w:rFonts w:eastAsia="Arial" w:cstheme="minorHAnsi"/>
-              </w:rPr>
-            </w:pPr>
-            <w:r>
-              <w:rPr>
-                <w:rFonts w:eastAsia="Arial" w:cstheme="minorHAnsi"/>
-                <w:bCs/>
-              </w:rPr>
-              <w:t>&lt;&lt;inventorMailingCountry&gt;&gt;</w:t>
-            </w:r>
-          </w:p>
-        </w:tc>
-      </w:tr>
-    </w:tbl>
-    <w:p>
-      <w:pPr>
         <w:spacing w:after="0" w:line="120" w:lineRule="auto"/>
-        <w:ind w:left="130" w:right="-14"/>
+        <w:ind w:right="-14"/>
         <w:rPr>
           <w:rFonts w:eastAsia="Arial" w:cstheme="minorHAnsi"/>
           <w:bCs/>
@@ -2275,7 +463,6 @@
                   <w14:uncheckedState w14:val="2610" w14:font="MS Gothic"/>
                 </w14:checkbox>
               </w:sdtPr>
-              <w:sdtEndPr/>
               <w:sdtContent>
                 <w:r>
                   <w:rPr>
@@ -3007,7 +1194,6 @@
                   <w14:uncheckedState w14:val="2610" w14:font="MS Gothic"/>
                 </w14:checkbox>
               </w:sdtPr>
-              <w:sdtEndPr/>
               <w:sdtContent>
                 <w:r>
                   <w:rPr>
@@ -3386,7 +1572,6 @@
                 <w:b/>
                 <w:bCs/>
               </w:rPr>
-              <w:lastRenderedPageBreak/>
               <w:t>Only complete this section when filing an application by reference under 35 U.S.C. 111(c) and 37 CFR 1.57(a).</w:t>
             </w:r>
             <w:r>
@@ -3793,7 +1978,6 @@
                   <w14:uncheckedState w14:val="2610" w14:font="MS Gothic"/>
                 </w14:checkbox>
               </w:sdtPr>
-              <w:sdtEndPr/>
               <w:sdtContent>
                 <w:r>
                   <w:rPr>
@@ -4067,7 +2251,6 @@
                   <w14:uncheckedState w14:val="2610" w14:font="MS Gothic"/>
                 </w14:checkbox>
               </w:sdtPr>
-              <w:sdtEndPr/>
               <w:sdtContent>
                 <w:r>
                   <w:rPr>
@@ -4885,6 +3068,7 @@
               </w:rPr>
               <w:t xml:space="preserve"> </w:t>
             </w:r>
+            <w:proofErr w:type="gramStart"/>
             <w:r>
               <w:rPr>
                 <w:rFonts w:eastAsia="Arial" w:cstheme="minorHAnsi"/>
@@ -4924,7 +3108,18 @@
                 <w:sz w:val="20"/>
                 <w:szCs w:val="20"/>
               </w:rPr>
-              <w:t xml:space="preserve">either </w:t>
+              <w:t>either</w:t>
+            </w:r>
+            <w:proofErr w:type="gramEnd"/>
+            <w:r>
+              <w:rPr>
+                <w:rFonts w:eastAsia="Arial" w:cstheme="minorHAnsi"/>
+                <w:b/>
+                <w:color w:val="010101"/>
+                <w:sz w:val="20"/>
+                <w:szCs w:val="20"/>
+              </w:rPr>
+              <w:t xml:space="preserve"> </w:t>
             </w:r>
             <w:r>
               <w:rPr>
@@ -5539,7 +3734,6 @@
                   <w14:uncheckedState w14:val="2610" w14:font="MS Gothic"/>
                 </w14:checkbox>
               </w:sdtPr>
-              <w:sdtEndPr/>
               <w:sdtContent>
                 <w:r>
                   <w:rPr>
@@ -5621,7 +3815,6 @@
                   <w14:uncheckedState w14:val="2610" w14:font="MS Gothic"/>
                 </w14:checkbox>
               </w:sdtPr>
-              <w:sdtEndPr/>
               <w:sdtContent>
                 <w:r>
                   <w:rPr>
@@ -5693,7 +3886,6 @@
                   <w14:uncheckedState w14:val="2610" w14:font="MS Gothic"/>
                 </w14:checkbox>
               </w:sdtPr>
-              <w:sdtEndPr/>
               <w:sdtContent>
                 <w:r>
                   <w:rPr>
@@ -7679,7 +5871,29 @@
                 <w:sz w:val="20"/>
                 <w:szCs w:val="20"/>
               </w:rPr>
-              <w:t>X program, applicant bears the ultimate responsibility for ensuring that a copy of the foreign application is received by the Office from the participating foreign intellectual property office, or a certified copy of the foreign priority application is filed, within the time period specified in 37 CFR 1.55(g)(1).</w:t>
+              <w:t xml:space="preserve">X program, applicant bears the ultimate responsibility for ensuring that a copy of the foreign application is received by the Office from the participating foreign intellectual property office, or a certified copy of the foreign priority application is filed, within the </w:t>
+            </w:r>
+            <w:proofErr w:type="gramStart"/>
+            <w:r>
+              <w:rPr>
+                <w:rFonts w:eastAsia="Arial" w:cstheme="minorHAnsi"/>
+                <w:b/>
+                <w:color w:val="010101"/>
+                <w:sz w:val="20"/>
+                <w:szCs w:val="20"/>
+              </w:rPr>
+              <w:t>time period</w:t>
+            </w:r>
+            <w:proofErr w:type="gramEnd"/>
+            <w:r>
+              <w:rPr>
+                <w:rFonts w:eastAsia="Arial" w:cstheme="minorHAnsi"/>
+                <w:b/>
+                <w:color w:val="010101"/>
+                <w:sz w:val="20"/>
+                <w:szCs w:val="20"/>
+              </w:rPr>
+              <w:t xml:space="preserve"> specified in 37 CFR 1.55(g)(1).</w:t>
             </w:r>
           </w:p>
         </w:tc>
@@ -8164,7 +6378,6 @@
                   <w14:uncheckedState w14:val="2610" w14:font="MS Gothic"/>
                 </w14:checkbox>
               </w:sdtPr>
-              <w:sdtEndPr/>
               <w:sdtContent>
                 <w:r>
                   <w:rPr>
@@ -8211,7 +6424,27 @@
                 <w:sz w:val="24"/>
                 <w:szCs w:val="24"/>
               </w:rPr>
-              <w:t xml:space="preserve"> 16, 2013 and (2) also contains, or contained at any time, a claim to a claimed invention that has an effe</w:t>
+              <w:t xml:space="preserve"> 16, </w:t>
+            </w:r>
+            <w:proofErr w:type="gramStart"/>
+            <w:r>
+              <w:rPr>
+                <w:rFonts w:cstheme="minorHAnsi"/>
+                <w:bCs/>
+                <w:sz w:val="24"/>
+                <w:szCs w:val="24"/>
+              </w:rPr>
+              <w:t>2013</w:t>
+            </w:r>
+            <w:proofErr w:type="gramEnd"/>
+            <w:r>
+              <w:rPr>
+                <w:rFonts w:cstheme="minorHAnsi"/>
+                <w:bCs/>
+                <w:sz w:val="24"/>
+                <w:szCs w:val="24"/>
+              </w:rPr>
+              <w:t xml:space="preserve"> and (2) also contains, or contained at any time, a claim to a claimed invention that has an effe</w:t>
             </w:r>
             <w:r>
               <w:rPr>
@@ -8252,6 +6485,7 @@
                 <w:sz w:val="24"/>
                 <w:szCs w:val="24"/>
               </w:rPr>
+              <w:lastRenderedPageBreak/>
               <w:t xml:space="preserve">NOTE: </w:t>
             </w:r>
             <w:r>
@@ -8284,6 +6518,7 @@
           <w:sz w:val="28"/>
           <w:szCs w:val="28"/>
         </w:rPr>
+        <w:lastRenderedPageBreak/>
         <w:br w:type="page"/>
       </w:r>
     </w:p>
@@ -8305,6 +6540,7 @@
           <w:sz w:val="28"/>
           <w:szCs w:val="28"/>
         </w:rPr>
+        <w:lastRenderedPageBreak/>
         <w:t>Authorization or Opt-Out of Authorization to Permit Access:</w:t>
       </w:r>
     </w:p>
@@ -8690,8 +6926,19 @@
                 <w:sz w:val="20"/>
                 <w:szCs w:val="20"/>
               </w:rPr>
-              <w:t>participating with the USPTO in a bilateral or multilateral priority document exchange agreement in which a foreign</w:t>
-            </w:r>
+              <w:t xml:space="preserve">participating with the USPTO in a bilateral or multilateral priority document exchange agreement in which </w:t>
+            </w:r>
+            <w:proofErr w:type="gramStart"/>
+            <w:r>
+              <w:rPr>
+                <w:rFonts w:cstheme="minorHAnsi"/>
+                <w:b/>
+                <w:sz w:val="20"/>
+                <w:szCs w:val="20"/>
+              </w:rPr>
+              <w:t>a foreign</w:t>
+            </w:r>
+            <w:proofErr w:type="gramEnd"/>
           </w:p>
           <w:p>
             <w:pPr>
@@ -8713,8 +6960,19 @@
                 <w:sz w:val="20"/>
                 <w:szCs w:val="20"/>
               </w:rPr>
-              <w:t>application claiming priority to the instant patent application is filed, access to: (1) the instant patent application-as-filed</w:t>
-            </w:r>
+              <w:t>application claiming priority to the instant patent application is filed, access to: (1) the instant patent application-as-</w:t>
+            </w:r>
+            <w:proofErr w:type="gramStart"/>
+            <w:r>
+              <w:rPr>
+                <w:rFonts w:cstheme="minorHAnsi"/>
+                <w:b/>
+                <w:sz w:val="20"/>
+                <w:szCs w:val="20"/>
+              </w:rPr>
+              <w:t>filed</w:t>
+            </w:r>
+            <w:proofErr w:type="gramEnd"/>
           </w:p>
           <w:p>
             <w:pPr>
@@ -8880,8 +7138,19 @@
                 <w:sz w:val="20"/>
                 <w:szCs w:val="20"/>
               </w:rPr>
-              <w:t xml:space="preserve"> to provide the EPO access to the bibliographic data and search</w:t>
-            </w:r>
+              <w:t xml:space="preserve"> to provide the EPO access to the bibliographic data and </w:t>
+            </w:r>
+            <w:proofErr w:type="gramStart"/>
+            <w:r>
+              <w:rPr>
+                <w:rFonts w:cstheme="minorHAnsi"/>
+                <w:b/>
+                <w:sz w:val="20"/>
+                <w:szCs w:val="20"/>
+              </w:rPr>
+              <w:t>search</w:t>
+            </w:r>
+            <w:proofErr w:type="gramEnd"/>
           </w:p>
           <w:p>
             <w:pPr>
@@ -8903,8 +7172,19 @@
                 <w:sz w:val="20"/>
                 <w:szCs w:val="20"/>
               </w:rPr>
-              <w:t>results from the instant patent application when a European patent application claiming priority to the instant patent</w:t>
-            </w:r>
+              <w:t xml:space="preserve">results from the instant patent application when a European patent application claiming priority to the instant </w:t>
+            </w:r>
+            <w:proofErr w:type="gramStart"/>
+            <w:r>
+              <w:rPr>
+                <w:rFonts w:cstheme="minorHAnsi"/>
+                <w:b/>
+                <w:sz w:val="20"/>
+                <w:szCs w:val="20"/>
+              </w:rPr>
+              <w:t>patent</w:t>
+            </w:r>
+            <w:proofErr w:type="gramEnd"/>
           </w:p>
           <w:p>
             <w:pPr>
@@ -9110,8 +7390,19 @@
                 <w:sz w:val="20"/>
                 <w:szCs w:val="20"/>
               </w:rPr>
-              <w:t xml:space="preserve"> authorize the USPTO to permit a participating foreign IP office access to the instant</w:t>
-            </w:r>
+              <w:t xml:space="preserve"> authorize the USPTO to permit a participating foreign IP office access to the </w:t>
+            </w:r>
+            <w:proofErr w:type="gramStart"/>
+            <w:r>
+              <w:rPr>
+                <w:rFonts w:cstheme="minorHAnsi"/>
+                <w:b/>
+                <w:sz w:val="20"/>
+                <w:szCs w:val="20"/>
+              </w:rPr>
+              <w:t>instant</w:t>
+            </w:r>
+            <w:proofErr w:type="gramEnd"/>
           </w:p>
           <w:p>
             <w:pPr>
@@ -9141,7 +7432,6 @@
                   <w14:uncheckedState w14:val="2610" w14:font="MS Gothic"/>
                 </w14:checkbox>
               </w:sdtPr>
-              <w:sdtEndPr/>
               <w:sdtContent>
                 <w:r>
                   <w:rPr>
@@ -9255,7 +7545,6 @@
                   <w14:uncheckedState w14:val="2610" w14:font="MS Gothic"/>
                 </w14:checkbox>
               </w:sdtPr>
-              <w:sdtEndPr/>
               <w:sdtContent>
                 <w:r>
                   <w:rPr>
@@ -9302,8 +7591,19 @@
                 <w:sz w:val="20"/>
                 <w:szCs w:val="20"/>
               </w:rPr>
-              <w:t xml:space="preserve"> authorize the USPTO to transmit to the EPO any search results from the instant patent</w:t>
-            </w:r>
+              <w:t xml:space="preserve"> authorize the USPTO to transmit to the EPO any search results from the instant </w:t>
+            </w:r>
+            <w:proofErr w:type="gramStart"/>
+            <w:r>
+              <w:rPr>
+                <w:rFonts w:cstheme="minorHAnsi"/>
+                <w:b/>
+                <w:sz w:val="20"/>
+                <w:szCs w:val="20"/>
+              </w:rPr>
+              <w:t>patent</w:t>
+            </w:r>
+            <w:proofErr w:type="gramEnd"/>
           </w:p>
           <w:p>
             <w:pPr>
@@ -9334,8 +7634,19 @@
                 <w:sz w:val="20"/>
                 <w:szCs w:val="20"/>
               </w:rPr>
-              <w:t>application. If this box is checked, the USPTO will not be providing the EPO with search results from the instant</w:t>
-            </w:r>
+              <w:t xml:space="preserve">application. If this box is checked, the USPTO will not be providing the EPO with search results from the </w:t>
+            </w:r>
+            <w:proofErr w:type="gramStart"/>
+            <w:r>
+              <w:rPr>
+                <w:rFonts w:cstheme="minorHAnsi"/>
+                <w:b/>
+                <w:sz w:val="20"/>
+                <w:szCs w:val="20"/>
+              </w:rPr>
+              <w:t>instant</w:t>
+            </w:r>
+            <w:proofErr w:type="gramEnd"/>
           </w:p>
           <w:p>
             <w:pPr>
@@ -9459,6 +7770,7 @@
           <w:sz w:val="28"/>
           <w:szCs w:val="28"/>
         </w:rPr>
+        <w:lastRenderedPageBreak/>
         <w:t>Applicant Information:</w:t>
       </w:r>
     </w:p>
@@ -9524,10 +7836,23 @@
                 <w:sz w:val="24"/>
                 <w:szCs w:val="24"/>
               </w:rPr>
-              <w:t xml:space="preserve">&lt;&lt;applCnt&gt;&gt;  </w:t>
-            </w:r>
-            <w:r>
-              <w:t>&lt;&lt;applicant&gt;&gt;</w:t>
+              <w:t>&lt;&lt;applCnt&gt;</w:t>
+            </w:r>
+            <w:proofErr w:type="gramStart"/>
+            <w:r>
+              <w:rPr>
+                <w:b/>
+                <w:sz w:val="24"/>
+                <w:szCs w:val="24"/>
+              </w:rPr>
+              <w:t xml:space="preserve">&gt;  </w:t>
+            </w:r>
+            <w:r>
+              <w:t>&lt;</w:t>
+            </w:r>
+            <w:proofErr w:type="gramEnd"/>
+            <w:r>
+              <w:t>&lt;applicant&gt;&gt;</w:t>
             </w:r>
           </w:p>
         </w:tc>
@@ -9597,7 +7922,6 @@
                   <w14:uncheckedState w14:val="2610" w14:font="MS Gothic"/>
                 </w14:checkbox>
               </w:sdtPr>
-              <w:sdtEndPr/>
               <w:sdtContent>
                 <w:r>
                   <w:rPr>
@@ -9641,7 +7965,6 @@
                   <w14:uncheckedState w14:val="2610" w14:font="MS Gothic"/>
                 </w14:checkbox>
               </w:sdtPr>
-              <w:sdtEndPr/>
               <w:sdtContent>
                 <w:r>
                   <w:rPr>
@@ -9685,7 +8008,6 @@
                   <w14:uncheckedState w14:val="2610" w14:font="MS Gothic"/>
                 </w14:checkbox>
               </w:sdtPr>
-              <w:sdtEndPr/>
               <w:sdtContent>
                 <w:r>
                   <w:rPr>
@@ -9735,7 +8057,6 @@
                   <w14:uncheckedState w14:val="2610" w14:font="MS Gothic"/>
                 </w14:checkbox>
               </w:sdtPr>
-              <w:sdtEndPr/>
               <w:sdtContent>
                 <w:r>
                   <w:rPr>
@@ -9779,7 +8100,6 @@
                   <w14:uncheckedState w14:val="2610" w14:font="MS Gothic"/>
                 </w14:checkbox>
               </w:sdtPr>
-              <w:sdtEndPr/>
               <w:sdtContent>
                 <w:r>
                   <w:rPr>
@@ -9853,7 +8173,6 @@
                   <w14:uncheckedState w14:val="2610" w14:font="MS Gothic"/>
                 </w14:checkbox>
               </w:sdtPr>
-              <w:sdtEndPr/>
               <w:sdtContent>
                 <w:r>
                   <w:rPr>
@@ -9908,7 +8227,6 @@
                   <w14:uncheckedState w14:val="2610" w14:font="MS Gothic"/>
                 </w14:checkbox>
               </w:sdtPr>
-              <w:sdtEndPr/>
               <w:sdtContent>
                 <w:r>
                   <w:rPr>
@@ -9945,8 +8263,17 @@
                 <w:rFonts w:cstheme="minorHAnsi"/>
                 <w:b/>
               </w:rPr>
-              <w:t>Name of the Deceased or Legally Incapacitated Inventor :</w:t>
-            </w:r>
+              <w:t xml:space="preserve">Name of the Deceased or Legally Incapacitated </w:t>
+            </w:r>
+            <w:proofErr w:type="gramStart"/>
+            <w:r>
+              <w:rPr>
+                <w:rFonts w:cstheme="minorHAnsi"/>
+                <w:b/>
+              </w:rPr>
+              <w:t>Inventor :</w:t>
+            </w:r>
+            <w:proofErr w:type="gramEnd"/>
           </w:p>
         </w:tc>
       </w:tr>
@@ -9973,7 +8300,23 @@
                 <w:rFonts w:cstheme="minorHAnsi"/>
                 <w:b/>
               </w:rPr>
-              <w:t xml:space="preserve">If the Applicant is an Organization check here:  </w:t>
+              <w:t xml:space="preserve">If the Applicant is an </w:t>
+            </w:r>
+            <w:proofErr w:type="gramStart"/>
+            <w:r>
+              <w:rPr>
+                <w:rFonts w:cstheme="minorHAnsi"/>
+                <w:b/>
+              </w:rPr>
+              <w:t>Organization</w:t>
+            </w:r>
+            <w:proofErr w:type="gramEnd"/>
+            <w:r>
+              <w:rPr>
+                <w:rFonts w:cstheme="minorHAnsi"/>
+                <w:b/>
+              </w:rPr>
+              <w:t xml:space="preserve"> check here:  </w:t>
             </w:r>
             <w:sdt>
               <w:sdtPr>
@@ -9990,7 +8333,6 @@
                   <w14:uncheckedState w14:val="2610" w14:font="MS Gothic"/>
                 </w14:checkbox>
               </w:sdtPr>
-              <w:sdtEndPr/>
               <w:sdtContent>
                 <w:r>
                   <w:rPr>
@@ -10643,6 +8985,7 @@
           <w:sz w:val="28"/>
           <w:szCs w:val="28"/>
         </w:rPr>
+        <w:lastRenderedPageBreak/>
         <w:t xml:space="preserve">Assignee Information including </w:t>
       </w:r>
       <w:r>
@@ -10758,13 +9101,24 @@
               <w:rPr>
                 <w:b/>
               </w:rPr>
-              <w:t>&lt;&lt;assigneeCnt&gt;&gt;</w:t>
+              <w:t>&lt;&lt;assigneeCnt&gt;</w:t>
+            </w:r>
+            <w:proofErr w:type="gramStart"/>
+            <w:r>
+              <w:rPr>
+                <w:b/>
+              </w:rPr>
+              <w:t>&gt;</w:t>
             </w:r>
             <w:r>
               <w:t xml:space="preserve">  </w:t>
             </w:r>
             <w:r>
-              <w:t>&lt;&lt;assignee&gt;&gt;</w:t>
+              <w:t>&lt;</w:t>
+            </w:r>
+            <w:proofErr w:type="gramEnd"/>
+            <w:r>
+              <w:t>&lt;assignee&gt;&gt;</w:t>
             </w:r>
           </w:p>
         </w:tc>
@@ -12013,7 +10367,23 @@
                 <w:rFonts w:cstheme="minorHAnsi"/>
                 <w:b/>
               </w:rPr>
-              <w:t xml:space="preserve">is an Organization check here.  </w:t>
+              <w:t xml:space="preserve">is an </w:t>
+            </w:r>
+            <w:proofErr w:type="gramStart"/>
+            <w:r>
+              <w:rPr>
+                <w:rFonts w:cstheme="minorHAnsi"/>
+                <w:b/>
+              </w:rPr>
+              <w:t>Organization</w:t>
+            </w:r>
+            <w:proofErr w:type="gramEnd"/>
+            <w:r>
+              <w:rPr>
+                <w:rFonts w:cstheme="minorHAnsi"/>
+                <w:b/>
+              </w:rPr>
+              <w:t xml:space="preserve"> check here.  </w:t>
             </w:r>
             <w:sdt>
               <w:sdtPr>
@@ -12030,7 +10400,6 @@
                   <w14:uncheckedState w14:val="2610" w14:font="MS Gothic"/>
                 </w14:checkbox>
               </w:sdtPr>
-              <w:sdtEndPr/>
               <w:sdtContent>
                 <w:r>
                   <w:rPr>
@@ -12471,7 +10840,33 @@
                 <w:sz w:val="24"/>
                 <w:szCs w:val="24"/>
               </w:rPr>
-              <w:t xml:space="preserve"> For Assignee</w:t>
+              <w:t xml:space="preserve"> </w:t>
+            </w:r>
+            <w:proofErr w:type="gramStart"/>
+            <w:r>
+              <w:rPr>
+                <w:rFonts w:eastAsia="Arial" w:cstheme="minorHAnsi"/>
+                <w:b/>
+                <w:bCs/>
+                <w:color w:val="010101"/>
+                <w:w w:val="105"/>
+                <w:sz w:val="24"/>
+                <w:szCs w:val="24"/>
+              </w:rPr>
+              <w:t>For</w:t>
+            </w:r>
+            <w:proofErr w:type="gramEnd"/>
+            <w:r>
+              <w:rPr>
+                <w:rFonts w:eastAsia="Arial" w:cstheme="minorHAnsi"/>
+                <w:b/>
+                <w:bCs/>
+                <w:color w:val="010101"/>
+                <w:w w:val="105"/>
+                <w:sz w:val="24"/>
+                <w:szCs w:val="24"/>
+              </w:rPr>
+              <w:t xml:space="preserve"> Assignee</w:t>
             </w:r>
             <w:r>
               <w:rPr>
@@ -13582,6 +11977,7 @@
                 <w:szCs w:val="18"/>
               </w:rPr>
             </w:pPr>
+            <w:proofErr w:type="gramStart"/>
             <w:r>
               <w:rPr>
                 <w:rFonts w:eastAsia="Arial" w:cstheme="minorHAnsi"/>
@@ -13608,6 +12004,7 @@
               </w:rPr>
               <w:t>(</w:t>
             </w:r>
+            <w:proofErr w:type="gramEnd"/>
             <w:r>
               <w:rPr>
                 <w:rFonts w:eastAsia="Arial" w:cstheme="minorHAnsi"/>
@@ -13920,7 +12317,6 @@
         <w:docPartUnique/>
       </w:docPartObj>
     </w:sdtPr>
-    <w:sdtEndPr/>
     <w:sdtContent>
       <w:p>
         <w:pPr>
@@ -14070,7 +12466,16 @@
         <w:sz w:val="13"/>
         <w:szCs w:val="13"/>
       </w:rPr>
-      <w:t xml:space="preserve">PTO/AIA/14 </w:t>
+      <w:t>PTO/AIA/</w:t>
+    </w:r>
+    <w:proofErr w:type="gramStart"/>
+    <w:r>
+      <w:rPr>
+        <w:rFonts w:ascii="Arial" w:eastAsia="Arial" w:hAnsi="Arial" w:cs="Arial"/>
+        <w:sz w:val="13"/>
+        <w:szCs w:val="13"/>
+      </w:rPr>
+      <w:t xml:space="preserve">14 </w:t>
     </w:r>
     <w:r>
       <w:rPr>
@@ -14088,7 +12493,17 @@
         <w:sz w:val="13"/>
         <w:szCs w:val="13"/>
       </w:rPr>
-      <w:t>(01-22</w:t>
+      <w:t>(</w:t>
+    </w:r>
+    <w:proofErr w:type="gramEnd"/>
+    <w:r>
+      <w:rPr>
+        <w:rFonts w:ascii="Arial" w:eastAsia="Arial" w:hAnsi="Arial" w:cs="Arial"/>
+        <w:w w:val="108"/>
+        <w:sz w:val="13"/>
+        <w:szCs w:val="13"/>
+      </w:rPr>
+      <w:t>01-22</w:t>
     </w:r>
     <w:r>
       <w:rPr>
@@ -14508,6 +12923,7 @@
       </w:rPr>
       <w:t xml:space="preserve"> </w:t>
     </w:r>
+    <w:proofErr w:type="gramStart"/>
     <w:r>
       <w:rPr>
         <w:rFonts w:ascii="Arial" w:eastAsia="Arial" w:hAnsi="Arial" w:cs="Arial"/>
@@ -14533,6 +12949,7 @@
       </w:rPr>
       <w:t>are</w:t>
     </w:r>
+    <w:proofErr w:type="gramEnd"/>
     <w:r>
       <w:rPr>
         <w:rFonts w:ascii="Arial" w:eastAsia="Arial" w:hAnsi="Arial" w:cs="Arial"/>

</xml_diff>

<commit_message>
Added fill function for multiple applicants and assignees.
</commit_message>
<xml_diff>
--- a/project/documents/formaldocuments/ApplicationDataSheet_NEW2.docx
+++ b/project/documents/formaldocuments/ApplicationDataSheet_NEW2.docx
@@ -6503,6 +6503,26 @@
     </w:tbl>
     <w:p>
       <w:pPr>
+        <w:spacing w:after="0" w:line="240" w:lineRule="auto"/>
+        <w:ind w:firstLine="180"/>
+        <w:rPr>
+          <w:b/>
+          <w:sz w:val="28"/>
+          <w:szCs w:val="28"/>
+        </w:rPr>
+      </w:pPr>
+      <w:r>
+        <w:rPr>
+          <w:b/>
+          <w:sz w:val="28"/>
+          <w:szCs w:val="28"/>
+        </w:rPr>
+        <w:lastRenderedPageBreak/>
+        <w:t>Applicant Information:</w:t>
+      </w:r>
+    </w:p>
+    <w:p>
+      <w:pPr>
         <w:widowControl/>
         <w:rPr>
           <w:rFonts w:eastAsia="Arial" w:cstheme="minorHAnsi"/>
@@ -6518,7 +6538,6 @@
           <w:sz w:val="28"/>
           <w:szCs w:val="28"/>
         </w:rPr>
-        <w:lastRenderedPageBreak/>
         <w:br w:type="page"/>
       </w:r>
     </w:p>
@@ -7753,4496 +7772,6 @@
           <w:szCs w:val="28"/>
         </w:rPr>
       </w:pPr>
-    </w:p>
-    <w:p>
-      <w:pPr>
-        <w:spacing w:after="0" w:line="240" w:lineRule="auto"/>
-        <w:ind w:firstLine="180"/>
-        <w:rPr>
-          <w:b/>
-          <w:sz w:val="28"/>
-          <w:szCs w:val="28"/>
-        </w:rPr>
-      </w:pPr>
-      <w:r>
-        <w:rPr>
-          <w:b/>
-          <w:sz w:val="28"/>
-          <w:szCs w:val="28"/>
-        </w:rPr>
-        <w:lastRenderedPageBreak/>
-        <w:t>Applicant Information:</w:t>
-      </w:r>
-    </w:p>
-    <w:tbl>
-      <w:tblPr>
-        <w:tblStyle w:val="TableGrid"/>
-        <w:tblW w:w="0" w:type="auto"/>
-        <w:jc w:val="center"/>
-        <w:tblLook w:val="04A0" w:firstRow="1" w:lastRow="0" w:firstColumn="1" w:lastColumn="0" w:noHBand="0" w:noVBand="1"/>
-      </w:tblPr>
-      <w:tblGrid>
-        <w:gridCol w:w="1966"/>
-        <w:gridCol w:w="288"/>
-        <w:gridCol w:w="954"/>
-        <w:gridCol w:w="936"/>
-        <w:gridCol w:w="1044"/>
-        <w:gridCol w:w="180"/>
-        <w:gridCol w:w="954"/>
-        <w:gridCol w:w="1206"/>
-        <w:gridCol w:w="594"/>
-        <w:gridCol w:w="378"/>
-        <w:gridCol w:w="2316"/>
-      </w:tblGrid>
-      <w:tr>
-        <w:trPr>
-          <w:trHeight w:val="710"/>
-          <w:jc w:val="center"/>
-        </w:trPr>
-        <w:tc>
-          <w:tcPr>
-            <w:tcW w:w="10816" w:type="dxa"/>
-            <w:gridSpan w:val="11"/>
-            <w:vAlign w:val="center"/>
-          </w:tcPr>
-          <w:p>
-            <w:r>
-              <w:rPr>
-                <w:rFonts w:cstheme="minorHAnsi"/>
-                <w:b/>
-                <w:sz w:val="20"/>
-                <w:szCs w:val="20"/>
-              </w:rPr>
-              <w:t>Providing assignment information in this section does not substitute for compliance with any requirement of part 3 of Title 37 of CFR to have an assignment recorded by the Office.</w:t>
-            </w:r>
-          </w:p>
-        </w:tc>
-      </w:tr>
-      <w:tr>
-        <w:trPr>
-          <w:trHeight w:val="490"/>
-          <w:jc w:val="center"/>
-        </w:trPr>
-        <w:tc>
-          <w:tcPr>
-            <w:tcW w:w="10816" w:type="dxa"/>
-            <w:gridSpan w:val="11"/>
-            <w:vAlign w:val="center"/>
-          </w:tcPr>
-          <w:p>
-            <w:r>
-              <w:rPr>
-                <w:b/>
-                <w:sz w:val="24"/>
-                <w:szCs w:val="24"/>
-              </w:rPr>
-              <w:t>&lt;&lt;applCnt&gt;</w:t>
-            </w:r>
-            <w:proofErr w:type="gramStart"/>
-            <w:r>
-              <w:rPr>
-                <w:b/>
-                <w:sz w:val="24"/>
-                <w:szCs w:val="24"/>
-              </w:rPr>
-              <w:t xml:space="preserve">&gt;  </w:t>
-            </w:r>
-            <w:r>
-              <w:t>&lt;</w:t>
-            </w:r>
-            <w:proofErr w:type="gramEnd"/>
-            <w:r>
-              <w:t>&lt;applicant&gt;&gt;</w:t>
-            </w:r>
-          </w:p>
-        </w:tc>
-      </w:tr>
-      <w:tr>
-        <w:trPr>
-          <w:trHeight w:val="1880"/>
-          <w:jc w:val="center"/>
-        </w:trPr>
-        <w:tc>
-          <w:tcPr>
-            <w:tcW w:w="10816" w:type="dxa"/>
-            <w:gridSpan w:val="11"/>
-            <w:vAlign w:val="center"/>
-          </w:tcPr>
-          <w:p>
-            <w:r>
-              <w:rPr>
-                <w:rFonts w:cstheme="minorHAnsi"/>
-                <w:b/>
-                <w:sz w:val="20"/>
-                <w:szCs w:val="20"/>
-              </w:rPr>
-              <w:t>If the applicant is the inventor (or the remaining joint inventor or inventors under 37 CFR 1.45), this section should not be completed</w:t>
-            </w:r>
-            <w:r>
-              <w:rPr>
-                <w:rFonts w:cstheme="minorHAnsi"/>
-                <w:b/>
-                <w:sz w:val="20"/>
-                <w:szCs w:val="20"/>
-              </w:rPr>
-              <w:t>. The information to be provided in this section is the name and address of the legal representative who is the applicant under 37 CFR 1.43; or the name and address of the assignee, person to whom the inventor is under an obligation to assign the invention, or person who otherwise shows sufficient proprietary interest in the matter who is the applicant under 37 CFR 1.46. If the applicant is an applicant under 37 CFR 1.46 (assignee, person to whom the inventor is obligated to assign, or person who otherwise shows sufficient proprietary interest) together with one or more joint inventors, then the joint inventor or inventors who are also the applicant should be identified in this section.</w:t>
-            </w:r>
-          </w:p>
-        </w:tc>
-      </w:tr>
-      <w:tr>
-        <w:trPr>
-          <w:trHeight w:val="490"/>
-          <w:jc w:val="center"/>
-        </w:trPr>
-        <w:tc>
-          <w:tcPr>
-            <w:tcW w:w="2254" w:type="dxa"/>
-            <w:gridSpan w:val="2"/>
-          </w:tcPr>
-          <w:p>
-            <w:pPr>
-              <w:tabs>
-                <w:tab w:val="left" w:pos="825"/>
-              </w:tabs>
-              <w:rPr>
-                <w:rFonts w:ascii="Calibri" w:hAnsi="Calibri" w:cstheme="minorHAnsi"/>
-              </w:rPr>
-            </w:pPr>
-            <w:sdt>
-              <w:sdtPr>
-                <w:rPr>
-                  <w:rFonts w:ascii="Calibri" w:hAnsi="Calibri" w:cstheme="minorHAnsi"/>
-                  <w:b/>
-                </w:rPr>
-                <w:id w:val="-388029183"/>
-                <w14:checkbox>
-                  <w14:checked w14:val="0"/>
-                  <w14:checkedState w14:val="2612" w14:font="MS Gothic"/>
-                  <w14:uncheckedState w14:val="2610" w14:font="MS Gothic"/>
-                </w14:checkbox>
-              </w:sdtPr>
-              <w:sdtContent>
-                <w:r>
-                  <w:rPr>
-                    <w:rFonts w:ascii="MS Gothic" w:eastAsia="MS Gothic" w:hAnsi="MS Gothic" w:cstheme="minorHAnsi" w:hint="eastAsia"/>
-                    <w:b/>
-                  </w:rPr>
-                  <w:t>☐</w:t>
-                </w:r>
-              </w:sdtContent>
-            </w:sdt>
-            <w:r>
-              <w:rPr>
-                <w:rFonts w:ascii="Calibri" w:hAnsi="Calibri" w:cstheme="minorHAnsi"/>
-                <w:b/>
-              </w:rPr>
-              <w:t xml:space="preserve">  Assignee</w:t>
-            </w:r>
-          </w:p>
-        </w:tc>
-        <w:tc>
-          <w:tcPr>
-            <w:tcW w:w="5868" w:type="dxa"/>
-            <w:gridSpan w:val="7"/>
-          </w:tcPr>
-          <w:p>
-            <w:pPr>
-              <w:rPr>
-                <w:rFonts w:ascii="Calibri" w:hAnsi="Calibri" w:cstheme="minorHAnsi"/>
-              </w:rPr>
-            </w:pPr>
-            <w:sdt>
-              <w:sdtPr>
-                <w:rPr>
-                  <w:rFonts w:ascii="Calibri" w:hAnsi="Calibri" w:cstheme="minorHAnsi"/>
-                  <w:b/>
-                </w:rPr>
-                <w:id w:val="593984586"/>
-                <w14:checkbox>
-                  <w14:checked w14:val="0"/>
-                  <w14:checkedState w14:val="2612" w14:font="MS Gothic"/>
-                  <w14:uncheckedState w14:val="2610" w14:font="MS Gothic"/>
-                </w14:checkbox>
-              </w:sdtPr>
-              <w:sdtContent>
-                <w:r>
-                  <w:rPr>
-                    <w:rFonts w:ascii="MS Gothic" w:eastAsia="MS Gothic" w:hAnsi="MS Gothic" w:cstheme="minorHAnsi" w:hint="eastAsia"/>
-                    <w:b/>
-                  </w:rPr>
-                  <w:t>☐</w:t>
-                </w:r>
-              </w:sdtContent>
-            </w:sdt>
-            <w:r>
-              <w:rPr>
-                <w:rFonts w:ascii="Calibri" w:hAnsi="Calibri" w:cstheme="minorHAnsi"/>
-                <w:b/>
-              </w:rPr>
-              <w:t xml:space="preserve">  Legal Representative under 35 U.S.C. 117</w:t>
-            </w:r>
-          </w:p>
-        </w:tc>
-        <w:tc>
-          <w:tcPr>
-            <w:tcW w:w="2694" w:type="dxa"/>
-            <w:gridSpan w:val="2"/>
-          </w:tcPr>
-          <w:p>
-            <w:pPr>
-              <w:rPr>
-                <w:rFonts w:ascii="Calibri" w:hAnsi="Calibri" w:cstheme="minorHAnsi"/>
-              </w:rPr>
-            </w:pPr>
-            <w:sdt>
-              <w:sdtPr>
-                <w:rPr>
-                  <w:rFonts w:ascii="Calibri" w:hAnsi="Calibri" w:cstheme="minorHAnsi"/>
-                  <w:b/>
-                </w:rPr>
-                <w:id w:val="246695921"/>
-                <w14:checkbox>
-                  <w14:checked w14:val="0"/>
-                  <w14:checkedState w14:val="2612" w14:font="MS Gothic"/>
-                  <w14:uncheckedState w14:val="2610" w14:font="MS Gothic"/>
-                </w14:checkbox>
-              </w:sdtPr>
-              <w:sdtContent>
-                <w:r>
-                  <w:rPr>
-                    <w:rFonts w:ascii="MS Gothic" w:eastAsia="MS Gothic" w:hAnsi="MS Gothic" w:cstheme="minorHAnsi" w:hint="eastAsia"/>
-                    <w:b/>
-                  </w:rPr>
-                  <w:t>☐</w:t>
-                </w:r>
-              </w:sdtContent>
-            </w:sdt>
-            <w:r>
-              <w:rPr>
-                <w:rFonts w:ascii="Calibri" w:hAnsi="Calibri" w:cstheme="minorHAnsi"/>
-                <w:b/>
-              </w:rPr>
-              <w:t xml:space="preserve">  Joint Inventor</w:t>
-            </w:r>
-          </w:p>
-        </w:tc>
-      </w:tr>
-      <w:tr>
-        <w:trPr>
-          <w:trHeight w:val="490"/>
-          <w:jc w:val="center"/>
-        </w:trPr>
-        <w:tc>
-          <w:tcPr>
-            <w:tcW w:w="5188" w:type="dxa"/>
-            <w:gridSpan w:val="5"/>
-          </w:tcPr>
-          <w:p>
-            <w:pPr>
-              <w:rPr>
-                <w:rFonts w:cstheme="minorHAnsi"/>
-              </w:rPr>
-            </w:pPr>
-            <w:sdt>
-              <w:sdtPr>
-                <w:rPr>
-                  <w:rFonts w:cstheme="minorHAnsi"/>
-                  <w:b/>
-                </w:rPr>
-                <w:id w:val="-1541510598"/>
-                <w14:checkbox>
-                  <w14:checked w14:val="0"/>
-                  <w14:checkedState w14:val="2612" w14:font="MS Gothic"/>
-                  <w14:uncheckedState w14:val="2610" w14:font="MS Gothic"/>
-                </w14:checkbox>
-              </w:sdtPr>
-              <w:sdtContent>
-                <w:r>
-                  <w:rPr>
-                    <w:rFonts w:ascii="MS Gothic" w:eastAsia="MS Gothic" w:hAnsi="MS Gothic" w:cstheme="minorHAnsi" w:hint="eastAsia"/>
-                    <w:b/>
-                  </w:rPr>
-                  <w:t>☐</w:t>
-                </w:r>
-              </w:sdtContent>
-            </w:sdt>
-            <w:r>
-              <w:rPr>
-                <w:rFonts w:cstheme="minorHAnsi"/>
-                <w:b/>
-              </w:rPr>
-              <w:t xml:space="preserve">  Person to whom the inventor is obligated to assign</w:t>
-            </w:r>
-          </w:p>
-        </w:tc>
-        <w:tc>
-          <w:tcPr>
-            <w:tcW w:w="5628" w:type="dxa"/>
-            <w:gridSpan w:val="6"/>
-          </w:tcPr>
-          <w:p>
-            <w:pPr>
-              <w:rPr>
-                <w:rFonts w:cstheme="minorHAnsi"/>
-              </w:rPr>
-            </w:pPr>
-            <w:sdt>
-              <w:sdtPr>
-                <w:rPr>
-                  <w:rFonts w:cstheme="minorHAnsi"/>
-                  <w:b/>
-                </w:rPr>
-                <w:id w:val="1727251798"/>
-                <w14:checkbox>
-                  <w14:checked w14:val="0"/>
-                  <w14:checkedState w14:val="2612" w14:font="MS Gothic"/>
-                  <w14:uncheckedState w14:val="2610" w14:font="MS Gothic"/>
-                </w14:checkbox>
-              </w:sdtPr>
-              <w:sdtContent>
-                <w:r>
-                  <w:rPr>
-                    <w:rFonts w:ascii="MS Gothic" w:eastAsia="MS Gothic" w:hAnsi="MS Gothic" w:cstheme="minorHAnsi" w:hint="eastAsia"/>
-                    <w:b/>
-                  </w:rPr>
-                  <w:t>☐</w:t>
-                </w:r>
-              </w:sdtContent>
-            </w:sdt>
-            <w:r>
-              <w:rPr>
-                <w:rFonts w:cstheme="minorHAnsi"/>
-                <w:b/>
-              </w:rPr>
-              <w:t xml:space="preserve">  Person who shows sufficient proprietary interest</w:t>
-            </w:r>
-          </w:p>
-        </w:tc>
-      </w:tr>
-      <w:tr>
-        <w:trPr>
-          <w:trHeight w:val="490"/>
-          <w:jc w:val="center"/>
-        </w:trPr>
-        <w:tc>
-          <w:tcPr>
-            <w:tcW w:w="10816" w:type="dxa"/>
-            <w:gridSpan w:val="11"/>
-          </w:tcPr>
-          <w:p>
-            <w:r>
-              <w:rPr>
-                <w:rFonts w:cstheme="minorHAnsi"/>
-                <w:b/>
-              </w:rPr>
-              <w:t>If applicant is the legal representative, indicate the authority to file the patent application, the inventor is:</w:t>
-            </w:r>
-          </w:p>
-        </w:tc>
-      </w:tr>
-      <w:tr>
-        <w:trPr>
-          <w:trHeight w:val="490"/>
-          <w:jc w:val="center"/>
-        </w:trPr>
-        <w:tc>
-          <w:tcPr>
-            <w:tcW w:w="3208" w:type="dxa"/>
-            <w:gridSpan w:val="3"/>
-          </w:tcPr>
-          <w:p>
-            <w:pPr>
-              <w:tabs>
-                <w:tab w:val="left" w:pos="1200"/>
-              </w:tabs>
-              <w:rPr>
-                <w:rFonts w:cstheme="minorHAnsi"/>
-              </w:rPr>
-            </w:pPr>
-            <w:sdt>
-              <w:sdtPr>
-                <w:rPr>
-                  <w:rFonts w:cstheme="minorHAnsi"/>
-                  <w:b/>
-                </w:rPr>
-                <w:id w:val="-1664382754"/>
-                <w14:checkbox>
-                  <w14:checked w14:val="0"/>
-                  <w14:checkedState w14:val="2612" w14:font="MS Gothic"/>
-                  <w14:uncheckedState w14:val="2610" w14:font="MS Gothic"/>
-                </w14:checkbox>
-              </w:sdtPr>
-              <w:sdtContent>
-                <w:r>
-                  <w:rPr>
-                    <w:rFonts w:ascii="MS Gothic" w:eastAsia="MS Gothic" w:hAnsi="MS Gothic" w:cstheme="minorHAnsi" w:hint="eastAsia"/>
-                    <w:b/>
-                  </w:rPr>
-                  <w:t>☐</w:t>
-                </w:r>
-              </w:sdtContent>
-            </w:sdt>
-            <w:r>
-              <w:rPr>
-                <w:rFonts w:cstheme="minorHAnsi"/>
-                <w:b/>
-              </w:rPr>
-              <w:t xml:space="preserve">  Deceased</w:t>
-            </w:r>
-            <w:r>
-              <w:rPr>
-                <w:rFonts w:cstheme="minorHAnsi"/>
-                <w:b/>
-              </w:rPr>
-              <w:tab/>
-            </w:r>
-          </w:p>
-        </w:tc>
-        <w:tc>
-          <w:tcPr>
-            <w:tcW w:w="7608" w:type="dxa"/>
-            <w:gridSpan w:val="8"/>
-          </w:tcPr>
-          <w:p>
-            <w:pPr>
-              <w:tabs>
-                <w:tab w:val="left" w:pos="1920"/>
-              </w:tabs>
-              <w:rPr>
-                <w:rFonts w:cstheme="minorHAnsi"/>
-              </w:rPr>
-            </w:pPr>
-            <w:sdt>
-              <w:sdtPr>
-                <w:rPr>
-                  <w:rFonts w:cstheme="minorHAnsi"/>
-                  <w:b/>
-                </w:rPr>
-                <w:tag w:val="AppIsOrg"/>
-                <w:id w:val="-2082357744"/>
-                <w14:checkbox>
-                  <w14:checked w14:val="0"/>
-                  <w14:checkedState w14:val="2612" w14:font="MS Gothic"/>
-                  <w14:uncheckedState w14:val="2610" w14:font="MS Gothic"/>
-                </w14:checkbox>
-              </w:sdtPr>
-              <w:sdtContent>
-                <w:r>
-                  <w:rPr>
-                    <w:rFonts w:ascii="MS Gothic" w:eastAsia="MS Gothic" w:hAnsi="MS Gothic" w:cstheme="minorHAnsi" w:hint="eastAsia"/>
-                    <w:b/>
-                  </w:rPr>
-                  <w:t>☐</w:t>
-                </w:r>
-              </w:sdtContent>
-            </w:sdt>
-            <w:r>
-              <w:rPr>
-                <w:rFonts w:cstheme="minorHAnsi"/>
-                <w:b/>
-              </w:rPr>
-              <w:t xml:space="preserve">  Legally incapacitated</w:t>
-            </w:r>
-          </w:p>
-        </w:tc>
-      </w:tr>
-      <w:tr>
-        <w:trPr>
-          <w:trHeight w:val="490"/>
-          <w:jc w:val="center"/>
-        </w:trPr>
-        <w:tc>
-          <w:tcPr>
-            <w:tcW w:w="10816" w:type="dxa"/>
-            <w:gridSpan w:val="11"/>
-          </w:tcPr>
-          <w:p>
-            <w:r>
-              <w:rPr>
-                <w:rFonts w:cstheme="minorHAnsi"/>
-                <w:b/>
-              </w:rPr>
-              <w:t xml:space="preserve">Name of the Deceased or Legally Incapacitated </w:t>
-            </w:r>
-            <w:proofErr w:type="gramStart"/>
-            <w:r>
-              <w:rPr>
-                <w:rFonts w:cstheme="minorHAnsi"/>
-                <w:b/>
-              </w:rPr>
-              <w:t>Inventor :</w:t>
-            </w:r>
-            <w:proofErr w:type="gramEnd"/>
-          </w:p>
-        </w:tc>
-      </w:tr>
-      <w:tr>
-        <w:trPr>
-          <w:trHeight w:val="490"/>
-          <w:jc w:val="center"/>
-        </w:trPr>
-        <w:tc>
-          <w:tcPr>
-            <w:tcW w:w="10816" w:type="dxa"/>
-            <w:gridSpan w:val="11"/>
-            <w:vAlign w:val="center"/>
-          </w:tcPr>
-          <w:p>
-            <w:pPr>
-              <w:rPr>
-                <w:rFonts w:cstheme="minorHAnsi"/>
-                <w:b/>
-              </w:rPr>
-            </w:pPr>
-            <w:r>
-              <w:rPr>
-                <w:rFonts w:cstheme="minorHAnsi"/>
-                <w:b/>
-              </w:rPr>
-              <w:t xml:space="preserve">If the Applicant is an </w:t>
-            </w:r>
-            <w:proofErr w:type="gramStart"/>
-            <w:r>
-              <w:rPr>
-                <w:rFonts w:cstheme="minorHAnsi"/>
-                <w:b/>
-              </w:rPr>
-              <w:t>Organization</w:t>
-            </w:r>
-            <w:proofErr w:type="gramEnd"/>
-            <w:r>
-              <w:rPr>
-                <w:rFonts w:cstheme="minorHAnsi"/>
-                <w:b/>
-              </w:rPr>
-              <w:t xml:space="preserve"> check here:  </w:t>
-            </w:r>
-            <w:sdt>
-              <w:sdtPr>
-                <w:rPr>
-                  <w:rFonts w:cstheme="minorHAnsi"/>
-                  <w:b/>
-                  <w:sz w:val="24"/>
-                  <w:szCs w:val="24"/>
-                </w:rPr>
-                <w:id w:val="-984540570"/>
-                <w14:checkbox>
-                  <w14:checked w14:val="0"/>
-                  <w14:checkedState w14:val="2612" w14:font="MS Gothic"/>
-                  <w14:uncheckedState w14:val="2610" w14:font="MS Gothic"/>
-                </w14:checkbox>
-              </w:sdtPr>
-              <w:sdtContent>
-                <w:r>
-                  <w:rPr>
-                    <w:rFonts w:ascii="MS Gothic" w:eastAsia="MS Gothic" w:hAnsi="MS Gothic" w:cstheme="minorHAnsi" w:hint="eastAsia"/>
-                    <w:b/>
-                    <w:sz w:val="24"/>
-                    <w:szCs w:val="24"/>
-                  </w:rPr>
-                  <w:t>☐</w:t>
-                </w:r>
-              </w:sdtContent>
-            </w:sdt>
-          </w:p>
-        </w:tc>
-      </w:tr>
-      <w:tr>
-        <w:trPr>
-          <w:trHeight w:val="490"/>
-          <w:jc w:val="center"/>
-        </w:trPr>
-        <w:tc>
-          <w:tcPr>
-            <w:tcW w:w="10816" w:type="dxa"/>
-            <w:gridSpan w:val="11"/>
-            <w:vAlign w:val="center"/>
-          </w:tcPr>
-          <w:p>
-            <w:pPr>
-              <w:rPr>
-                <w:rFonts w:cstheme="minorHAnsi"/>
-                <w:b/>
-              </w:rPr>
-            </w:pPr>
-            <w:r>
-              <w:rPr>
-                <w:rFonts w:cstheme="minorHAnsi"/>
-                <w:b/>
-              </w:rPr>
-              <w:t xml:space="preserve">Organization Name:  </w:t>
-            </w:r>
-            <w:r>
-              <w:t>&lt;&lt;applicant&gt;&gt;</w:t>
-            </w:r>
-          </w:p>
-        </w:tc>
-      </w:tr>
-      <w:tr>
-        <w:trPr>
-          <w:trHeight w:val="317"/>
-          <w:jc w:val="center"/>
-        </w:trPr>
-        <w:tc>
-          <w:tcPr>
-            <w:tcW w:w="1966" w:type="dxa"/>
-          </w:tcPr>
-          <w:p>
-            <w:pPr>
-              <w:rPr>
-                <w:b/>
-                <w:sz w:val="24"/>
-                <w:szCs w:val="24"/>
-              </w:rPr>
-            </w:pPr>
-            <w:r>
-              <w:rPr>
-                <w:b/>
-                <w:sz w:val="24"/>
-                <w:szCs w:val="24"/>
-              </w:rPr>
-              <w:t>Prefix</w:t>
-            </w:r>
-          </w:p>
-        </w:tc>
-        <w:tc>
-          <w:tcPr>
-            <w:tcW w:w="2178" w:type="dxa"/>
-            <w:gridSpan w:val="3"/>
-          </w:tcPr>
-          <w:p>
-            <w:pPr>
-              <w:rPr>
-                <w:b/>
-                <w:sz w:val="24"/>
-                <w:szCs w:val="24"/>
-              </w:rPr>
-            </w:pPr>
-            <w:r>
-              <w:rPr>
-                <w:b/>
-                <w:szCs w:val="24"/>
-              </w:rPr>
-              <w:t>Given Name</w:t>
-            </w:r>
-          </w:p>
-        </w:tc>
-        <w:tc>
-          <w:tcPr>
-            <w:tcW w:w="2178" w:type="dxa"/>
-            <w:gridSpan w:val="3"/>
-          </w:tcPr>
-          <w:p>
-            <w:pPr>
-              <w:rPr>
-                <w:b/>
-                <w:sz w:val="24"/>
-                <w:szCs w:val="24"/>
-              </w:rPr>
-            </w:pPr>
-            <w:r>
-              <w:rPr>
-                <w:b/>
-                <w:szCs w:val="24"/>
-              </w:rPr>
-              <w:t>Middle Name</w:t>
-            </w:r>
-          </w:p>
-        </w:tc>
-        <w:tc>
-          <w:tcPr>
-            <w:tcW w:w="2178" w:type="dxa"/>
-            <w:gridSpan w:val="3"/>
-          </w:tcPr>
-          <w:p>
-            <w:pPr>
-              <w:rPr>
-                <w:b/>
-                <w:szCs w:val="24"/>
-              </w:rPr>
-            </w:pPr>
-            <w:r>
-              <w:rPr>
-                <w:b/>
-                <w:szCs w:val="24"/>
-              </w:rPr>
-              <w:t>Family Name</w:t>
-            </w:r>
-          </w:p>
-        </w:tc>
-        <w:tc>
-          <w:tcPr>
-            <w:tcW w:w="2316" w:type="dxa"/>
-          </w:tcPr>
-          <w:p>
-            <w:pPr>
-              <w:rPr>
-                <w:b/>
-                <w:sz w:val="24"/>
-                <w:szCs w:val="24"/>
-              </w:rPr>
-            </w:pPr>
-            <w:r>
-              <w:rPr>
-                <w:b/>
-                <w:szCs w:val="24"/>
-              </w:rPr>
-              <w:t>Suffix</w:t>
-            </w:r>
-          </w:p>
-        </w:tc>
-      </w:tr>
-      <w:tr>
-        <w:trPr>
-          <w:trHeight w:val="317"/>
-          <w:jc w:val="center"/>
-        </w:trPr>
-        <w:tc>
-          <w:tcPr>
-            <w:tcW w:w="1966" w:type="dxa"/>
-          </w:tcPr>
-          <w:p>
-            <w:pPr>
-              <w:rPr>
-                <w:b/>
-                <w:szCs w:val="24"/>
-              </w:rPr>
-            </w:pPr>
-          </w:p>
-        </w:tc>
-        <w:tc>
-          <w:tcPr>
-            <w:tcW w:w="2178" w:type="dxa"/>
-            <w:gridSpan w:val="3"/>
-          </w:tcPr>
-          <w:p>
-            <w:pPr>
-              <w:rPr>
-                <w:b/>
-                <w:szCs w:val="24"/>
-              </w:rPr>
-            </w:pPr>
-          </w:p>
-        </w:tc>
-        <w:tc>
-          <w:tcPr>
-            <w:tcW w:w="2178" w:type="dxa"/>
-            <w:gridSpan w:val="3"/>
-          </w:tcPr>
-          <w:p>
-            <w:pPr>
-              <w:rPr>
-                <w:b/>
-                <w:szCs w:val="24"/>
-              </w:rPr>
-            </w:pPr>
-          </w:p>
-        </w:tc>
-        <w:tc>
-          <w:tcPr>
-            <w:tcW w:w="2178" w:type="dxa"/>
-            <w:gridSpan w:val="3"/>
-          </w:tcPr>
-          <w:p>
-            <w:pPr>
-              <w:rPr>
-                <w:b/>
-                <w:szCs w:val="24"/>
-              </w:rPr>
-            </w:pPr>
-          </w:p>
-        </w:tc>
-        <w:tc>
-          <w:tcPr>
-            <w:tcW w:w="2316" w:type="dxa"/>
-          </w:tcPr>
-          <w:p>
-            <w:pPr>
-              <w:rPr>
-                <w:b/>
-                <w:szCs w:val="24"/>
-              </w:rPr>
-            </w:pPr>
-          </w:p>
-        </w:tc>
-      </w:tr>
-      <w:tr>
-        <w:trPr>
-          <w:trHeight w:val="360"/>
-          <w:jc w:val="center"/>
-        </w:trPr>
-        <w:tc>
-          <w:tcPr>
-            <w:tcW w:w="10816" w:type="dxa"/>
-            <w:gridSpan w:val="11"/>
-            <w:vAlign w:val="center"/>
-          </w:tcPr>
-          <w:p>
-            <w:r>
-              <w:rPr>
-                <w:rFonts w:eastAsia="Arial" w:cstheme="minorHAnsi"/>
-                <w:b/>
-                <w:bCs/>
-                <w:color w:val="010101"/>
-                <w:sz w:val="24"/>
-                <w:szCs w:val="24"/>
-              </w:rPr>
-              <w:t>Mailing</w:t>
-            </w:r>
-            <w:r>
-              <w:rPr>
-                <w:rFonts w:eastAsia="Arial" w:cstheme="minorHAnsi"/>
-                <w:b/>
-                <w:bCs/>
-                <w:color w:val="010101"/>
-                <w:spacing w:val="18"/>
-                <w:sz w:val="24"/>
-                <w:szCs w:val="24"/>
-              </w:rPr>
-              <w:t xml:space="preserve"> </w:t>
-            </w:r>
-            <w:r>
-              <w:rPr>
-                <w:rFonts w:eastAsia="Arial" w:cstheme="minorHAnsi"/>
-                <w:b/>
-                <w:bCs/>
-                <w:color w:val="010101"/>
-                <w:sz w:val="24"/>
-                <w:szCs w:val="24"/>
-              </w:rPr>
-              <w:t>Address</w:t>
-            </w:r>
-            <w:r>
-              <w:rPr>
-                <w:rFonts w:eastAsia="Arial" w:cstheme="minorHAnsi"/>
-                <w:b/>
-                <w:bCs/>
-                <w:color w:val="010101"/>
-                <w:spacing w:val="43"/>
-                <w:sz w:val="24"/>
-                <w:szCs w:val="24"/>
-              </w:rPr>
-              <w:t xml:space="preserve"> </w:t>
-            </w:r>
-            <w:r>
-              <w:rPr>
-                <w:rFonts w:eastAsia="Arial" w:cstheme="minorHAnsi"/>
-                <w:b/>
-                <w:bCs/>
-                <w:color w:val="010101"/>
-                <w:w w:val="105"/>
-                <w:sz w:val="24"/>
-                <w:szCs w:val="24"/>
-              </w:rPr>
-              <w:t>Information:</w:t>
-            </w:r>
-          </w:p>
-        </w:tc>
-      </w:tr>
-      <w:tr>
-        <w:trPr>
-          <w:trHeight w:val="360"/>
-          <w:jc w:val="center"/>
-        </w:trPr>
-        <w:tc>
-          <w:tcPr>
-            <w:tcW w:w="2254" w:type="dxa"/>
-            <w:gridSpan w:val="2"/>
-            <w:vAlign w:val="center"/>
-          </w:tcPr>
-          <w:p>
-            <w:pPr>
-              <w:rPr>
-                <w:b/>
-              </w:rPr>
-            </w:pPr>
-            <w:r>
-              <w:rPr>
-                <w:b/>
-              </w:rPr>
-              <w:t>Address 1</w:t>
-            </w:r>
-          </w:p>
-        </w:tc>
-        <w:tc>
-          <w:tcPr>
-            <w:tcW w:w="8562" w:type="dxa"/>
-            <w:gridSpan w:val="9"/>
-            <w:vAlign w:val="center"/>
-          </w:tcPr>
-          <w:p>
-            <w:r>
-              <w:t>&lt;&lt;applicantStreet1&gt;&gt;</w:t>
-            </w:r>
-          </w:p>
-        </w:tc>
-      </w:tr>
-      <w:tr>
-        <w:trPr>
-          <w:trHeight w:val="360"/>
-          <w:jc w:val="center"/>
-        </w:trPr>
-        <w:tc>
-          <w:tcPr>
-            <w:tcW w:w="2254" w:type="dxa"/>
-            <w:gridSpan w:val="2"/>
-            <w:vAlign w:val="center"/>
-          </w:tcPr>
-          <w:p>
-            <w:pPr>
-              <w:rPr>
-                <w:b/>
-              </w:rPr>
-            </w:pPr>
-            <w:r>
-              <w:rPr>
-                <w:b/>
-              </w:rPr>
-              <w:t>Address 2</w:t>
-            </w:r>
-          </w:p>
-        </w:tc>
-        <w:tc>
-          <w:tcPr>
-            <w:tcW w:w="8562" w:type="dxa"/>
-            <w:gridSpan w:val="9"/>
-            <w:vAlign w:val="center"/>
-          </w:tcPr>
-          <w:p>
-            <w:r>
-              <w:t>&lt;&lt;applicantStreet2&gt;&gt;</w:t>
-            </w:r>
-          </w:p>
-        </w:tc>
-      </w:tr>
-      <w:tr>
-        <w:trPr>
-          <w:trHeight w:val="360"/>
-          <w:jc w:val="center"/>
-        </w:trPr>
-        <w:tc>
-          <w:tcPr>
-            <w:tcW w:w="2254" w:type="dxa"/>
-            <w:gridSpan w:val="2"/>
-            <w:shd w:val="clear" w:color="auto" w:fill="auto"/>
-            <w:vAlign w:val="center"/>
-          </w:tcPr>
-          <w:p>
-            <w:pPr>
-              <w:rPr>
-                <w:b/>
-              </w:rPr>
-            </w:pPr>
-            <w:r>
-              <w:rPr>
-                <w:b/>
-              </w:rPr>
-              <w:t>City</w:t>
-            </w:r>
-          </w:p>
-        </w:tc>
-        <w:tc>
-          <w:tcPr>
-            <w:tcW w:w="3114" w:type="dxa"/>
-            <w:gridSpan w:val="4"/>
-            <w:shd w:val="clear" w:color="auto" w:fill="auto"/>
-            <w:vAlign w:val="center"/>
-          </w:tcPr>
-          <w:p>
-            <w:r>
-              <w:t>&lt;&lt;applicantCity&gt;&gt;</w:t>
-            </w:r>
-          </w:p>
-        </w:tc>
-        <w:tc>
-          <w:tcPr>
-            <w:tcW w:w="2160" w:type="dxa"/>
-            <w:gridSpan w:val="2"/>
-            <w:shd w:val="clear" w:color="auto" w:fill="auto"/>
-            <w:vAlign w:val="center"/>
-          </w:tcPr>
-          <w:p>
-            <w:pPr>
-              <w:rPr>
-                <w:b/>
-              </w:rPr>
-            </w:pPr>
-            <w:r>
-              <w:rPr>
-                <w:b/>
-              </w:rPr>
-              <w:t>State/Province</w:t>
-            </w:r>
-          </w:p>
-        </w:tc>
-        <w:tc>
-          <w:tcPr>
-            <w:tcW w:w="3288" w:type="dxa"/>
-            <w:gridSpan w:val="3"/>
-            <w:shd w:val="clear" w:color="auto" w:fill="auto"/>
-            <w:vAlign w:val="center"/>
-          </w:tcPr>
-          <w:p>
-            <w:r>
-              <w:t>&lt;&lt;applicantState&gt;&gt;</w:t>
-            </w:r>
-          </w:p>
-        </w:tc>
-      </w:tr>
-      <w:tr>
-        <w:trPr>
-          <w:trHeight w:val="360"/>
-          <w:jc w:val="center"/>
-        </w:trPr>
-        <w:tc>
-          <w:tcPr>
-            <w:tcW w:w="2254" w:type="dxa"/>
-            <w:gridSpan w:val="2"/>
-            <w:vAlign w:val="center"/>
-          </w:tcPr>
-          <w:p>
-            <w:pPr>
-              <w:rPr>
-                <w:b/>
-              </w:rPr>
-            </w:pPr>
-            <w:r>
-              <w:rPr>
-                <w:b/>
-              </w:rPr>
-              <w:t>Country</w:t>
-            </w:r>
-          </w:p>
-        </w:tc>
-        <w:tc>
-          <w:tcPr>
-            <w:tcW w:w="3114" w:type="dxa"/>
-            <w:gridSpan w:val="4"/>
-            <w:vAlign w:val="center"/>
-          </w:tcPr>
-          <w:p>
-            <w:r>
-              <w:t>&lt;&lt;applicantCountry&gt;&gt;</w:t>
-            </w:r>
-          </w:p>
-        </w:tc>
-        <w:tc>
-          <w:tcPr>
-            <w:tcW w:w="2160" w:type="dxa"/>
-            <w:gridSpan w:val="2"/>
-            <w:vAlign w:val="center"/>
-          </w:tcPr>
-          <w:p>
-            <w:pPr>
-              <w:rPr>
-                <w:b/>
-              </w:rPr>
-            </w:pPr>
-            <w:r>
-              <w:rPr>
-                <w:b/>
-              </w:rPr>
-              <w:t>Postal Code</w:t>
-            </w:r>
-          </w:p>
-        </w:tc>
-        <w:tc>
-          <w:tcPr>
-            <w:tcW w:w="3288" w:type="dxa"/>
-            <w:gridSpan w:val="3"/>
-            <w:vAlign w:val="center"/>
-          </w:tcPr>
-          <w:p>
-            <w:r>
-              <w:t>&lt;&lt;applicantZip&gt;&gt;</w:t>
-            </w:r>
-          </w:p>
-        </w:tc>
-      </w:tr>
-      <w:tr>
-        <w:trPr>
-          <w:trHeight w:val="360"/>
-          <w:jc w:val="center"/>
-        </w:trPr>
-        <w:tc>
-          <w:tcPr>
-            <w:tcW w:w="2254" w:type="dxa"/>
-            <w:gridSpan w:val="2"/>
-            <w:vAlign w:val="center"/>
-          </w:tcPr>
-          <w:p>
-            <w:r>
-              <w:t>Phone Number</w:t>
-            </w:r>
-          </w:p>
-        </w:tc>
-        <w:tc>
-          <w:tcPr>
-            <w:tcW w:w="3114" w:type="dxa"/>
-            <w:gridSpan w:val="4"/>
-            <w:vAlign w:val="center"/>
-          </w:tcPr>
-          <w:p/>
-        </w:tc>
-        <w:tc>
-          <w:tcPr>
-            <w:tcW w:w="2160" w:type="dxa"/>
-            <w:gridSpan w:val="2"/>
-            <w:vAlign w:val="center"/>
-          </w:tcPr>
-          <w:p/>
-        </w:tc>
-        <w:tc>
-          <w:tcPr>
-            <w:tcW w:w="3288" w:type="dxa"/>
-            <w:gridSpan w:val="3"/>
-            <w:vAlign w:val="center"/>
-          </w:tcPr>
-          <w:p/>
-        </w:tc>
-      </w:tr>
-      <w:tr>
-        <w:trPr>
-          <w:trHeight w:val="360"/>
-          <w:jc w:val="center"/>
-        </w:trPr>
-        <w:tc>
-          <w:tcPr>
-            <w:tcW w:w="2254" w:type="dxa"/>
-            <w:gridSpan w:val="2"/>
-            <w:vAlign w:val="center"/>
-          </w:tcPr>
-          <w:p>
-            <w:r>
-              <w:t>Email Address</w:t>
-            </w:r>
-          </w:p>
-        </w:tc>
-        <w:tc>
-          <w:tcPr>
-            <w:tcW w:w="3114" w:type="dxa"/>
-            <w:gridSpan w:val="4"/>
-            <w:vAlign w:val="center"/>
-          </w:tcPr>
-          <w:p/>
-        </w:tc>
-        <w:tc>
-          <w:tcPr>
-            <w:tcW w:w="2160" w:type="dxa"/>
-            <w:gridSpan w:val="2"/>
-            <w:vAlign w:val="center"/>
-          </w:tcPr>
-          <w:p/>
-        </w:tc>
-        <w:tc>
-          <w:tcPr>
-            <w:tcW w:w="3288" w:type="dxa"/>
-            <w:gridSpan w:val="3"/>
-            <w:vAlign w:val="center"/>
-          </w:tcPr>
-          <w:p/>
-        </w:tc>
-      </w:tr>
-    </w:tbl>
-    <w:p>
-      <w:pPr>
-        <w:spacing w:after="0" w:line="120" w:lineRule="auto"/>
-      </w:pPr>
-    </w:p>
-    <w:p>
-      <w:pPr>
-        <w:widowControl/>
-        <w:rPr>
-          <w:b/>
-          <w:sz w:val="28"/>
-          <w:szCs w:val="28"/>
-        </w:rPr>
-      </w:pPr>
-      <w:r>
-        <w:rPr>
-          <w:b/>
-          <w:sz w:val="28"/>
-          <w:szCs w:val="28"/>
-        </w:rPr>
-        <w:br w:type="page"/>
-      </w:r>
-    </w:p>
-    <w:p>
-      <w:pPr>
-        <w:spacing w:after="0" w:line="240" w:lineRule="auto"/>
-        <w:ind w:left="144"/>
-        <w:rPr>
-          <w:rFonts w:cstheme="minorHAnsi"/>
-          <w:b/>
-          <w:sz w:val="28"/>
-          <w:szCs w:val="28"/>
-        </w:rPr>
-      </w:pPr>
-      <w:r>
-        <w:rPr>
-          <w:b/>
-          <w:sz w:val="28"/>
-          <w:szCs w:val="28"/>
-        </w:rPr>
-        <w:lastRenderedPageBreak/>
-        <w:t xml:space="preserve">Assignee Information including </w:t>
-      </w:r>
-      <w:r>
-        <w:rPr>
-          <w:b/>
-          <w:sz w:val="28"/>
-          <w:szCs w:val="28"/>
-        </w:rPr>
-        <w:t xml:space="preserve">Non-Applicant </w:t>
-      </w:r>
-      <w:r>
-        <w:rPr>
-          <w:b/>
-          <w:sz w:val="28"/>
-          <w:szCs w:val="28"/>
-        </w:rPr>
-        <w:t>Assignee</w:t>
-      </w:r>
-      <w:r>
-        <w:rPr>
-          <w:b/>
-          <w:sz w:val="28"/>
-          <w:szCs w:val="28"/>
-        </w:rPr>
-        <w:t xml:space="preserve"> Information:</w:t>
-      </w:r>
-    </w:p>
-    <w:tbl>
-      <w:tblPr>
-        <w:tblW w:w="0" w:type="auto"/>
-        <w:tblInd w:w="93" w:type="dxa"/>
-        <w:tblLayout w:type="fixed"/>
-        <w:tblCellMar>
-          <w:left w:w="0" w:type="dxa"/>
-          <w:right w:w="0" w:type="dxa"/>
-        </w:tblCellMar>
-        <w:tblLook w:val="01E0" w:firstRow="1" w:lastRow="1" w:firstColumn="1" w:lastColumn="1" w:noHBand="0" w:noVBand="0"/>
-      </w:tblPr>
-      <w:tblGrid>
-        <w:gridCol w:w="2164"/>
-        <w:gridCol w:w="2164"/>
-        <w:gridCol w:w="1272"/>
-        <w:gridCol w:w="888"/>
-        <w:gridCol w:w="1078"/>
-        <w:gridCol w:w="1082"/>
-        <w:gridCol w:w="2242"/>
-      </w:tblGrid>
-      <w:tr>
-        <w:trPr>
-          <w:trHeight w:hRule="exact" w:val="571"/>
-        </w:trPr>
-        <w:tc>
-          <w:tcPr>
-            <w:tcW w:w="10890" w:type="dxa"/>
-            <w:gridSpan w:val="7"/>
-            <w:tcBorders>
-              <w:top w:val="single" w:sz="2" w:space="0" w:color="000000"/>
-              <w:left w:val="single" w:sz="2" w:space="0" w:color="000000"/>
-              <w:bottom w:val="single" w:sz="2" w:space="0" w:color="000000"/>
-              <w:right w:val="single" w:sz="2" w:space="0" w:color="000000"/>
-            </w:tcBorders>
-          </w:tcPr>
-          <w:p>
-            <w:pPr>
-              <w:spacing w:before="45" w:after="0" w:line="240" w:lineRule="auto"/>
-              <w:ind w:left="144" w:right="144"/>
-              <w:rPr>
-                <w:rFonts w:eastAsia="Arial" w:cstheme="minorHAnsi"/>
-                <w:b/>
-                <w:color w:val="010101"/>
-                <w:w w:val="106"/>
-              </w:rPr>
-            </w:pPr>
-            <w:r>
-              <w:rPr>
-                <w:rFonts w:cstheme="minorHAnsi"/>
-                <w:b/>
-                <w:sz w:val="20"/>
-                <w:szCs w:val="20"/>
-              </w:rPr>
-              <w:t>Providing assignment information in this section does not substitute for compliance with any requirement of part 3 of Title 37 of CFR to have an assignment recorded by the Office.</w:t>
-            </w:r>
-          </w:p>
-        </w:tc>
-      </w:tr>
-      <w:tr>
-        <w:trPr>
-          <w:trHeight w:hRule="exact" w:val="544"/>
-        </w:trPr>
-        <w:tc>
-          <w:tcPr>
-            <w:tcW w:w="10890" w:type="dxa"/>
-            <w:gridSpan w:val="7"/>
-            <w:tcBorders>
-              <w:top w:val="single" w:sz="2" w:space="0" w:color="000000"/>
-              <w:left w:val="single" w:sz="2" w:space="0" w:color="000000"/>
-              <w:bottom w:val="single" w:sz="2" w:space="0" w:color="000000"/>
-              <w:right w:val="single" w:sz="2" w:space="0" w:color="000000"/>
-            </w:tcBorders>
-            <w:vAlign w:val="center"/>
-          </w:tcPr>
-          <w:p>
-            <w:pPr>
-              <w:spacing w:after="0" w:line="240" w:lineRule="auto"/>
-              <w:ind w:left="144" w:right="-14"/>
-              <w:rPr>
-                <w:rFonts w:eastAsia="Arial" w:cstheme="minorHAnsi"/>
-                <w:color w:val="010101"/>
-                <w:w w:val="106"/>
-              </w:rPr>
-            </w:pPr>
-            <w:r>
-              <w:rPr>
-                <w:b/>
-              </w:rPr>
-              <w:t>&lt;&lt;assigneeCnt&gt;</w:t>
-            </w:r>
-            <w:proofErr w:type="gramStart"/>
-            <w:r>
-              <w:rPr>
-                <w:b/>
-              </w:rPr>
-              <w:t>&gt;</w:t>
-            </w:r>
-            <w:r>
-              <w:t xml:space="preserve">  </w:t>
-            </w:r>
-            <w:r>
-              <w:t>&lt;</w:t>
-            </w:r>
-            <w:proofErr w:type="gramEnd"/>
-            <w:r>
-              <w:t>&lt;assignee&gt;&gt;</w:t>
-            </w:r>
-          </w:p>
-        </w:tc>
-      </w:tr>
-      <w:tr>
-        <w:trPr>
-          <w:trHeight w:hRule="exact" w:val="934"/>
-        </w:trPr>
-        <w:tc>
-          <w:tcPr>
-            <w:tcW w:w="10890" w:type="dxa"/>
-            <w:gridSpan w:val="7"/>
-            <w:tcBorders>
-              <w:top w:val="single" w:sz="2" w:space="0" w:color="000000"/>
-              <w:left w:val="single" w:sz="2" w:space="0" w:color="000000"/>
-              <w:bottom w:val="single" w:sz="2" w:space="0" w:color="000000"/>
-              <w:right w:val="single" w:sz="2" w:space="0" w:color="000000"/>
-            </w:tcBorders>
-            <w:vAlign w:val="center"/>
-          </w:tcPr>
-          <w:p>
-            <w:pPr>
-              <w:widowControl/>
-              <w:autoSpaceDE w:val="0"/>
-              <w:autoSpaceDN w:val="0"/>
-              <w:adjustRightInd w:val="0"/>
-              <w:spacing w:after="0" w:line="174" w:lineRule="exact"/>
-              <w:ind w:left="40" w:right="-20"/>
-              <w:rPr>
-                <w:rFonts w:cs="Arial"/>
-                <w:color w:val="010101"/>
-                <w:sz w:val="20"/>
-                <w:szCs w:val="20"/>
-              </w:rPr>
-            </w:pPr>
-          </w:p>
-          <w:p>
-            <w:pPr>
-              <w:widowControl/>
-              <w:autoSpaceDE w:val="0"/>
-              <w:autoSpaceDN w:val="0"/>
-              <w:adjustRightInd w:val="0"/>
-              <w:spacing w:after="0" w:line="174" w:lineRule="exact"/>
-              <w:ind w:left="40" w:right="-20"/>
-              <w:rPr>
-                <w:rFonts w:cs="Arial"/>
-                <w:b/>
-                <w:color w:val="000000"/>
-                <w:sz w:val="20"/>
-                <w:szCs w:val="20"/>
-              </w:rPr>
-            </w:pPr>
-            <w:r>
-              <w:rPr>
-                <w:rFonts w:cs="Arial"/>
-                <w:b/>
-                <w:color w:val="010101"/>
-                <w:sz w:val="20"/>
-                <w:szCs w:val="20"/>
-              </w:rPr>
-              <w:t>Complete</w:t>
-            </w:r>
-            <w:r>
-              <w:rPr>
-                <w:rFonts w:cs="Arial"/>
-                <w:b/>
-                <w:color w:val="010101"/>
-                <w:spacing w:val="44"/>
-                <w:sz w:val="20"/>
-                <w:szCs w:val="20"/>
-              </w:rPr>
-              <w:t xml:space="preserve"> </w:t>
-            </w:r>
-            <w:r>
-              <w:rPr>
-                <w:rFonts w:cs="Arial"/>
-                <w:b/>
-                <w:color w:val="010101"/>
-                <w:sz w:val="20"/>
-                <w:szCs w:val="20"/>
-              </w:rPr>
-              <w:t>this</w:t>
-            </w:r>
-            <w:r>
-              <w:rPr>
-                <w:rFonts w:cs="Arial"/>
-                <w:b/>
-                <w:color w:val="010101"/>
-                <w:spacing w:val="13"/>
-                <w:sz w:val="20"/>
-                <w:szCs w:val="20"/>
-              </w:rPr>
-              <w:t xml:space="preserve"> </w:t>
-            </w:r>
-            <w:r>
-              <w:rPr>
-                <w:rFonts w:cs="Arial"/>
-                <w:b/>
-                <w:color w:val="010101"/>
-                <w:sz w:val="20"/>
-                <w:szCs w:val="20"/>
-              </w:rPr>
-              <w:t>section</w:t>
-            </w:r>
-            <w:r>
-              <w:rPr>
-                <w:rFonts w:cs="Arial"/>
-                <w:b/>
-                <w:color w:val="010101"/>
-                <w:spacing w:val="34"/>
-                <w:sz w:val="20"/>
-                <w:szCs w:val="20"/>
-              </w:rPr>
-              <w:t xml:space="preserve"> </w:t>
-            </w:r>
-            <w:r>
-              <w:rPr>
-                <w:rFonts w:cs="Arial"/>
-                <w:b/>
-                <w:color w:val="010101"/>
-                <w:sz w:val="20"/>
-                <w:szCs w:val="20"/>
-              </w:rPr>
-              <w:t>if</w:t>
-            </w:r>
-            <w:r>
-              <w:rPr>
-                <w:rFonts w:cs="Arial"/>
-                <w:b/>
-                <w:color w:val="010101"/>
-                <w:spacing w:val="2"/>
-                <w:sz w:val="20"/>
-                <w:szCs w:val="20"/>
-              </w:rPr>
-              <w:t xml:space="preserve"> </w:t>
-            </w:r>
-            <w:r>
-              <w:rPr>
-                <w:rFonts w:cs="Arial"/>
-                <w:b/>
-                <w:color w:val="010101"/>
-                <w:sz w:val="20"/>
-                <w:szCs w:val="20"/>
-              </w:rPr>
-              <w:t>assignee</w:t>
-            </w:r>
-            <w:r>
-              <w:rPr>
-                <w:rFonts w:cs="Arial"/>
-                <w:b/>
-                <w:color w:val="010101"/>
-                <w:spacing w:val="46"/>
-                <w:sz w:val="20"/>
-                <w:szCs w:val="20"/>
-              </w:rPr>
-              <w:t xml:space="preserve"> </w:t>
-            </w:r>
-            <w:r>
-              <w:rPr>
-                <w:rFonts w:cs="Arial"/>
-                <w:b/>
-                <w:color w:val="010101"/>
-                <w:sz w:val="20"/>
-                <w:szCs w:val="20"/>
-              </w:rPr>
-              <w:t>information, including</w:t>
-            </w:r>
-            <w:r>
-              <w:rPr>
-                <w:rFonts w:cs="Arial"/>
-                <w:b/>
-                <w:color w:val="010101"/>
-                <w:spacing w:val="2"/>
-                <w:sz w:val="20"/>
-                <w:szCs w:val="20"/>
-              </w:rPr>
-              <w:t xml:space="preserve"> </w:t>
-            </w:r>
-            <w:r>
-              <w:rPr>
-                <w:rFonts w:cs="Arial"/>
-                <w:b/>
-                <w:color w:val="010101"/>
-                <w:w w:val="105"/>
-                <w:sz w:val="20"/>
-                <w:szCs w:val="20"/>
-              </w:rPr>
-              <w:t>non-applicant</w:t>
-            </w:r>
-            <w:r>
-              <w:rPr>
-                <w:rFonts w:cs="Arial"/>
-                <w:b/>
-                <w:color w:val="010101"/>
-                <w:spacing w:val="8"/>
-                <w:w w:val="105"/>
-                <w:sz w:val="20"/>
-                <w:szCs w:val="20"/>
-              </w:rPr>
-              <w:t xml:space="preserve"> </w:t>
-            </w:r>
-            <w:r>
-              <w:rPr>
-                <w:rFonts w:cs="Arial"/>
-                <w:b/>
-                <w:color w:val="010101"/>
-                <w:sz w:val="20"/>
-                <w:szCs w:val="20"/>
-              </w:rPr>
-              <w:t>assignee</w:t>
-            </w:r>
-            <w:r>
-              <w:rPr>
-                <w:rFonts w:cs="Arial"/>
-                <w:b/>
-                <w:color w:val="010101"/>
-                <w:spacing w:val="46"/>
-                <w:sz w:val="20"/>
-                <w:szCs w:val="20"/>
-              </w:rPr>
-              <w:t xml:space="preserve"> </w:t>
-            </w:r>
-            <w:r>
-              <w:rPr>
-                <w:rFonts w:cs="Arial"/>
-                <w:b/>
-                <w:color w:val="010101"/>
-                <w:sz w:val="20"/>
-                <w:szCs w:val="20"/>
-              </w:rPr>
-              <w:t>information,</w:t>
-            </w:r>
-            <w:r>
-              <w:rPr>
-                <w:rFonts w:cs="Arial"/>
-                <w:b/>
-                <w:color w:val="010101"/>
-                <w:spacing w:val="27"/>
-                <w:sz w:val="20"/>
-                <w:szCs w:val="20"/>
-              </w:rPr>
-              <w:t xml:space="preserve"> </w:t>
-            </w:r>
-            <w:r>
-              <w:rPr>
-                <w:rFonts w:cs="Arial"/>
-                <w:b/>
-                <w:color w:val="010101"/>
-                <w:sz w:val="20"/>
-                <w:szCs w:val="20"/>
-              </w:rPr>
-              <w:t>is</w:t>
-            </w:r>
-            <w:r>
-              <w:rPr>
-                <w:rFonts w:cs="Arial"/>
-                <w:b/>
-                <w:color w:val="010101"/>
-                <w:spacing w:val="11"/>
-                <w:sz w:val="20"/>
-                <w:szCs w:val="20"/>
-              </w:rPr>
-              <w:t xml:space="preserve"> </w:t>
-            </w:r>
-            <w:r>
-              <w:rPr>
-                <w:rFonts w:cs="Arial"/>
-                <w:b/>
-                <w:color w:val="010101"/>
-                <w:sz w:val="20"/>
-                <w:szCs w:val="20"/>
-              </w:rPr>
-              <w:t>desired</w:t>
-            </w:r>
-            <w:r>
-              <w:rPr>
-                <w:rFonts w:cs="Arial"/>
-                <w:b/>
-                <w:color w:val="010101"/>
-                <w:spacing w:val="32"/>
-                <w:sz w:val="20"/>
-                <w:szCs w:val="20"/>
-              </w:rPr>
-              <w:t xml:space="preserve"> </w:t>
-            </w:r>
-            <w:r>
-              <w:rPr>
-                <w:rFonts w:cs="Arial"/>
-                <w:b/>
-                <w:color w:val="010101"/>
-                <w:sz w:val="20"/>
-                <w:szCs w:val="20"/>
-              </w:rPr>
-              <w:t>to</w:t>
-            </w:r>
-            <w:r>
-              <w:rPr>
-                <w:rFonts w:cs="Arial"/>
-                <w:b/>
-                <w:color w:val="010101"/>
-                <w:spacing w:val="18"/>
-                <w:sz w:val="20"/>
-                <w:szCs w:val="20"/>
-              </w:rPr>
-              <w:t xml:space="preserve"> </w:t>
-            </w:r>
-            <w:r>
-              <w:rPr>
-                <w:rFonts w:cs="Arial"/>
-                <w:b/>
-                <w:color w:val="010101"/>
-                <w:sz w:val="20"/>
-                <w:szCs w:val="20"/>
-              </w:rPr>
-              <w:t>be</w:t>
-            </w:r>
-            <w:r>
-              <w:rPr>
-                <w:rFonts w:cs="Arial"/>
-                <w:b/>
-                <w:color w:val="010101"/>
-                <w:spacing w:val="24"/>
-                <w:sz w:val="20"/>
-                <w:szCs w:val="20"/>
-              </w:rPr>
-              <w:t xml:space="preserve"> </w:t>
-            </w:r>
-            <w:r>
-              <w:rPr>
-                <w:rFonts w:cs="Arial"/>
-                <w:b/>
-                <w:color w:val="010101"/>
-                <w:sz w:val="20"/>
-                <w:szCs w:val="20"/>
-              </w:rPr>
-              <w:t>included</w:t>
-            </w:r>
-            <w:r>
-              <w:rPr>
-                <w:rFonts w:cs="Arial"/>
-                <w:b/>
-                <w:color w:val="010101"/>
-                <w:spacing w:val="30"/>
-                <w:sz w:val="20"/>
-                <w:szCs w:val="20"/>
-              </w:rPr>
-              <w:t xml:space="preserve"> </w:t>
-            </w:r>
-            <w:r>
-              <w:rPr>
-                <w:rFonts w:cs="Arial"/>
-                <w:b/>
-                <w:color w:val="010101"/>
-                <w:sz w:val="20"/>
-                <w:szCs w:val="20"/>
-              </w:rPr>
-              <w:t>on</w:t>
-            </w:r>
-            <w:r>
-              <w:rPr>
-                <w:rFonts w:cs="Arial"/>
-                <w:b/>
-                <w:color w:val="010101"/>
-                <w:spacing w:val="12"/>
-                <w:sz w:val="20"/>
-                <w:szCs w:val="20"/>
-              </w:rPr>
-              <w:t xml:space="preserve"> </w:t>
-            </w:r>
-            <w:r>
-              <w:rPr>
-                <w:rFonts w:cs="Arial"/>
-                <w:b/>
-                <w:color w:val="010101"/>
-                <w:sz w:val="20"/>
-                <w:szCs w:val="20"/>
-              </w:rPr>
-              <w:t>the</w:t>
-            </w:r>
-            <w:r>
-              <w:rPr>
-                <w:rFonts w:cs="Arial"/>
-                <w:b/>
-                <w:color w:val="010101"/>
-                <w:spacing w:val="22"/>
-                <w:sz w:val="20"/>
-                <w:szCs w:val="20"/>
-              </w:rPr>
-              <w:t xml:space="preserve"> </w:t>
-            </w:r>
-            <w:r>
-              <w:rPr>
-                <w:rFonts w:cs="Arial"/>
-                <w:b/>
-                <w:color w:val="010101"/>
-                <w:w w:val="106"/>
-                <w:sz w:val="20"/>
-                <w:szCs w:val="20"/>
-              </w:rPr>
-              <w:t>patent</w:t>
-            </w:r>
-            <w:r>
-              <w:rPr>
-                <w:rFonts w:cs="Arial"/>
-                <w:b/>
-                <w:color w:val="000000"/>
-                <w:sz w:val="20"/>
-                <w:szCs w:val="20"/>
-              </w:rPr>
-              <w:t xml:space="preserve"> </w:t>
-            </w:r>
-            <w:r>
-              <w:rPr>
-                <w:rFonts w:cs="Arial"/>
-                <w:b/>
-                <w:color w:val="010101"/>
-                <w:sz w:val="20"/>
-                <w:szCs w:val="20"/>
-              </w:rPr>
-              <w:t>application publication</w:t>
-            </w:r>
-            <w:r>
-              <w:rPr>
-                <w:rFonts w:cs="Arial"/>
-                <w:b/>
-                <w:color w:val="010101"/>
-                <w:w w:val="126"/>
-                <w:sz w:val="20"/>
-                <w:szCs w:val="20"/>
-              </w:rPr>
-              <w:t>.</w:t>
-            </w:r>
-            <w:r>
-              <w:rPr>
-                <w:rFonts w:cs="Arial"/>
-                <w:b/>
-                <w:color w:val="010101"/>
-                <w:spacing w:val="-3"/>
-                <w:w w:val="126"/>
-                <w:sz w:val="20"/>
-                <w:szCs w:val="20"/>
-              </w:rPr>
-              <w:t xml:space="preserve"> </w:t>
-            </w:r>
-            <w:r>
-              <w:rPr>
-                <w:rFonts w:cs="Arial"/>
-                <w:b/>
-                <w:color w:val="010101"/>
-                <w:sz w:val="20"/>
-                <w:szCs w:val="20"/>
-              </w:rPr>
-              <w:t>An</w:t>
-            </w:r>
-            <w:r>
-              <w:rPr>
-                <w:rFonts w:cs="Arial"/>
-                <w:b/>
-                <w:color w:val="010101"/>
-                <w:spacing w:val="-6"/>
-                <w:sz w:val="20"/>
-                <w:szCs w:val="20"/>
-              </w:rPr>
-              <w:t xml:space="preserve"> </w:t>
-            </w:r>
-            <w:r>
-              <w:rPr>
-                <w:rFonts w:cs="Arial"/>
-                <w:b/>
-                <w:color w:val="010101"/>
-                <w:w w:val="106"/>
-                <w:sz w:val="20"/>
-                <w:szCs w:val="20"/>
-              </w:rPr>
-              <w:t>assignee-applicant</w:t>
-            </w:r>
-            <w:r>
-              <w:rPr>
-                <w:rFonts w:cs="Arial"/>
-                <w:b/>
-                <w:color w:val="010101"/>
-                <w:spacing w:val="15"/>
-                <w:w w:val="106"/>
-                <w:sz w:val="20"/>
-                <w:szCs w:val="20"/>
-              </w:rPr>
-              <w:t xml:space="preserve"> </w:t>
-            </w:r>
-            <w:r>
-              <w:rPr>
-                <w:rFonts w:cs="Arial"/>
-                <w:b/>
-                <w:color w:val="010101"/>
-                <w:sz w:val="20"/>
-                <w:szCs w:val="20"/>
-              </w:rPr>
-              <w:t>identified</w:t>
-            </w:r>
-            <w:r>
-              <w:rPr>
-                <w:rFonts w:cs="Arial"/>
-                <w:b/>
-                <w:color w:val="010101"/>
-                <w:spacing w:val="27"/>
-                <w:sz w:val="20"/>
-                <w:szCs w:val="20"/>
-              </w:rPr>
-              <w:t xml:space="preserve"> </w:t>
-            </w:r>
-            <w:r>
-              <w:rPr>
-                <w:rFonts w:cs="Arial"/>
-                <w:b/>
-                <w:color w:val="010101"/>
-                <w:sz w:val="20"/>
-                <w:szCs w:val="20"/>
-              </w:rPr>
-              <w:t>in</w:t>
-            </w:r>
-            <w:r>
-              <w:rPr>
-                <w:rFonts w:cs="Arial"/>
-                <w:b/>
-                <w:color w:val="010101"/>
-                <w:spacing w:val="2"/>
-                <w:sz w:val="20"/>
-                <w:szCs w:val="20"/>
-              </w:rPr>
-              <w:t xml:space="preserve"> </w:t>
-            </w:r>
-            <w:r>
-              <w:rPr>
-                <w:rFonts w:cs="Arial"/>
-                <w:b/>
-                <w:color w:val="010101"/>
-                <w:sz w:val="20"/>
-                <w:szCs w:val="20"/>
-              </w:rPr>
-              <w:t>the</w:t>
-            </w:r>
-            <w:r>
-              <w:rPr>
-                <w:rFonts w:cs="Arial"/>
-                <w:b/>
-                <w:color w:val="010101"/>
-                <w:sz w:val="20"/>
-                <w:szCs w:val="20"/>
-              </w:rPr>
-              <w:t xml:space="preserve"> </w:t>
-            </w:r>
-            <w:r>
-              <w:rPr>
-                <w:rFonts w:cs="Arial"/>
-                <w:b/>
-                <w:color w:val="010101"/>
-                <w:sz w:val="20"/>
-                <w:szCs w:val="20"/>
-              </w:rPr>
-              <w:t>"Applicant</w:t>
-            </w:r>
-            <w:r>
-              <w:rPr>
-                <w:rFonts w:cs="Arial"/>
-                <w:b/>
-                <w:color w:val="010101"/>
-                <w:spacing w:val="46"/>
-                <w:sz w:val="20"/>
-                <w:szCs w:val="20"/>
-              </w:rPr>
-              <w:t xml:space="preserve"> </w:t>
-            </w:r>
-            <w:r>
-              <w:rPr>
-                <w:rFonts w:cs="Arial"/>
-                <w:b/>
-                <w:color w:val="010101"/>
-                <w:sz w:val="20"/>
-                <w:szCs w:val="20"/>
-              </w:rPr>
-              <w:t>Information"</w:t>
-            </w:r>
-            <w:r>
-              <w:rPr>
-                <w:rFonts w:cs="Arial"/>
-                <w:b/>
-                <w:color w:val="010101"/>
-                <w:spacing w:val="34"/>
-                <w:sz w:val="20"/>
-                <w:szCs w:val="20"/>
-              </w:rPr>
-              <w:t xml:space="preserve"> </w:t>
-            </w:r>
-            <w:r>
-              <w:rPr>
-                <w:rFonts w:cs="Arial"/>
-                <w:b/>
-                <w:color w:val="010101"/>
-                <w:sz w:val="20"/>
-                <w:szCs w:val="20"/>
-              </w:rPr>
-              <w:t>section</w:t>
-            </w:r>
-            <w:r>
-              <w:rPr>
-                <w:rFonts w:cs="Arial"/>
-                <w:b/>
-                <w:color w:val="010101"/>
-                <w:spacing w:val="37"/>
-                <w:sz w:val="20"/>
-                <w:szCs w:val="20"/>
-              </w:rPr>
-              <w:t xml:space="preserve"> </w:t>
-            </w:r>
-            <w:r>
-              <w:rPr>
-                <w:rFonts w:cs="Arial"/>
-                <w:b/>
-                <w:color w:val="010101"/>
-                <w:sz w:val="20"/>
-                <w:szCs w:val="20"/>
-              </w:rPr>
-              <w:t>will</w:t>
-            </w:r>
-            <w:r>
-              <w:rPr>
-                <w:rFonts w:cs="Arial"/>
-                <w:b/>
-                <w:color w:val="010101"/>
-                <w:spacing w:val="3"/>
-                <w:sz w:val="20"/>
-                <w:szCs w:val="20"/>
-              </w:rPr>
-              <w:t xml:space="preserve"> </w:t>
-            </w:r>
-            <w:r>
-              <w:rPr>
-                <w:rFonts w:cs="Arial"/>
-                <w:b/>
-                <w:color w:val="010101"/>
-                <w:sz w:val="20"/>
-                <w:szCs w:val="20"/>
-              </w:rPr>
-              <w:t>appear</w:t>
-            </w:r>
-            <w:r>
-              <w:rPr>
-                <w:rFonts w:cs="Arial"/>
-                <w:b/>
-                <w:color w:val="010101"/>
-                <w:spacing w:val="45"/>
-                <w:sz w:val="20"/>
-                <w:szCs w:val="20"/>
-              </w:rPr>
-              <w:t xml:space="preserve"> </w:t>
-            </w:r>
-            <w:r>
-              <w:rPr>
-                <w:rFonts w:cs="Arial"/>
-                <w:b/>
-                <w:color w:val="010101"/>
-                <w:sz w:val="20"/>
-                <w:szCs w:val="20"/>
-              </w:rPr>
-              <w:t>on</w:t>
-            </w:r>
-            <w:r>
-              <w:rPr>
-                <w:rFonts w:cs="Arial"/>
-                <w:b/>
-                <w:color w:val="010101"/>
-                <w:spacing w:val="9"/>
-                <w:sz w:val="20"/>
-                <w:szCs w:val="20"/>
-              </w:rPr>
-              <w:t xml:space="preserve"> </w:t>
-            </w:r>
-            <w:r>
-              <w:rPr>
-                <w:rFonts w:cs="Arial"/>
-                <w:b/>
-                <w:color w:val="010101"/>
-                <w:sz w:val="20"/>
-                <w:szCs w:val="20"/>
-              </w:rPr>
-              <w:t>the</w:t>
-            </w:r>
-            <w:r>
-              <w:rPr>
-                <w:rFonts w:cs="Arial"/>
-                <w:b/>
-                <w:color w:val="010101"/>
-                <w:spacing w:val="8"/>
-                <w:sz w:val="20"/>
-                <w:szCs w:val="20"/>
-              </w:rPr>
-              <w:t xml:space="preserve"> </w:t>
-            </w:r>
-            <w:r>
-              <w:rPr>
-                <w:rFonts w:cs="Arial"/>
-                <w:b/>
-                <w:color w:val="010101"/>
-                <w:sz w:val="20"/>
-                <w:szCs w:val="20"/>
-              </w:rPr>
-              <w:t>patent</w:t>
-            </w:r>
-            <w:r>
-              <w:rPr>
-                <w:rFonts w:cs="Arial"/>
-                <w:b/>
-                <w:color w:val="010101"/>
-                <w:spacing w:val="28"/>
-                <w:sz w:val="20"/>
-                <w:szCs w:val="20"/>
-              </w:rPr>
-              <w:t xml:space="preserve"> </w:t>
-            </w:r>
-            <w:r>
-              <w:rPr>
-                <w:rFonts w:cs="Arial"/>
-                <w:b/>
-                <w:color w:val="010101"/>
-                <w:w w:val="106"/>
-                <w:sz w:val="20"/>
-                <w:szCs w:val="20"/>
-              </w:rPr>
-              <w:t xml:space="preserve">application </w:t>
-            </w:r>
-            <w:r>
-              <w:rPr>
-                <w:rFonts w:cs="Arial"/>
-                <w:b/>
-                <w:color w:val="010101"/>
-                <w:sz w:val="20"/>
-                <w:szCs w:val="20"/>
-              </w:rPr>
-              <w:t>publication</w:t>
-            </w:r>
-            <w:r>
-              <w:rPr>
-                <w:rFonts w:cs="Arial"/>
-                <w:b/>
-                <w:color w:val="010101"/>
-                <w:spacing w:val="34"/>
-                <w:sz w:val="20"/>
-                <w:szCs w:val="20"/>
-              </w:rPr>
-              <w:t xml:space="preserve"> </w:t>
-            </w:r>
-            <w:r>
-              <w:rPr>
-                <w:rFonts w:cs="Arial"/>
-                <w:b/>
-                <w:color w:val="010101"/>
-                <w:sz w:val="20"/>
-                <w:szCs w:val="20"/>
-              </w:rPr>
-              <w:t>as</w:t>
-            </w:r>
-            <w:r>
-              <w:rPr>
-                <w:rFonts w:cs="Arial"/>
-                <w:b/>
-                <w:color w:val="010101"/>
-                <w:spacing w:val="18"/>
-                <w:sz w:val="20"/>
-                <w:szCs w:val="20"/>
-              </w:rPr>
-              <w:t xml:space="preserve"> </w:t>
-            </w:r>
-            <w:r>
-              <w:rPr>
-                <w:rFonts w:cs="Arial"/>
-                <w:b/>
-                <w:color w:val="010101"/>
-                <w:sz w:val="20"/>
-                <w:szCs w:val="20"/>
-              </w:rPr>
-              <w:t>an</w:t>
-            </w:r>
-            <w:r>
-              <w:rPr>
-                <w:rFonts w:cs="Arial"/>
-                <w:b/>
-                <w:color w:val="010101"/>
-                <w:spacing w:val="23"/>
-                <w:sz w:val="20"/>
-                <w:szCs w:val="20"/>
-              </w:rPr>
-              <w:t xml:space="preserve"> </w:t>
-            </w:r>
-            <w:r>
-              <w:rPr>
-                <w:rFonts w:cs="Arial"/>
-                <w:b/>
-                <w:color w:val="010101"/>
-                <w:sz w:val="20"/>
-                <w:szCs w:val="20"/>
-              </w:rPr>
-              <w:t>applicant.</w:t>
-            </w:r>
-            <w:r>
-              <w:rPr>
-                <w:rFonts w:cs="Arial"/>
-                <w:b/>
-                <w:color w:val="010101"/>
-                <w:spacing w:val="32"/>
-                <w:sz w:val="20"/>
-                <w:szCs w:val="20"/>
-              </w:rPr>
-              <w:t xml:space="preserve"> </w:t>
-            </w:r>
-            <w:r>
-              <w:rPr>
-                <w:rFonts w:cs="Arial"/>
-                <w:b/>
-                <w:color w:val="010101"/>
-                <w:sz w:val="20"/>
-                <w:szCs w:val="20"/>
-              </w:rPr>
-              <w:t>For</w:t>
-            </w:r>
-            <w:r>
-              <w:rPr>
-                <w:rFonts w:cs="Arial"/>
-                <w:b/>
-                <w:color w:val="010101"/>
-                <w:spacing w:val="24"/>
-                <w:sz w:val="20"/>
-                <w:szCs w:val="20"/>
-              </w:rPr>
-              <w:t xml:space="preserve"> </w:t>
-            </w:r>
-            <w:r>
-              <w:rPr>
-                <w:rFonts w:cs="Arial"/>
-                <w:b/>
-                <w:color w:val="010101"/>
-                <w:sz w:val="20"/>
-                <w:szCs w:val="20"/>
-              </w:rPr>
-              <w:t>an</w:t>
-            </w:r>
-            <w:r>
-              <w:rPr>
-                <w:rFonts w:cs="Arial"/>
-                <w:b/>
-                <w:color w:val="010101"/>
-                <w:spacing w:val="6"/>
-                <w:sz w:val="20"/>
-                <w:szCs w:val="20"/>
-              </w:rPr>
-              <w:t xml:space="preserve"> </w:t>
-            </w:r>
-            <w:r>
-              <w:rPr>
-                <w:rFonts w:cs="Arial"/>
-                <w:b/>
-                <w:color w:val="010101"/>
-                <w:w w:val="105"/>
-                <w:sz w:val="20"/>
-                <w:szCs w:val="20"/>
-              </w:rPr>
-              <w:t>assignee-applicant,</w:t>
-            </w:r>
-            <w:r>
-              <w:rPr>
-                <w:rFonts w:cs="Arial"/>
-                <w:b/>
-                <w:color w:val="010101"/>
-                <w:spacing w:val="7"/>
-                <w:w w:val="105"/>
-                <w:sz w:val="20"/>
-                <w:szCs w:val="20"/>
-              </w:rPr>
-              <w:t xml:space="preserve"> </w:t>
-            </w:r>
-            <w:r>
-              <w:rPr>
-                <w:rFonts w:cs="Arial"/>
-                <w:b/>
-                <w:color w:val="010101"/>
-                <w:sz w:val="20"/>
-                <w:szCs w:val="20"/>
-              </w:rPr>
-              <w:t>complete</w:t>
-            </w:r>
-            <w:r>
-              <w:rPr>
-                <w:rFonts w:cs="Arial"/>
-                <w:b/>
-                <w:color w:val="010101"/>
-                <w:spacing w:val="41"/>
-                <w:sz w:val="20"/>
-                <w:szCs w:val="20"/>
-              </w:rPr>
-              <w:t xml:space="preserve"> </w:t>
-            </w:r>
-            <w:r>
-              <w:rPr>
-                <w:rFonts w:cs="Arial"/>
-                <w:b/>
-                <w:color w:val="010101"/>
-                <w:sz w:val="20"/>
-                <w:szCs w:val="20"/>
-              </w:rPr>
-              <w:t>this</w:t>
-            </w:r>
-            <w:r>
-              <w:rPr>
-                <w:rFonts w:cs="Arial"/>
-                <w:b/>
-                <w:color w:val="010101"/>
-                <w:spacing w:val="16"/>
-                <w:sz w:val="20"/>
-                <w:szCs w:val="20"/>
-              </w:rPr>
-              <w:t xml:space="preserve"> </w:t>
-            </w:r>
-            <w:r>
-              <w:rPr>
-                <w:rFonts w:cs="Arial"/>
-                <w:b/>
-                <w:color w:val="010101"/>
-                <w:sz w:val="20"/>
-                <w:szCs w:val="20"/>
-              </w:rPr>
-              <w:t>section</w:t>
-            </w:r>
-            <w:r>
-              <w:rPr>
-                <w:rFonts w:cs="Arial"/>
-                <w:b/>
-                <w:color w:val="010101"/>
-                <w:spacing w:val="31"/>
-                <w:sz w:val="20"/>
-                <w:szCs w:val="20"/>
-              </w:rPr>
-              <w:t xml:space="preserve"> </w:t>
-            </w:r>
-            <w:r>
-              <w:rPr>
-                <w:rFonts w:cs="Arial"/>
-                <w:b/>
-                <w:color w:val="010101"/>
-                <w:sz w:val="20"/>
-                <w:szCs w:val="20"/>
-              </w:rPr>
-              <w:t>only</w:t>
-            </w:r>
-            <w:r>
-              <w:rPr>
-                <w:rFonts w:cs="Arial"/>
-                <w:b/>
-                <w:color w:val="010101"/>
-                <w:spacing w:val="25"/>
-                <w:sz w:val="20"/>
-                <w:szCs w:val="20"/>
-              </w:rPr>
-              <w:t xml:space="preserve"> </w:t>
-            </w:r>
-            <w:r>
-              <w:rPr>
-                <w:rFonts w:cs="Arial"/>
-                <w:b/>
-                <w:color w:val="010101"/>
-                <w:sz w:val="20"/>
-                <w:szCs w:val="20"/>
-              </w:rPr>
-              <w:t>if</w:t>
-            </w:r>
-            <w:r>
-              <w:rPr>
-                <w:rFonts w:cs="Arial"/>
-                <w:b/>
-                <w:color w:val="010101"/>
-                <w:spacing w:val="12"/>
-                <w:sz w:val="20"/>
-                <w:szCs w:val="20"/>
-              </w:rPr>
-              <w:t xml:space="preserve"> </w:t>
-            </w:r>
-            <w:r>
-              <w:rPr>
-                <w:rFonts w:cs="Arial"/>
-                <w:b/>
-                <w:color w:val="010101"/>
-                <w:sz w:val="20"/>
-                <w:szCs w:val="20"/>
-              </w:rPr>
-              <w:t>identification as</w:t>
-            </w:r>
-            <w:r>
-              <w:rPr>
-                <w:rFonts w:cs="Arial"/>
-                <w:b/>
-                <w:color w:val="010101"/>
-                <w:spacing w:val="4"/>
-                <w:sz w:val="20"/>
-                <w:szCs w:val="20"/>
-              </w:rPr>
-              <w:t xml:space="preserve"> </w:t>
-            </w:r>
-            <w:r>
-              <w:rPr>
-                <w:rFonts w:cs="Arial"/>
-                <w:b/>
-                <w:color w:val="010101"/>
-                <w:sz w:val="20"/>
-                <w:szCs w:val="20"/>
-              </w:rPr>
-              <w:t>an</w:t>
-            </w:r>
-            <w:r>
-              <w:rPr>
-                <w:rFonts w:cs="Arial"/>
-                <w:b/>
-                <w:color w:val="010101"/>
-                <w:spacing w:val="23"/>
-                <w:sz w:val="20"/>
-                <w:szCs w:val="20"/>
-              </w:rPr>
-              <w:t xml:space="preserve"> </w:t>
-            </w:r>
-            <w:r>
-              <w:rPr>
-                <w:rFonts w:cs="Arial"/>
-                <w:b/>
-                <w:color w:val="010101"/>
-                <w:sz w:val="20"/>
-                <w:szCs w:val="20"/>
-              </w:rPr>
-              <w:t>assignee</w:t>
-            </w:r>
-            <w:r>
-              <w:rPr>
-                <w:rFonts w:cs="Arial"/>
-                <w:b/>
-                <w:color w:val="010101"/>
-                <w:spacing w:val="46"/>
-                <w:sz w:val="20"/>
-                <w:szCs w:val="20"/>
-              </w:rPr>
-              <w:t xml:space="preserve"> </w:t>
-            </w:r>
-            <w:r>
-              <w:rPr>
-                <w:rFonts w:cs="Arial"/>
-                <w:b/>
-                <w:color w:val="010101"/>
-                <w:sz w:val="20"/>
-                <w:szCs w:val="20"/>
-              </w:rPr>
-              <w:t>is</w:t>
-            </w:r>
-            <w:r>
-              <w:rPr>
-                <w:rFonts w:cs="Arial"/>
-                <w:b/>
-                <w:color w:val="010101"/>
-                <w:spacing w:val="8"/>
-                <w:sz w:val="20"/>
-                <w:szCs w:val="20"/>
-              </w:rPr>
-              <w:t xml:space="preserve"> </w:t>
-            </w:r>
-            <w:r>
-              <w:rPr>
-                <w:rFonts w:cs="Arial"/>
-                <w:b/>
-                <w:color w:val="010101"/>
-                <w:sz w:val="20"/>
-                <w:szCs w:val="20"/>
-              </w:rPr>
-              <w:t>also</w:t>
-            </w:r>
-            <w:r>
-              <w:rPr>
-                <w:rFonts w:cs="Arial"/>
-                <w:b/>
-                <w:color w:val="010101"/>
-                <w:spacing w:val="16"/>
-                <w:sz w:val="20"/>
-                <w:szCs w:val="20"/>
-              </w:rPr>
-              <w:t xml:space="preserve"> </w:t>
-            </w:r>
-            <w:r>
-              <w:rPr>
-                <w:rFonts w:cs="Arial"/>
-                <w:b/>
-                <w:color w:val="010101"/>
-                <w:sz w:val="20"/>
-                <w:szCs w:val="20"/>
-              </w:rPr>
-              <w:t>desired</w:t>
-            </w:r>
-            <w:r>
-              <w:rPr>
-                <w:rFonts w:cs="Arial"/>
-                <w:b/>
-                <w:color w:val="010101"/>
-                <w:spacing w:val="29"/>
-                <w:sz w:val="20"/>
-                <w:szCs w:val="20"/>
-              </w:rPr>
-              <w:t xml:space="preserve"> </w:t>
-            </w:r>
-            <w:r>
-              <w:rPr>
-                <w:rFonts w:cs="Arial"/>
-                <w:b/>
-                <w:color w:val="010101"/>
-                <w:sz w:val="20"/>
-                <w:szCs w:val="20"/>
-              </w:rPr>
-              <w:t>on</w:t>
-            </w:r>
-            <w:r>
-              <w:rPr>
-                <w:rFonts w:cs="Arial"/>
-                <w:b/>
-                <w:color w:val="010101"/>
-                <w:spacing w:val="12"/>
-                <w:sz w:val="20"/>
-                <w:szCs w:val="20"/>
-              </w:rPr>
-              <w:t xml:space="preserve"> </w:t>
-            </w:r>
-            <w:r>
-              <w:rPr>
-                <w:rFonts w:cs="Arial"/>
-                <w:b/>
-                <w:color w:val="010101"/>
-                <w:w w:val="110"/>
-                <w:sz w:val="20"/>
-                <w:szCs w:val="20"/>
-              </w:rPr>
-              <w:t>the</w:t>
-            </w:r>
-            <w:r>
-              <w:rPr>
-                <w:rFonts w:cs="Arial"/>
-                <w:b/>
-                <w:color w:val="000000"/>
-                <w:sz w:val="20"/>
-                <w:szCs w:val="20"/>
-              </w:rPr>
-              <w:t xml:space="preserve"> </w:t>
-            </w:r>
-            <w:r>
-              <w:rPr>
-                <w:rFonts w:cs="Arial"/>
-                <w:b/>
-                <w:color w:val="010101"/>
-                <w:sz w:val="20"/>
-                <w:szCs w:val="20"/>
-              </w:rPr>
-              <w:t>patent</w:t>
-            </w:r>
-            <w:r>
-              <w:rPr>
-                <w:rFonts w:cs="Arial"/>
-                <w:b/>
-                <w:color w:val="010101"/>
-                <w:spacing w:val="15"/>
-                <w:sz w:val="20"/>
-                <w:szCs w:val="20"/>
-              </w:rPr>
-              <w:t xml:space="preserve"> </w:t>
-            </w:r>
-            <w:r>
-              <w:rPr>
-                <w:rFonts w:cs="Arial"/>
-                <w:b/>
-                <w:color w:val="010101"/>
-                <w:sz w:val="20"/>
-                <w:szCs w:val="20"/>
-              </w:rPr>
-              <w:t xml:space="preserve">application </w:t>
-            </w:r>
-            <w:r>
-              <w:rPr>
-                <w:rFonts w:cs="Arial"/>
-                <w:b/>
-                <w:color w:val="010101"/>
-                <w:w w:val="104"/>
-                <w:sz w:val="20"/>
-                <w:szCs w:val="20"/>
-              </w:rPr>
-              <w:t>publication.</w:t>
-            </w:r>
-          </w:p>
-          <w:p>
-            <w:pPr>
-              <w:ind w:left="144" w:right="-144"/>
-              <w:rPr>
-                <w:rFonts w:cstheme="minorHAnsi"/>
-                <w:b/>
-              </w:rPr>
-            </w:pPr>
-          </w:p>
-        </w:tc>
-      </w:tr>
-      <w:tr>
-        <w:trPr>
-          <w:trHeight w:hRule="exact" w:val="421"/>
-        </w:trPr>
-        <w:tc>
-          <w:tcPr>
-            <w:tcW w:w="10890" w:type="dxa"/>
-            <w:gridSpan w:val="7"/>
-            <w:tcBorders>
-              <w:top w:val="single" w:sz="2" w:space="0" w:color="000000"/>
-              <w:left w:val="single" w:sz="2" w:space="0" w:color="000000"/>
-              <w:bottom w:val="single" w:sz="2" w:space="0" w:color="000000"/>
-              <w:right w:val="single" w:sz="2" w:space="0" w:color="000000"/>
-            </w:tcBorders>
-            <w:vAlign w:val="center"/>
-          </w:tcPr>
-          <w:p>
-            <w:pPr>
-              <w:ind w:left="144" w:right="-144"/>
-              <w:rPr>
-                <w:rFonts w:cstheme="minorHAnsi"/>
-                <w:b/>
-              </w:rPr>
-            </w:pPr>
-            <w:r>
-              <w:rPr>
-                <w:rFonts w:cstheme="minorHAnsi"/>
-                <w:b/>
-              </w:rPr>
-              <w:t xml:space="preserve">If the Assignee </w:t>
-            </w:r>
-            <w:r>
-              <w:rPr>
-                <w:rFonts w:cstheme="minorHAnsi"/>
-                <w:b/>
-              </w:rPr>
-              <w:t xml:space="preserve">or Non-Applicant Assignee </w:t>
-            </w:r>
-            <w:r>
-              <w:rPr>
-                <w:rFonts w:cstheme="minorHAnsi"/>
-                <w:b/>
-              </w:rPr>
-              <w:t xml:space="preserve">is an </w:t>
-            </w:r>
-            <w:proofErr w:type="gramStart"/>
-            <w:r>
-              <w:rPr>
-                <w:rFonts w:cstheme="minorHAnsi"/>
-                <w:b/>
-              </w:rPr>
-              <w:t>Organization</w:t>
-            </w:r>
-            <w:proofErr w:type="gramEnd"/>
-            <w:r>
-              <w:rPr>
-                <w:rFonts w:cstheme="minorHAnsi"/>
-                <w:b/>
-              </w:rPr>
-              <w:t xml:space="preserve"> check here.  </w:t>
-            </w:r>
-            <w:sdt>
-              <w:sdtPr>
-                <w:rPr>
-                  <w:rFonts w:cstheme="minorHAnsi"/>
-                  <w:b/>
-                  <w:sz w:val="24"/>
-                  <w:szCs w:val="24"/>
-                </w:rPr>
-                <w:id w:val="652109729"/>
-                <w14:checkbox>
-                  <w14:checked w14:val="0"/>
-                  <w14:checkedState w14:val="2612" w14:font="MS Gothic"/>
-                  <w14:uncheckedState w14:val="2610" w14:font="MS Gothic"/>
-                </w14:checkbox>
-              </w:sdtPr>
-              <w:sdtContent>
-                <w:r>
-                  <w:rPr>
-                    <w:rFonts w:ascii="MS Gothic" w:eastAsia="MS Gothic" w:hAnsi="MS Gothic" w:cstheme="minorHAnsi" w:hint="eastAsia"/>
-                    <w:b/>
-                    <w:sz w:val="24"/>
-                    <w:szCs w:val="24"/>
-                  </w:rPr>
-                  <w:t>☐</w:t>
-                </w:r>
-              </w:sdtContent>
-            </w:sdt>
-          </w:p>
-        </w:tc>
-      </w:tr>
-      <w:tr>
-        <w:trPr>
-          <w:trHeight w:hRule="exact" w:val="421"/>
-        </w:trPr>
-        <w:tc>
-          <w:tcPr>
-            <w:tcW w:w="2164" w:type="dxa"/>
-            <w:tcBorders>
-              <w:top w:val="single" w:sz="2" w:space="0" w:color="000000"/>
-              <w:left w:val="single" w:sz="2" w:space="0" w:color="000000"/>
-              <w:bottom w:val="single" w:sz="2" w:space="0" w:color="000000"/>
-              <w:right w:val="single" w:sz="2" w:space="0" w:color="000000"/>
-            </w:tcBorders>
-            <w:vAlign w:val="bottom"/>
-          </w:tcPr>
-          <w:p>
-            <w:pPr>
-              <w:spacing w:after="0" w:line="240" w:lineRule="auto"/>
-              <w:jc w:val="center"/>
-              <w:rPr>
-                <w:rFonts w:eastAsia="Arial" w:cstheme="minorHAnsi"/>
-                <w:b/>
-              </w:rPr>
-            </w:pPr>
-            <w:r>
-              <w:rPr>
-                <w:rFonts w:eastAsia="Arial" w:cstheme="minorHAnsi"/>
-                <w:b/>
-                <w:color w:val="010101"/>
-                <w:w w:val="103"/>
-              </w:rPr>
-              <w:t>Prefix</w:t>
-            </w:r>
-          </w:p>
-        </w:tc>
-        <w:tc>
-          <w:tcPr>
-            <w:tcW w:w="2164" w:type="dxa"/>
-            <w:tcBorders>
-              <w:top w:val="single" w:sz="2" w:space="0" w:color="000000"/>
-              <w:left w:val="single" w:sz="2" w:space="0" w:color="000000"/>
-              <w:bottom w:val="single" w:sz="2" w:space="0" w:color="000000"/>
-              <w:right w:val="single" w:sz="2" w:space="0" w:color="000000"/>
-            </w:tcBorders>
-            <w:vAlign w:val="bottom"/>
-          </w:tcPr>
-          <w:p>
-            <w:pPr>
-              <w:spacing w:after="0" w:line="240" w:lineRule="auto"/>
-              <w:jc w:val="center"/>
-              <w:rPr>
-                <w:rFonts w:eastAsia="Arial" w:cstheme="minorHAnsi"/>
-                <w:b/>
-              </w:rPr>
-            </w:pPr>
-            <w:r>
-              <w:rPr>
-                <w:rFonts w:eastAsia="Arial" w:cstheme="minorHAnsi"/>
-                <w:b/>
-                <w:bCs/>
-                <w:color w:val="010101"/>
-              </w:rPr>
-              <w:t>Given</w:t>
-            </w:r>
-            <w:r>
-              <w:rPr>
-                <w:rFonts w:eastAsia="Arial" w:cstheme="minorHAnsi"/>
-                <w:b/>
-                <w:bCs/>
-                <w:color w:val="010101"/>
-                <w:spacing w:val="31"/>
-              </w:rPr>
-              <w:t xml:space="preserve"> </w:t>
-            </w:r>
-            <w:r>
-              <w:rPr>
-                <w:rFonts w:eastAsia="Arial" w:cstheme="minorHAnsi"/>
-                <w:b/>
-                <w:bCs/>
-                <w:color w:val="010101"/>
-                <w:w w:val="107"/>
-              </w:rPr>
-              <w:t>Name</w:t>
-            </w:r>
-          </w:p>
-        </w:tc>
-        <w:tc>
-          <w:tcPr>
-            <w:tcW w:w="2160" w:type="dxa"/>
-            <w:gridSpan w:val="2"/>
-            <w:tcBorders>
-              <w:top w:val="single" w:sz="2" w:space="0" w:color="000000"/>
-              <w:left w:val="single" w:sz="2" w:space="0" w:color="000000"/>
-              <w:bottom w:val="single" w:sz="2" w:space="0" w:color="000000"/>
-              <w:right w:val="single" w:sz="2" w:space="0" w:color="000000"/>
-            </w:tcBorders>
-            <w:vAlign w:val="bottom"/>
-          </w:tcPr>
-          <w:p>
-            <w:pPr>
-              <w:spacing w:after="0" w:line="240" w:lineRule="auto"/>
-              <w:jc w:val="center"/>
-              <w:rPr>
-                <w:rFonts w:eastAsia="Arial" w:cstheme="minorHAnsi"/>
-                <w:b/>
-              </w:rPr>
-            </w:pPr>
-            <w:r>
-              <w:rPr>
-                <w:rFonts w:eastAsia="Arial" w:cstheme="minorHAnsi"/>
-                <w:b/>
-                <w:color w:val="010101"/>
-              </w:rPr>
-              <w:t>Middle</w:t>
-            </w:r>
-            <w:r>
-              <w:rPr>
-                <w:rFonts w:eastAsia="Arial" w:cstheme="minorHAnsi"/>
-                <w:b/>
-                <w:color w:val="010101"/>
-                <w:spacing w:val="38"/>
-              </w:rPr>
-              <w:t xml:space="preserve"> </w:t>
-            </w:r>
-            <w:r>
-              <w:rPr>
-                <w:rFonts w:eastAsia="Arial" w:cstheme="minorHAnsi"/>
-                <w:b/>
-                <w:color w:val="010101"/>
-                <w:w w:val="104"/>
-              </w:rPr>
-              <w:t>Name</w:t>
-            </w:r>
-          </w:p>
-        </w:tc>
-        <w:tc>
-          <w:tcPr>
-            <w:tcW w:w="2160" w:type="dxa"/>
-            <w:gridSpan w:val="2"/>
-            <w:tcBorders>
-              <w:top w:val="single" w:sz="2" w:space="0" w:color="000000"/>
-              <w:left w:val="single" w:sz="2" w:space="0" w:color="000000"/>
-              <w:bottom w:val="single" w:sz="2" w:space="0" w:color="000000"/>
-              <w:right w:val="single" w:sz="2" w:space="0" w:color="000000"/>
-            </w:tcBorders>
-            <w:vAlign w:val="bottom"/>
-          </w:tcPr>
-          <w:p>
-            <w:pPr>
-              <w:spacing w:after="0" w:line="240" w:lineRule="auto"/>
-              <w:jc w:val="center"/>
-              <w:rPr>
-                <w:rFonts w:eastAsia="Arial" w:cstheme="minorHAnsi"/>
-                <w:b/>
-              </w:rPr>
-            </w:pPr>
-            <w:r>
-              <w:rPr>
-                <w:rFonts w:eastAsia="Arial" w:cstheme="minorHAnsi"/>
-                <w:b/>
-                <w:bCs/>
-                <w:color w:val="010101"/>
-              </w:rPr>
-              <w:t>Family</w:t>
-            </w:r>
-            <w:r>
-              <w:rPr>
-                <w:rFonts w:eastAsia="Arial" w:cstheme="minorHAnsi"/>
-                <w:b/>
-                <w:bCs/>
-                <w:color w:val="010101"/>
-                <w:spacing w:val="32"/>
-              </w:rPr>
-              <w:t xml:space="preserve"> </w:t>
-            </w:r>
-            <w:r>
-              <w:rPr>
-                <w:rFonts w:eastAsia="Arial" w:cstheme="minorHAnsi"/>
-                <w:b/>
-                <w:bCs/>
-                <w:color w:val="010101"/>
-                <w:w w:val="106"/>
-              </w:rPr>
-              <w:t>Name</w:t>
-            </w:r>
-          </w:p>
-        </w:tc>
-        <w:tc>
-          <w:tcPr>
-            <w:tcW w:w="2242" w:type="dxa"/>
-            <w:tcBorders>
-              <w:top w:val="single" w:sz="2" w:space="0" w:color="000000"/>
-              <w:left w:val="single" w:sz="2" w:space="0" w:color="000000"/>
-              <w:bottom w:val="single" w:sz="2" w:space="0" w:color="000000"/>
-              <w:right w:val="single" w:sz="2" w:space="0" w:color="000000"/>
-            </w:tcBorders>
-            <w:vAlign w:val="bottom"/>
-          </w:tcPr>
-          <w:p>
-            <w:pPr>
-              <w:spacing w:after="0" w:line="240" w:lineRule="auto"/>
-              <w:jc w:val="center"/>
-              <w:rPr>
-                <w:rFonts w:eastAsia="Arial" w:cstheme="minorHAnsi"/>
-                <w:b/>
-              </w:rPr>
-            </w:pPr>
-            <w:r>
-              <w:rPr>
-                <w:rFonts w:eastAsia="Arial" w:cstheme="minorHAnsi"/>
-                <w:b/>
-                <w:color w:val="010101"/>
-                <w:w w:val="106"/>
-              </w:rPr>
-              <w:t>Suffix</w:t>
-            </w:r>
-          </w:p>
-        </w:tc>
-      </w:tr>
-      <w:tr>
-        <w:trPr>
-          <w:trHeight w:hRule="exact" w:val="421"/>
-        </w:trPr>
-        <w:tc>
-          <w:tcPr>
-            <w:tcW w:w="2164" w:type="dxa"/>
-            <w:tcBorders>
-              <w:top w:val="single" w:sz="2" w:space="0" w:color="000000"/>
-              <w:left w:val="single" w:sz="2" w:space="0" w:color="000000"/>
-              <w:bottom w:val="single" w:sz="2" w:space="0" w:color="000000"/>
-              <w:right w:val="single" w:sz="2" w:space="0" w:color="000000"/>
-            </w:tcBorders>
-          </w:tcPr>
-          <w:p>
-            <w:pPr>
-              <w:spacing w:after="0" w:line="414" w:lineRule="exact"/>
-              <w:ind w:right="-46"/>
-              <w:jc w:val="right"/>
-              <w:rPr>
-                <w:rFonts w:eastAsia="Arial" w:cstheme="minorHAnsi"/>
-                <w:sz w:val="20"/>
-                <w:szCs w:val="20"/>
-              </w:rPr>
-            </w:pPr>
-          </w:p>
-        </w:tc>
-        <w:tc>
-          <w:tcPr>
-            <w:tcW w:w="2164" w:type="dxa"/>
-            <w:tcBorders>
-              <w:top w:val="single" w:sz="2" w:space="0" w:color="000000"/>
-              <w:left w:val="single" w:sz="2" w:space="0" w:color="000000"/>
-              <w:bottom w:val="single" w:sz="2" w:space="0" w:color="000000"/>
-              <w:right w:val="single" w:sz="2" w:space="0" w:color="000000"/>
-            </w:tcBorders>
-          </w:tcPr>
-          <w:p>
-            <w:pPr>
-              <w:rPr>
-                <w:rFonts w:cstheme="minorHAnsi"/>
-                <w:sz w:val="20"/>
-                <w:szCs w:val="20"/>
-              </w:rPr>
-            </w:pPr>
-          </w:p>
-        </w:tc>
-        <w:tc>
-          <w:tcPr>
-            <w:tcW w:w="2160" w:type="dxa"/>
-            <w:gridSpan w:val="2"/>
-            <w:tcBorders>
-              <w:top w:val="single" w:sz="2" w:space="0" w:color="000000"/>
-              <w:left w:val="single" w:sz="2" w:space="0" w:color="000000"/>
-              <w:bottom w:val="single" w:sz="2" w:space="0" w:color="000000"/>
-              <w:right w:val="single" w:sz="2" w:space="0" w:color="000000"/>
-            </w:tcBorders>
-          </w:tcPr>
-          <w:p>
-            <w:pPr>
-              <w:rPr>
-                <w:rFonts w:cstheme="minorHAnsi"/>
-                <w:sz w:val="20"/>
-                <w:szCs w:val="20"/>
-              </w:rPr>
-            </w:pPr>
-          </w:p>
-        </w:tc>
-        <w:tc>
-          <w:tcPr>
-            <w:tcW w:w="2160" w:type="dxa"/>
-            <w:gridSpan w:val="2"/>
-            <w:tcBorders>
-              <w:top w:val="single" w:sz="2" w:space="0" w:color="000000"/>
-              <w:left w:val="single" w:sz="2" w:space="0" w:color="000000"/>
-              <w:bottom w:val="single" w:sz="2" w:space="0" w:color="000000"/>
-              <w:right w:val="single" w:sz="2" w:space="0" w:color="000000"/>
-            </w:tcBorders>
-          </w:tcPr>
-          <w:p>
-            <w:pPr>
-              <w:rPr>
-                <w:rFonts w:cstheme="minorHAnsi"/>
-                <w:sz w:val="20"/>
-                <w:szCs w:val="20"/>
-              </w:rPr>
-            </w:pPr>
-          </w:p>
-        </w:tc>
-        <w:tc>
-          <w:tcPr>
-            <w:tcW w:w="2242" w:type="dxa"/>
-            <w:tcBorders>
-              <w:top w:val="single" w:sz="2" w:space="0" w:color="000000"/>
-              <w:left w:val="single" w:sz="2" w:space="0" w:color="000000"/>
-              <w:bottom w:val="single" w:sz="2" w:space="0" w:color="000000"/>
-              <w:right w:val="single" w:sz="2" w:space="0" w:color="000000"/>
-            </w:tcBorders>
-          </w:tcPr>
-          <w:p>
-            <w:pPr>
-              <w:spacing w:after="0" w:line="414" w:lineRule="exact"/>
-              <w:ind w:right="-46"/>
-              <w:jc w:val="right"/>
-              <w:rPr>
-                <w:rFonts w:eastAsia="Arial" w:cstheme="minorHAnsi"/>
-                <w:sz w:val="20"/>
-                <w:szCs w:val="20"/>
-              </w:rPr>
-            </w:pPr>
-          </w:p>
-        </w:tc>
-      </w:tr>
-      <w:tr>
-        <w:trPr>
-          <w:trHeight w:hRule="exact" w:val="313"/>
-        </w:trPr>
-        <w:tc>
-          <w:tcPr>
-            <w:tcW w:w="10890" w:type="dxa"/>
-            <w:gridSpan w:val="7"/>
-            <w:tcBorders>
-              <w:top w:val="single" w:sz="2" w:space="0" w:color="000000"/>
-              <w:left w:val="single" w:sz="2" w:space="0" w:color="000000"/>
-              <w:bottom w:val="single" w:sz="2" w:space="0" w:color="000000"/>
-              <w:right w:val="single" w:sz="2" w:space="0" w:color="000000"/>
-            </w:tcBorders>
-          </w:tcPr>
-          <w:p>
-            <w:pPr>
-              <w:spacing w:before="5" w:after="0" w:line="240" w:lineRule="auto"/>
-              <w:ind w:left="151" w:right="-20"/>
-              <w:rPr>
-                <w:rFonts w:eastAsia="Arial" w:cstheme="minorHAnsi"/>
-                <w:sz w:val="24"/>
-                <w:szCs w:val="24"/>
-              </w:rPr>
-            </w:pPr>
-            <w:r>
-              <w:rPr>
-                <w:rFonts w:eastAsia="Arial" w:cstheme="minorHAnsi"/>
-                <w:b/>
-                <w:bCs/>
-                <w:color w:val="010101"/>
-                <w:sz w:val="24"/>
-                <w:szCs w:val="24"/>
-              </w:rPr>
-              <w:t>Mailing</w:t>
-            </w:r>
-            <w:r>
-              <w:rPr>
-                <w:rFonts w:eastAsia="Arial" w:cstheme="minorHAnsi"/>
-                <w:b/>
-                <w:bCs/>
-                <w:color w:val="010101"/>
-                <w:spacing w:val="18"/>
-                <w:sz w:val="24"/>
-                <w:szCs w:val="24"/>
-              </w:rPr>
-              <w:t xml:space="preserve"> </w:t>
-            </w:r>
-            <w:r>
-              <w:rPr>
-                <w:rFonts w:eastAsia="Arial" w:cstheme="minorHAnsi"/>
-                <w:b/>
-                <w:bCs/>
-                <w:color w:val="010101"/>
-                <w:sz w:val="24"/>
-                <w:szCs w:val="24"/>
-              </w:rPr>
-              <w:t>Address</w:t>
-            </w:r>
-            <w:r>
-              <w:rPr>
-                <w:rFonts w:eastAsia="Arial" w:cstheme="minorHAnsi"/>
-                <w:b/>
-                <w:bCs/>
-                <w:color w:val="010101"/>
-                <w:spacing w:val="43"/>
-                <w:sz w:val="24"/>
-                <w:szCs w:val="24"/>
-              </w:rPr>
-              <w:t xml:space="preserve"> </w:t>
-            </w:r>
-            <w:r>
-              <w:rPr>
-                <w:rFonts w:eastAsia="Arial" w:cstheme="minorHAnsi"/>
-                <w:b/>
-                <w:bCs/>
-                <w:color w:val="010101"/>
-                <w:w w:val="105"/>
-                <w:sz w:val="24"/>
-                <w:szCs w:val="24"/>
-              </w:rPr>
-              <w:t>Information</w:t>
-            </w:r>
-            <w:r>
-              <w:rPr>
-                <w:rFonts w:eastAsia="Arial" w:cstheme="minorHAnsi"/>
-                <w:b/>
-                <w:bCs/>
-                <w:color w:val="010101"/>
-                <w:w w:val="105"/>
-                <w:sz w:val="24"/>
-                <w:szCs w:val="24"/>
-              </w:rPr>
-              <w:t xml:space="preserve"> </w:t>
-            </w:r>
-            <w:proofErr w:type="gramStart"/>
-            <w:r>
-              <w:rPr>
-                <w:rFonts w:eastAsia="Arial" w:cstheme="minorHAnsi"/>
-                <w:b/>
-                <w:bCs/>
-                <w:color w:val="010101"/>
-                <w:w w:val="105"/>
-                <w:sz w:val="24"/>
-                <w:szCs w:val="24"/>
-              </w:rPr>
-              <w:t>For</w:t>
-            </w:r>
-            <w:proofErr w:type="gramEnd"/>
-            <w:r>
-              <w:rPr>
-                <w:rFonts w:eastAsia="Arial" w:cstheme="minorHAnsi"/>
-                <w:b/>
-                <w:bCs/>
-                <w:color w:val="010101"/>
-                <w:w w:val="105"/>
-                <w:sz w:val="24"/>
-                <w:szCs w:val="24"/>
-              </w:rPr>
-              <w:t xml:space="preserve"> Assignee</w:t>
-            </w:r>
-            <w:r>
-              <w:rPr>
-                <w:rFonts w:eastAsia="Arial" w:cstheme="minorHAnsi"/>
-                <w:b/>
-                <w:bCs/>
-                <w:color w:val="010101"/>
-                <w:w w:val="105"/>
-                <w:sz w:val="24"/>
-                <w:szCs w:val="24"/>
-              </w:rPr>
-              <w:t xml:space="preserve"> including Non-Applicant Assignee</w:t>
-            </w:r>
-            <w:r>
-              <w:rPr>
-                <w:rFonts w:eastAsia="Arial" w:cstheme="minorHAnsi"/>
-                <w:b/>
-                <w:bCs/>
-                <w:color w:val="010101"/>
-                <w:w w:val="105"/>
-                <w:sz w:val="24"/>
-                <w:szCs w:val="24"/>
-              </w:rPr>
-              <w:t>:</w:t>
-            </w:r>
-          </w:p>
-        </w:tc>
-      </w:tr>
-      <w:tr>
-        <w:trPr>
-          <w:trHeight w:hRule="exact" w:val="360"/>
-        </w:trPr>
-        <w:tc>
-          <w:tcPr>
-            <w:tcW w:w="2164" w:type="dxa"/>
-            <w:tcBorders>
-              <w:top w:val="single" w:sz="2" w:space="0" w:color="000000"/>
-              <w:left w:val="single" w:sz="2" w:space="0" w:color="000000"/>
-              <w:bottom w:val="single" w:sz="2" w:space="0" w:color="000000"/>
-              <w:right w:val="single" w:sz="2" w:space="0" w:color="000000"/>
-            </w:tcBorders>
-            <w:vAlign w:val="center"/>
-          </w:tcPr>
-          <w:p>
-            <w:pPr>
-              <w:spacing w:before="52" w:after="0" w:line="240" w:lineRule="auto"/>
-              <w:ind w:left="137" w:right="-20"/>
-              <w:rPr>
-                <w:rFonts w:eastAsia="Arial" w:cstheme="minorHAnsi"/>
-              </w:rPr>
-            </w:pPr>
-            <w:r>
-              <w:rPr>
-                <w:rFonts w:eastAsia="Arial" w:cstheme="minorHAnsi"/>
-                <w:b/>
-                <w:bCs/>
-                <w:color w:val="010101"/>
-              </w:rPr>
-              <w:t>Address</w:t>
-            </w:r>
-            <w:r>
-              <w:rPr>
-                <w:rFonts w:eastAsia="Arial" w:cstheme="minorHAnsi"/>
-                <w:b/>
-                <w:bCs/>
-                <w:color w:val="010101"/>
-                <w:spacing w:val="33"/>
-              </w:rPr>
-              <w:t xml:space="preserve"> </w:t>
-            </w:r>
-            <w:r>
-              <w:rPr>
-                <w:rFonts w:eastAsia="Arial" w:cstheme="minorHAnsi"/>
-                <w:b/>
-                <w:bCs/>
-                <w:color w:val="010101"/>
-                <w:w w:val="121"/>
-              </w:rPr>
-              <w:t>1</w:t>
-            </w:r>
-          </w:p>
-        </w:tc>
-        <w:tc>
-          <w:tcPr>
-            <w:tcW w:w="8726" w:type="dxa"/>
-            <w:gridSpan w:val="6"/>
-            <w:tcBorders>
-              <w:top w:val="single" w:sz="2" w:space="0" w:color="000000"/>
-              <w:left w:val="single" w:sz="2" w:space="0" w:color="000000"/>
-              <w:bottom w:val="single" w:sz="2" w:space="0" w:color="000000"/>
-              <w:right w:val="single" w:sz="2" w:space="0" w:color="000000"/>
-            </w:tcBorders>
-            <w:vAlign w:val="center"/>
-          </w:tcPr>
-          <w:p>
-            <w:pPr>
-              <w:spacing w:after="0" w:line="240" w:lineRule="auto"/>
-              <w:rPr>
-                <w:rFonts w:cstheme="minorHAnsi"/>
-              </w:rPr>
-            </w:pPr>
-            <w:r>
-              <w:rPr>
-                <w:rFonts w:cstheme="minorHAnsi"/>
-              </w:rPr>
-              <w:t xml:space="preserve"> &lt;&lt;assigneeStreet1&gt;&gt;</w:t>
-            </w:r>
-          </w:p>
-        </w:tc>
-      </w:tr>
-      <w:tr>
-        <w:trPr>
-          <w:trHeight w:hRule="exact" w:val="367"/>
-        </w:trPr>
-        <w:tc>
-          <w:tcPr>
-            <w:tcW w:w="2164" w:type="dxa"/>
-            <w:tcBorders>
-              <w:top w:val="single" w:sz="2" w:space="0" w:color="000000"/>
-              <w:left w:val="single" w:sz="2" w:space="0" w:color="000000"/>
-              <w:bottom w:val="single" w:sz="2" w:space="0" w:color="000000"/>
-              <w:right w:val="single" w:sz="2" w:space="0" w:color="000000"/>
-            </w:tcBorders>
-          </w:tcPr>
-          <w:p>
-            <w:pPr>
-              <w:spacing w:before="52" w:after="0" w:line="240" w:lineRule="auto"/>
-              <w:ind w:left="137" w:right="-20"/>
-              <w:rPr>
-                <w:rFonts w:eastAsia="Arial" w:cstheme="minorHAnsi"/>
-                <w:b/>
-              </w:rPr>
-            </w:pPr>
-            <w:r>
-              <w:rPr>
-                <w:rFonts w:eastAsia="Arial" w:cstheme="minorHAnsi"/>
-                <w:b/>
-                <w:color w:val="010101"/>
-              </w:rPr>
-              <w:t>Address</w:t>
-            </w:r>
-            <w:r>
-              <w:rPr>
-                <w:rFonts w:eastAsia="Arial" w:cstheme="minorHAnsi"/>
-                <w:b/>
-                <w:color w:val="010101"/>
-                <w:spacing w:val="27"/>
-              </w:rPr>
-              <w:t xml:space="preserve"> </w:t>
-            </w:r>
-            <w:r>
-              <w:rPr>
-                <w:rFonts w:eastAsia="Arial" w:cstheme="minorHAnsi"/>
-                <w:b/>
-                <w:color w:val="010101"/>
-                <w:w w:val="112"/>
-              </w:rPr>
-              <w:t>2</w:t>
-            </w:r>
-          </w:p>
-        </w:tc>
-        <w:tc>
-          <w:tcPr>
-            <w:tcW w:w="8726" w:type="dxa"/>
-            <w:gridSpan w:val="6"/>
-            <w:tcBorders>
-              <w:top w:val="single" w:sz="2" w:space="0" w:color="000000"/>
-              <w:left w:val="single" w:sz="2" w:space="0" w:color="000000"/>
-              <w:bottom w:val="single" w:sz="2" w:space="0" w:color="000000"/>
-              <w:right w:val="single" w:sz="2" w:space="0" w:color="000000"/>
-            </w:tcBorders>
-            <w:vAlign w:val="center"/>
-          </w:tcPr>
-          <w:p>
-            <w:pPr>
-              <w:spacing w:after="0" w:line="240" w:lineRule="auto"/>
-              <w:rPr>
-                <w:rFonts w:cstheme="minorHAnsi"/>
-              </w:rPr>
-            </w:pPr>
-            <w:r>
-              <w:rPr>
-                <w:rFonts w:cstheme="minorHAnsi"/>
-              </w:rPr>
-              <w:t>&lt;&lt;assigneeStreet2&gt;&gt;</w:t>
-            </w:r>
-          </w:p>
-        </w:tc>
-      </w:tr>
-      <w:tr>
-        <w:trPr>
-          <w:trHeight w:hRule="exact" w:val="360"/>
-        </w:trPr>
-        <w:tc>
-          <w:tcPr>
-            <w:tcW w:w="2164" w:type="dxa"/>
-            <w:tcBorders>
-              <w:top w:val="single" w:sz="2" w:space="0" w:color="000000"/>
-              <w:left w:val="single" w:sz="2" w:space="0" w:color="000000"/>
-              <w:bottom w:val="single" w:sz="2" w:space="0" w:color="000000"/>
-              <w:right w:val="single" w:sz="2" w:space="0" w:color="000000"/>
-            </w:tcBorders>
-          </w:tcPr>
-          <w:p>
-            <w:pPr>
-              <w:spacing w:before="45" w:after="0" w:line="240" w:lineRule="auto"/>
-              <w:ind w:left="137" w:right="-20"/>
-              <w:rPr>
-                <w:rFonts w:eastAsia="Arial" w:cstheme="minorHAnsi"/>
-              </w:rPr>
-            </w:pPr>
-            <w:r>
-              <w:rPr>
-                <w:rFonts w:eastAsia="Arial" w:cstheme="minorHAnsi"/>
-                <w:b/>
-                <w:bCs/>
-                <w:color w:val="010101"/>
-                <w:w w:val="109"/>
-              </w:rPr>
-              <w:t>City</w:t>
-            </w:r>
-          </w:p>
-        </w:tc>
-        <w:tc>
-          <w:tcPr>
-            <w:tcW w:w="3436" w:type="dxa"/>
-            <w:gridSpan w:val="2"/>
-            <w:tcBorders>
-              <w:top w:val="single" w:sz="2" w:space="0" w:color="000000"/>
-              <w:left w:val="single" w:sz="2" w:space="0" w:color="000000"/>
-              <w:bottom w:val="single" w:sz="2" w:space="0" w:color="000000"/>
-              <w:right w:val="single" w:sz="2" w:space="0" w:color="000000"/>
-            </w:tcBorders>
-            <w:vAlign w:val="center"/>
-          </w:tcPr>
-          <w:p>
-            <w:pPr>
-              <w:spacing w:after="0" w:line="240" w:lineRule="auto"/>
-              <w:rPr>
-                <w:rFonts w:cstheme="minorHAnsi"/>
-              </w:rPr>
-            </w:pPr>
-            <w:r>
-              <w:rPr>
-                <w:rFonts w:cstheme="minorHAnsi"/>
-              </w:rPr>
-              <w:t xml:space="preserve"> &lt;&lt;assigneeCity&gt;&gt;</w:t>
-            </w:r>
-          </w:p>
-        </w:tc>
-        <w:tc>
-          <w:tcPr>
-            <w:tcW w:w="1966" w:type="dxa"/>
-            <w:gridSpan w:val="2"/>
-            <w:tcBorders>
-              <w:top w:val="single" w:sz="2" w:space="0" w:color="000000"/>
-              <w:left w:val="single" w:sz="2" w:space="0" w:color="000000"/>
-              <w:bottom w:val="single" w:sz="2" w:space="0" w:color="000000"/>
-              <w:right w:val="single" w:sz="2" w:space="0" w:color="000000"/>
-            </w:tcBorders>
-          </w:tcPr>
-          <w:p>
-            <w:pPr>
-              <w:spacing w:before="45" w:after="0" w:line="240" w:lineRule="auto"/>
-              <w:ind w:left="144" w:right="-20"/>
-              <w:rPr>
-                <w:rFonts w:eastAsia="Arial" w:cstheme="minorHAnsi"/>
-              </w:rPr>
-            </w:pPr>
-            <w:r>
-              <w:rPr>
-                <w:rFonts w:eastAsia="Arial" w:cstheme="minorHAnsi"/>
-                <w:b/>
-                <w:bCs/>
-                <w:color w:val="010101"/>
-                <w:w w:val="104"/>
-              </w:rPr>
-              <w:t>State/</w:t>
-            </w:r>
-            <w:r>
-              <w:rPr>
-                <w:rFonts w:eastAsia="Arial" w:cstheme="minorHAnsi"/>
-                <w:b/>
-                <w:bCs/>
-                <w:color w:val="010101"/>
-                <w:spacing w:val="5"/>
-                <w:w w:val="104"/>
-              </w:rPr>
-              <w:t>P</w:t>
-            </w:r>
-            <w:r>
-              <w:rPr>
-                <w:rFonts w:eastAsia="Arial" w:cstheme="minorHAnsi"/>
-                <w:b/>
-                <w:bCs/>
-                <w:color w:val="010101"/>
-                <w:w w:val="104"/>
-              </w:rPr>
-              <w:t>rovince</w:t>
-            </w:r>
-          </w:p>
-        </w:tc>
-        <w:tc>
-          <w:tcPr>
-            <w:tcW w:w="3324" w:type="dxa"/>
-            <w:gridSpan w:val="2"/>
-            <w:tcBorders>
-              <w:top w:val="single" w:sz="2" w:space="0" w:color="000000"/>
-              <w:left w:val="single" w:sz="2" w:space="0" w:color="000000"/>
-              <w:bottom w:val="single" w:sz="2" w:space="0" w:color="000000"/>
-              <w:right w:val="single" w:sz="2" w:space="0" w:color="000000"/>
-            </w:tcBorders>
-          </w:tcPr>
-          <w:p>
-            <w:pPr>
-              <w:rPr>
-                <w:rFonts w:cstheme="minorHAnsi"/>
-              </w:rPr>
-            </w:pPr>
-            <w:r>
-              <w:rPr>
-                <w:rFonts w:cstheme="minorHAnsi"/>
-              </w:rPr>
-              <w:t xml:space="preserve"> &lt;&lt;assigneeState&gt;&gt;</w:t>
-            </w:r>
-          </w:p>
-        </w:tc>
-      </w:tr>
-      <w:tr>
-        <w:trPr>
-          <w:trHeight w:hRule="exact" w:val="356"/>
-        </w:trPr>
-        <w:tc>
-          <w:tcPr>
-            <w:tcW w:w="2164" w:type="dxa"/>
-            <w:tcBorders>
-              <w:top w:val="single" w:sz="2" w:space="0" w:color="000000"/>
-              <w:left w:val="single" w:sz="2" w:space="0" w:color="000000"/>
-              <w:bottom w:val="single" w:sz="2" w:space="0" w:color="000000"/>
-              <w:right w:val="single" w:sz="2" w:space="0" w:color="000000"/>
-            </w:tcBorders>
-          </w:tcPr>
-          <w:p>
-            <w:pPr>
-              <w:spacing w:before="59" w:after="0" w:line="240" w:lineRule="auto"/>
-              <w:ind w:left="137" w:right="-20"/>
-              <w:rPr>
-                <w:rFonts w:eastAsia="Arial" w:cstheme="minorHAnsi"/>
-              </w:rPr>
-            </w:pPr>
-            <w:r>
-              <w:rPr>
-                <w:rFonts w:eastAsia="Arial" w:cstheme="minorHAnsi"/>
-                <w:b/>
-                <w:bCs/>
-                <w:color w:val="010101"/>
-              </w:rPr>
-              <w:t xml:space="preserve">Country  </w:t>
-            </w:r>
-            <w:r>
-              <w:rPr>
-                <w:rFonts w:eastAsia="Arial" w:cstheme="minorHAnsi"/>
-                <w:b/>
-                <w:bCs/>
-                <w:color w:val="010101"/>
-                <w:spacing w:val="43"/>
-              </w:rPr>
-              <w:t xml:space="preserve"> </w:t>
-            </w:r>
-          </w:p>
-        </w:tc>
-        <w:tc>
-          <w:tcPr>
-            <w:tcW w:w="3436" w:type="dxa"/>
-            <w:gridSpan w:val="2"/>
-            <w:tcBorders>
-              <w:top w:val="single" w:sz="2" w:space="0" w:color="000000"/>
-              <w:left w:val="single" w:sz="2" w:space="0" w:color="000000"/>
-              <w:bottom w:val="single" w:sz="2" w:space="0" w:color="000000"/>
-              <w:right w:val="single" w:sz="2" w:space="0" w:color="000000"/>
-            </w:tcBorders>
-            <w:vAlign w:val="center"/>
-          </w:tcPr>
-          <w:p>
-            <w:pPr>
-              <w:spacing w:after="0" w:line="240" w:lineRule="auto"/>
-              <w:rPr>
-                <w:rFonts w:eastAsia="Arial" w:cstheme="minorHAnsi"/>
-              </w:rPr>
-            </w:pPr>
-            <w:r>
-              <w:rPr>
-                <w:rFonts w:eastAsia="Arial" w:cstheme="minorHAnsi"/>
-              </w:rPr>
-              <w:t xml:space="preserve"> &lt;&lt;assigneeCountry&gt;&gt;</w:t>
-            </w:r>
-          </w:p>
-        </w:tc>
-        <w:tc>
-          <w:tcPr>
-            <w:tcW w:w="1966" w:type="dxa"/>
-            <w:gridSpan w:val="2"/>
-            <w:tcBorders>
-              <w:top w:val="single" w:sz="2" w:space="0" w:color="000000"/>
-              <w:left w:val="single" w:sz="2" w:space="0" w:color="000000"/>
-              <w:bottom w:val="single" w:sz="2" w:space="0" w:color="000000"/>
-              <w:right w:val="single" w:sz="2" w:space="0" w:color="000000"/>
-            </w:tcBorders>
-          </w:tcPr>
-          <w:p>
-            <w:pPr>
-              <w:spacing w:before="45" w:after="0" w:line="240" w:lineRule="auto"/>
-              <w:ind w:left="158" w:right="-20"/>
-              <w:rPr>
-                <w:rFonts w:eastAsia="Arial" w:cstheme="minorHAnsi"/>
-                <w:b/>
-              </w:rPr>
-            </w:pPr>
-            <w:r>
-              <w:rPr>
-                <w:rFonts w:eastAsia="Arial" w:cstheme="minorHAnsi"/>
-                <w:b/>
-                <w:color w:val="010101"/>
-              </w:rPr>
-              <w:t>Postal</w:t>
-            </w:r>
-            <w:r>
-              <w:rPr>
-                <w:rFonts w:eastAsia="Arial" w:cstheme="minorHAnsi"/>
-                <w:b/>
-                <w:color w:val="010101"/>
-                <w:spacing w:val="18"/>
-              </w:rPr>
-              <w:t xml:space="preserve"> </w:t>
-            </w:r>
-            <w:r>
-              <w:rPr>
-                <w:rFonts w:eastAsia="Arial" w:cstheme="minorHAnsi"/>
-                <w:b/>
-                <w:color w:val="010101"/>
-                <w:w w:val="104"/>
-              </w:rPr>
-              <w:t>Code</w:t>
-            </w:r>
-          </w:p>
-        </w:tc>
-        <w:tc>
-          <w:tcPr>
-            <w:tcW w:w="3324" w:type="dxa"/>
-            <w:gridSpan w:val="2"/>
-            <w:tcBorders>
-              <w:top w:val="single" w:sz="2" w:space="0" w:color="000000"/>
-              <w:left w:val="single" w:sz="2" w:space="0" w:color="000000"/>
-              <w:bottom w:val="single" w:sz="2" w:space="0" w:color="000000"/>
-              <w:right w:val="single" w:sz="2" w:space="0" w:color="000000"/>
-            </w:tcBorders>
-          </w:tcPr>
-          <w:p>
-            <w:pPr>
-              <w:rPr>
-                <w:rFonts w:cstheme="minorHAnsi"/>
-              </w:rPr>
-            </w:pPr>
-            <w:r>
-              <w:rPr>
-                <w:rFonts w:cstheme="minorHAnsi"/>
-              </w:rPr>
-              <w:t xml:space="preserve"> &lt;&lt;assigneeZip&gt;&gt;</w:t>
-            </w:r>
-          </w:p>
-        </w:tc>
-      </w:tr>
-      <w:tr>
-        <w:trPr>
-          <w:trHeight w:hRule="exact" w:val="371"/>
-        </w:trPr>
-        <w:tc>
-          <w:tcPr>
-            <w:tcW w:w="2164" w:type="dxa"/>
-            <w:tcBorders>
-              <w:top w:val="single" w:sz="2" w:space="0" w:color="000000"/>
-              <w:left w:val="single" w:sz="2" w:space="0" w:color="000000"/>
-              <w:bottom w:val="single" w:sz="2" w:space="0" w:color="000000"/>
-              <w:right w:val="single" w:sz="2" w:space="0" w:color="000000"/>
-            </w:tcBorders>
-          </w:tcPr>
-          <w:p>
-            <w:pPr>
-              <w:spacing w:before="48" w:after="0" w:line="240" w:lineRule="auto"/>
-              <w:ind w:left="151" w:right="-20"/>
-              <w:rPr>
-                <w:rFonts w:eastAsia="Arial" w:cstheme="minorHAnsi"/>
-                <w:b/>
-              </w:rPr>
-            </w:pPr>
-            <w:r>
-              <w:rPr>
-                <w:rFonts w:eastAsia="Arial" w:cstheme="minorHAnsi"/>
-                <w:b/>
-                <w:color w:val="010101"/>
-              </w:rPr>
-              <w:t>Phone</w:t>
-            </w:r>
-            <w:r>
-              <w:rPr>
-                <w:rFonts w:eastAsia="Arial" w:cstheme="minorHAnsi"/>
-                <w:b/>
-                <w:color w:val="010101"/>
-                <w:spacing w:val="27"/>
-              </w:rPr>
-              <w:t xml:space="preserve"> </w:t>
-            </w:r>
-            <w:r>
-              <w:rPr>
-                <w:rFonts w:eastAsia="Arial" w:cstheme="minorHAnsi"/>
-                <w:b/>
-                <w:color w:val="010101"/>
-                <w:w w:val="105"/>
-              </w:rPr>
-              <w:t>Number</w:t>
-            </w:r>
-          </w:p>
-        </w:tc>
-        <w:tc>
-          <w:tcPr>
-            <w:tcW w:w="3436" w:type="dxa"/>
-            <w:gridSpan w:val="2"/>
-            <w:tcBorders>
-              <w:top w:val="single" w:sz="2" w:space="0" w:color="000000"/>
-              <w:left w:val="single" w:sz="2" w:space="0" w:color="000000"/>
-              <w:bottom w:val="single" w:sz="2" w:space="0" w:color="000000"/>
-              <w:right w:val="single" w:sz="2" w:space="0" w:color="000000"/>
-            </w:tcBorders>
-          </w:tcPr>
-          <w:p>
-            <w:pPr>
-              <w:rPr>
-                <w:rFonts w:cstheme="minorHAnsi"/>
-              </w:rPr>
-            </w:pPr>
-            <w:r>
-              <w:rPr>
-                <w:rFonts w:cstheme="minorHAnsi"/>
-              </w:rPr>
-              <w:t xml:space="preserve"> </w:t>
-            </w:r>
-          </w:p>
-        </w:tc>
-        <w:tc>
-          <w:tcPr>
-            <w:tcW w:w="1966" w:type="dxa"/>
-            <w:gridSpan w:val="2"/>
-            <w:tcBorders>
-              <w:top w:val="single" w:sz="2" w:space="0" w:color="000000"/>
-              <w:left w:val="single" w:sz="2" w:space="0" w:color="000000"/>
-              <w:bottom w:val="single" w:sz="2" w:space="0" w:color="000000"/>
-              <w:right w:val="single" w:sz="2" w:space="0" w:color="000000"/>
-            </w:tcBorders>
-          </w:tcPr>
-          <w:p>
-            <w:pPr>
-              <w:spacing w:before="48" w:after="0" w:line="240" w:lineRule="auto"/>
-              <w:ind w:left="158" w:right="-20"/>
-              <w:rPr>
-                <w:rFonts w:eastAsia="Arial" w:cstheme="minorHAnsi"/>
-                <w:b/>
-              </w:rPr>
-            </w:pPr>
-            <w:r>
-              <w:rPr>
-                <w:rFonts w:eastAsia="Arial" w:cstheme="minorHAnsi"/>
-                <w:b/>
-                <w:color w:val="010101"/>
-              </w:rPr>
-              <w:t>Fax</w:t>
-            </w:r>
-            <w:r>
-              <w:rPr>
-                <w:rFonts w:eastAsia="Arial" w:cstheme="minorHAnsi"/>
-                <w:b/>
-                <w:color w:val="010101"/>
-                <w:spacing w:val="17"/>
-              </w:rPr>
-              <w:t xml:space="preserve"> </w:t>
-            </w:r>
-            <w:r>
-              <w:rPr>
-                <w:rFonts w:eastAsia="Arial" w:cstheme="minorHAnsi"/>
-                <w:b/>
-                <w:color w:val="010101"/>
-                <w:w w:val="104"/>
-              </w:rPr>
-              <w:t>Number</w:t>
-            </w:r>
-          </w:p>
-        </w:tc>
-        <w:tc>
-          <w:tcPr>
-            <w:tcW w:w="3324" w:type="dxa"/>
-            <w:gridSpan w:val="2"/>
-            <w:tcBorders>
-              <w:top w:val="single" w:sz="2" w:space="0" w:color="000000"/>
-              <w:left w:val="single" w:sz="2" w:space="0" w:color="000000"/>
-              <w:bottom w:val="single" w:sz="2" w:space="0" w:color="000000"/>
-              <w:right w:val="single" w:sz="2" w:space="0" w:color="000000"/>
-            </w:tcBorders>
-          </w:tcPr>
-          <w:p>
-            <w:pPr>
-              <w:rPr>
-                <w:rFonts w:cstheme="minorHAnsi"/>
-              </w:rPr>
-            </w:pPr>
-          </w:p>
-        </w:tc>
-      </w:tr>
-      <w:tr>
-        <w:trPr>
-          <w:trHeight w:hRule="exact" w:val="360"/>
-        </w:trPr>
-        <w:tc>
-          <w:tcPr>
-            <w:tcW w:w="2164" w:type="dxa"/>
-            <w:tcBorders>
-              <w:top w:val="single" w:sz="2" w:space="0" w:color="000000"/>
-              <w:left w:val="single" w:sz="2" w:space="0" w:color="000000"/>
-              <w:bottom w:val="single" w:sz="2" w:space="0" w:color="000000"/>
-              <w:right w:val="single" w:sz="2" w:space="0" w:color="000000"/>
-            </w:tcBorders>
-          </w:tcPr>
-          <w:p>
-            <w:pPr>
-              <w:spacing w:after="0" w:line="240" w:lineRule="auto"/>
-              <w:ind w:left="151" w:right="-20"/>
-              <w:rPr>
-                <w:rFonts w:eastAsia="Arial" w:cstheme="minorHAnsi"/>
-                <w:b/>
-              </w:rPr>
-            </w:pPr>
-            <w:r>
-              <w:rPr>
-                <w:rFonts w:eastAsia="Arial" w:cstheme="minorHAnsi"/>
-                <w:b/>
-                <w:color w:val="010101"/>
-              </w:rPr>
-              <w:t>Email</w:t>
-            </w:r>
-            <w:r>
-              <w:rPr>
-                <w:rFonts w:eastAsia="Arial" w:cstheme="minorHAnsi"/>
-                <w:b/>
-                <w:color w:val="010101"/>
-                <w:spacing w:val="25"/>
-              </w:rPr>
-              <w:t xml:space="preserve"> </w:t>
-            </w:r>
-            <w:r>
-              <w:rPr>
-                <w:rFonts w:eastAsia="Arial" w:cstheme="minorHAnsi"/>
-                <w:b/>
-                <w:color w:val="010101"/>
-                <w:w w:val="103"/>
-              </w:rPr>
-              <w:t>Address</w:t>
-            </w:r>
-          </w:p>
-        </w:tc>
-        <w:tc>
-          <w:tcPr>
-            <w:tcW w:w="8726" w:type="dxa"/>
-            <w:gridSpan w:val="6"/>
-            <w:tcBorders>
-              <w:top w:val="single" w:sz="2" w:space="0" w:color="000000"/>
-              <w:left w:val="single" w:sz="2" w:space="0" w:color="000000"/>
-              <w:bottom w:val="single" w:sz="2" w:space="0" w:color="000000"/>
-              <w:right w:val="single" w:sz="2" w:space="0" w:color="000000"/>
-            </w:tcBorders>
-          </w:tcPr>
-          <w:p>
-            <w:pPr>
-              <w:spacing w:after="0" w:line="240" w:lineRule="auto"/>
-              <w:rPr>
-                <w:rFonts w:cstheme="minorHAnsi"/>
-              </w:rPr>
-            </w:pPr>
-            <w:r>
-              <w:rPr>
-                <w:rFonts w:cstheme="minorHAnsi"/>
-              </w:rPr>
-              <w:t xml:space="preserve"> </w:t>
-            </w:r>
-          </w:p>
-        </w:tc>
-      </w:tr>
-    </w:tbl>
-    <w:p>
-      <w:pPr>
-        <w:spacing w:after="0"/>
-      </w:pPr>
-    </w:p>
-    <w:p>
-      <w:pPr>
-        <w:spacing w:after="0" w:line="240" w:lineRule="auto"/>
-        <w:ind w:left="144"/>
-        <w:rPr>
-          <w:rFonts w:cstheme="minorHAnsi"/>
-          <w:b/>
-          <w:sz w:val="28"/>
-          <w:szCs w:val="28"/>
-        </w:rPr>
-      </w:pPr>
-      <w:r>
-        <w:rPr>
-          <w:rFonts w:cstheme="minorHAnsi"/>
-          <w:b/>
-          <w:sz w:val="28"/>
-          <w:szCs w:val="28"/>
-        </w:rPr>
-        <w:t>Signature:</w:t>
-      </w:r>
-    </w:p>
-    <w:tbl>
-      <w:tblPr>
-        <w:tblStyle w:val="TableGrid"/>
-        <w:tblW w:w="0" w:type="auto"/>
-        <w:tblInd w:w="85" w:type="dxa"/>
-        <w:tblLook w:val="04A0" w:firstRow="1" w:lastRow="0" w:firstColumn="1" w:lastColumn="0" w:noHBand="0" w:noVBand="1"/>
-      </w:tblPr>
-      <w:tblGrid>
-        <w:gridCol w:w="1455"/>
-        <w:gridCol w:w="1974"/>
-        <w:gridCol w:w="1242"/>
-        <w:gridCol w:w="2923"/>
-        <w:gridCol w:w="1437"/>
-        <w:gridCol w:w="1874"/>
-      </w:tblGrid>
-      <w:tr>
-        <w:trPr>
-          <w:cantSplit/>
-          <w:trHeight w:val="2179"/>
-        </w:trPr>
-        <w:tc>
-          <w:tcPr>
-            <w:tcW w:w="10905" w:type="dxa"/>
-            <w:gridSpan w:val="6"/>
-            <w:vAlign w:val="center"/>
-          </w:tcPr>
-          <w:p>
-            <w:pPr>
-              <w:ind w:right="-144"/>
-              <w:rPr>
-                <w:rFonts w:cstheme="minorHAnsi"/>
-                <w:b/>
-                <w:sz w:val="20"/>
-                <w:szCs w:val="20"/>
-              </w:rPr>
-            </w:pPr>
-            <w:r>
-              <w:rPr>
-                <w:rFonts w:cstheme="minorHAnsi"/>
-                <w:b/>
-                <w:sz w:val="20"/>
-                <w:szCs w:val="20"/>
-              </w:rPr>
-              <w:t xml:space="preserve">NOTE: </w:t>
-            </w:r>
-            <w:r>
-              <w:rPr>
-                <w:rFonts w:cstheme="minorHAnsi"/>
-                <w:sz w:val="20"/>
-                <w:szCs w:val="20"/>
-              </w:rPr>
-              <w:t xml:space="preserve">This Application Data Sheet must be signed in accordance with 37 CFR 1.33(b). </w:t>
-            </w:r>
-            <w:r>
-              <w:rPr>
-                <w:rFonts w:cstheme="minorHAnsi"/>
-                <w:b/>
-                <w:sz w:val="20"/>
-                <w:szCs w:val="20"/>
-              </w:rPr>
-              <w:t xml:space="preserve">However, if this Application </w:t>
-            </w:r>
-            <w:r>
-              <w:rPr>
-                <w:rFonts w:cstheme="minorHAnsi"/>
-                <w:b/>
-                <w:sz w:val="20"/>
-                <w:szCs w:val="20"/>
-              </w:rPr>
-              <w:t xml:space="preserve">Data Sheet is submitted with the </w:t>
-            </w:r>
-            <w:r>
-              <w:rPr>
-                <w:rFonts w:cstheme="minorHAnsi"/>
-                <w:b/>
-                <w:sz w:val="20"/>
-                <w:szCs w:val="20"/>
-                <w:u w:val="single"/>
-              </w:rPr>
-              <w:t>INITIAL</w:t>
-            </w:r>
-            <w:r>
-              <w:rPr>
-                <w:rFonts w:cstheme="minorHAnsi"/>
-                <w:b/>
-                <w:sz w:val="20"/>
-                <w:szCs w:val="20"/>
-              </w:rPr>
-              <w:t xml:space="preserve"> filing of the application </w:t>
-            </w:r>
-            <w:r>
-              <w:rPr>
-                <w:rFonts w:cstheme="minorHAnsi"/>
-                <w:b/>
-                <w:sz w:val="20"/>
-                <w:szCs w:val="20"/>
-                <w:u w:val="single"/>
-              </w:rPr>
-              <w:t>and</w:t>
-            </w:r>
-            <w:r>
-              <w:rPr>
-                <w:rFonts w:cstheme="minorHAnsi"/>
-                <w:b/>
-                <w:sz w:val="20"/>
-                <w:szCs w:val="20"/>
-              </w:rPr>
-              <w:t xml:space="preserve"> eith</w:t>
-            </w:r>
-            <w:r>
-              <w:rPr>
-                <w:rFonts w:cstheme="minorHAnsi"/>
-                <w:b/>
-                <w:sz w:val="20"/>
-                <w:szCs w:val="20"/>
-              </w:rPr>
-              <w:t xml:space="preserve">er box A or B is </w:t>
-            </w:r>
-            <w:r>
-              <w:rPr>
-                <w:rFonts w:cstheme="minorHAnsi"/>
-                <w:b/>
-                <w:sz w:val="20"/>
-                <w:szCs w:val="20"/>
-                <w:u w:val="single"/>
-              </w:rPr>
-              <w:t>not</w:t>
-            </w:r>
-            <w:r>
-              <w:rPr>
-                <w:rFonts w:cstheme="minorHAnsi"/>
-                <w:b/>
-                <w:sz w:val="20"/>
-                <w:szCs w:val="20"/>
-              </w:rPr>
-              <w:t xml:space="preserve"> checked in </w:t>
-            </w:r>
-            <w:r>
-              <w:rPr>
-                <w:rFonts w:cstheme="minorHAnsi"/>
-                <w:b/>
-                <w:sz w:val="20"/>
-                <w:szCs w:val="20"/>
-              </w:rPr>
-              <w:t>subsection 2 of the “Authorization or Opt-Out of Authorization to Permit Acces</w:t>
-            </w:r>
-            <w:r>
-              <w:rPr>
-                <w:rFonts w:cstheme="minorHAnsi"/>
-                <w:b/>
-                <w:sz w:val="20"/>
-                <w:szCs w:val="20"/>
-              </w:rPr>
-              <w:t xml:space="preserve">s” section, then this form must </w:t>
-            </w:r>
-            <w:r>
-              <w:rPr>
-                <w:rFonts w:cstheme="minorHAnsi"/>
-                <w:b/>
-                <w:sz w:val="20"/>
-                <w:szCs w:val="20"/>
-              </w:rPr>
-              <w:t>also be signed in accordance with 37 CFR 1.14(c).</w:t>
-            </w:r>
-          </w:p>
-          <w:p>
-            <w:pPr>
-              <w:ind w:right="-144"/>
-              <w:rPr>
-                <w:rFonts w:cstheme="minorHAnsi"/>
-                <w:sz w:val="20"/>
-                <w:szCs w:val="20"/>
-              </w:rPr>
-            </w:pPr>
-            <w:r>
-              <w:rPr>
-                <w:rFonts w:cstheme="minorHAnsi"/>
-                <w:sz w:val="20"/>
-                <w:szCs w:val="20"/>
-              </w:rPr>
-              <w:t xml:space="preserve">           </w:t>
-            </w:r>
-            <w:r>
-              <w:rPr>
-                <w:rFonts w:cstheme="minorHAnsi"/>
-                <w:sz w:val="20"/>
-                <w:szCs w:val="20"/>
-              </w:rPr>
-              <w:t>This Application Data Sheet</w:t>
-            </w:r>
-            <w:r>
-              <w:rPr>
-                <w:rFonts w:cstheme="minorHAnsi"/>
-                <w:b/>
-                <w:sz w:val="20"/>
-                <w:szCs w:val="20"/>
-              </w:rPr>
-              <w:t xml:space="preserve"> must </w:t>
-            </w:r>
-            <w:r>
-              <w:rPr>
-                <w:rFonts w:cstheme="minorHAnsi"/>
-                <w:sz w:val="20"/>
-                <w:szCs w:val="20"/>
-              </w:rPr>
-              <w:t xml:space="preserve">be signed by a patent practitioner if one or more of the applicants is </w:t>
-            </w:r>
-            <w:r>
-              <w:rPr>
-                <w:rFonts w:cstheme="minorHAnsi"/>
-                <w:b/>
-                <w:sz w:val="20"/>
-                <w:szCs w:val="20"/>
-              </w:rPr>
-              <w:t>a juristic entity</w:t>
-            </w:r>
-            <w:r>
-              <w:rPr>
-                <w:rFonts w:cstheme="minorHAnsi"/>
-                <w:sz w:val="20"/>
-                <w:szCs w:val="20"/>
-              </w:rPr>
-              <w:t xml:space="preserve"> (e.g., corporation or association). If the applicant is two or more joint inventors, this form must be signed by a patent practitioner,</w:t>
-            </w:r>
-            <w:r>
-              <w:rPr>
-                <w:rFonts w:cstheme="minorHAnsi"/>
-                <w:b/>
-                <w:sz w:val="20"/>
-                <w:szCs w:val="20"/>
-              </w:rPr>
-              <w:t xml:space="preserve"> </w:t>
-            </w:r>
-            <w:r>
-              <w:rPr>
-                <w:rFonts w:cstheme="minorHAnsi"/>
-                <w:b/>
-                <w:sz w:val="20"/>
-                <w:szCs w:val="20"/>
-                <w:u w:val="single"/>
-              </w:rPr>
-              <w:t>all</w:t>
-            </w:r>
-            <w:r>
-              <w:rPr>
-                <w:rFonts w:cstheme="minorHAnsi"/>
-                <w:b/>
-                <w:sz w:val="20"/>
-                <w:szCs w:val="20"/>
-              </w:rPr>
-              <w:t xml:space="preserve"> </w:t>
-            </w:r>
-            <w:r>
-              <w:rPr>
-                <w:rFonts w:cstheme="minorHAnsi"/>
-                <w:sz w:val="20"/>
-                <w:szCs w:val="20"/>
-              </w:rPr>
-              <w:t xml:space="preserve">joint inventors who are the applicant, or one or more joint inventor-applicants who have been given power of attorney (e.g., see USPTO Form PTO/AIA/81) on behalf of </w:t>
-            </w:r>
-            <w:r>
-              <w:rPr>
-                <w:rFonts w:cstheme="minorHAnsi"/>
-                <w:b/>
-                <w:sz w:val="20"/>
-                <w:szCs w:val="20"/>
-                <w:u w:val="single"/>
-              </w:rPr>
-              <w:t>all</w:t>
-            </w:r>
-            <w:r>
-              <w:rPr>
-                <w:rFonts w:cstheme="minorHAnsi"/>
-                <w:b/>
-                <w:sz w:val="20"/>
-                <w:szCs w:val="20"/>
-              </w:rPr>
-              <w:t xml:space="preserve"> </w:t>
-            </w:r>
-            <w:r>
-              <w:rPr>
-                <w:rFonts w:cstheme="minorHAnsi"/>
-                <w:sz w:val="20"/>
-                <w:szCs w:val="20"/>
-              </w:rPr>
-              <w:t xml:space="preserve">joint inventor-applicants. </w:t>
-            </w:r>
-          </w:p>
-          <w:p>
-            <w:pPr>
-              <w:ind w:right="-144"/>
-              <w:rPr>
-                <w:rFonts w:cstheme="minorHAnsi"/>
-                <w:b/>
-                <w:sz w:val="20"/>
-                <w:szCs w:val="20"/>
-              </w:rPr>
-            </w:pPr>
-            <w:r>
-              <w:rPr>
-                <w:rFonts w:cstheme="minorHAnsi"/>
-                <w:sz w:val="20"/>
-                <w:szCs w:val="20"/>
-              </w:rPr>
-              <w:t xml:space="preserve">            </w:t>
-            </w:r>
-            <w:r>
-              <w:rPr>
-                <w:rFonts w:cstheme="minorHAnsi"/>
-                <w:sz w:val="20"/>
-                <w:szCs w:val="20"/>
-              </w:rPr>
-              <w:t>See 37 CFR 1.4(d) for the manner of making signatures and certifications.</w:t>
-            </w:r>
-          </w:p>
-        </w:tc>
-      </w:tr>
-      <w:tr>
-        <w:trPr>
-          <w:cantSplit/>
-          <w:trHeight w:val="439"/>
-        </w:trPr>
-        <w:tc>
-          <w:tcPr>
-            <w:tcW w:w="1455" w:type="dxa"/>
-            <w:vAlign w:val="center"/>
-          </w:tcPr>
-          <w:p>
-            <w:pPr>
-              <w:ind w:left="43"/>
-              <w:rPr>
-                <w:rFonts w:cstheme="minorHAnsi"/>
-                <w:b/>
-              </w:rPr>
-            </w:pPr>
-            <w:r>
-              <w:rPr>
-                <w:rFonts w:cstheme="minorHAnsi"/>
-                <w:b/>
-              </w:rPr>
-              <w:t>Signature</w:t>
-            </w:r>
-          </w:p>
-        </w:tc>
-        <w:tc>
-          <w:tcPr>
-            <w:tcW w:w="6139" w:type="dxa"/>
-            <w:gridSpan w:val="3"/>
-            <w:vAlign w:val="center"/>
-          </w:tcPr>
-          <w:p>
-            <w:pPr>
-              <w:spacing w:line="200" w:lineRule="exact"/>
-              <w:ind w:left="43"/>
-              <w:rPr>
-                <w:rFonts w:cstheme="minorHAnsi"/>
-              </w:rPr>
-            </w:pPr>
-            <w:r>
-              <w:rPr>
-                <w:rFonts w:ascii="Times New Roman" w:hAnsi="Times New Roman" w:cs="Times New Roman"/>
-                <w:sz w:val="24"/>
-                <w:szCs w:val="24"/>
-              </w:rPr>
-              <w:t xml:space="preserve"> </w:t>
-            </w:r>
-            <w:r>
-              <w:rPr>
-                <w:rFonts w:ascii="Times New Roman" w:hAnsi="Times New Roman" w:cs="Times New Roman"/>
-                <w:sz w:val="24"/>
-                <w:szCs w:val="24"/>
-              </w:rPr>
-              <w:t>&lt;&lt;echoSignature&gt;&gt;</w:t>
-            </w:r>
-          </w:p>
-        </w:tc>
-        <w:tc>
-          <w:tcPr>
-            <w:tcW w:w="1437" w:type="dxa"/>
-          </w:tcPr>
-          <w:p>
-            <w:pPr>
-              <w:ind w:left="43"/>
-              <w:rPr>
-                <w:rFonts w:cstheme="minorHAnsi"/>
-                <w:sz w:val="18"/>
-                <w:szCs w:val="18"/>
-              </w:rPr>
-            </w:pPr>
-            <w:proofErr w:type="gramStart"/>
-            <w:r>
-              <w:rPr>
-                <w:rFonts w:eastAsia="Arial" w:cstheme="minorHAnsi"/>
-                <w:b/>
-                <w:color w:val="010101"/>
-              </w:rPr>
-              <w:t xml:space="preserve">Date </w:t>
-            </w:r>
-            <w:r>
-              <w:rPr>
-                <w:rFonts w:eastAsia="Arial" w:cstheme="minorHAnsi"/>
-                <w:b/>
-                <w:color w:val="010101"/>
-                <w:spacing w:val="28"/>
-              </w:rPr>
-              <w:t xml:space="preserve"> </w:t>
-            </w:r>
-            <w:r>
-              <w:rPr>
-                <w:rFonts w:eastAsia="Arial" w:cstheme="minorHAnsi"/>
-                <w:b/>
-                <w:color w:val="010101"/>
-                <w:w w:val="104"/>
-              </w:rPr>
-              <w:t>(</w:t>
-            </w:r>
-            <w:proofErr w:type="gramEnd"/>
-            <w:r>
-              <w:rPr>
-                <w:rFonts w:eastAsia="Arial" w:cstheme="minorHAnsi"/>
-                <w:b/>
-                <w:color w:val="010101"/>
-                <w:w w:val="103"/>
-              </w:rPr>
-              <w:t>YYYY-MM-DD</w:t>
-            </w:r>
-            <w:r>
-              <w:rPr>
-                <w:rFonts w:eastAsia="Arial" w:cstheme="minorHAnsi"/>
-                <w:b/>
-                <w:color w:val="010101"/>
-                <w:w w:val="104"/>
-              </w:rPr>
-              <w:t>)</w:t>
-            </w:r>
-          </w:p>
-        </w:tc>
-        <w:tc>
-          <w:tcPr>
-            <w:tcW w:w="1874" w:type="dxa"/>
-            <w:vAlign w:val="center"/>
-          </w:tcPr>
-          <w:p>
-            <w:pPr>
-              <w:spacing w:line="200" w:lineRule="exact"/>
-              <w:jc w:val="center"/>
-              <w:rPr>
-                <w:rFonts w:cstheme="minorHAnsi"/>
-              </w:rPr>
-            </w:pPr>
-          </w:p>
-        </w:tc>
-      </w:tr>
-      <w:tr>
-        <w:trPr>
-          <w:cantSplit/>
-          <w:trHeight w:val="439"/>
-        </w:trPr>
-        <w:tc>
-          <w:tcPr>
-            <w:tcW w:w="1455" w:type="dxa"/>
-            <w:vAlign w:val="center"/>
-          </w:tcPr>
-          <w:p>
-            <w:pPr>
-              <w:ind w:left="43"/>
-              <w:rPr>
-                <w:rFonts w:cstheme="minorHAnsi"/>
-                <w:b/>
-              </w:rPr>
-            </w:pPr>
-            <w:r>
-              <w:rPr>
-                <w:rFonts w:cstheme="minorHAnsi"/>
-                <w:b/>
-              </w:rPr>
-              <w:t>First Name</w:t>
-            </w:r>
-          </w:p>
-        </w:tc>
-        <w:tc>
-          <w:tcPr>
-            <w:tcW w:w="1974" w:type="dxa"/>
-            <w:vAlign w:val="center"/>
-          </w:tcPr>
-          <w:p>
-            <w:pPr>
-              <w:ind w:left="14"/>
-              <w:rPr>
-                <w:rFonts w:cstheme="minorHAnsi"/>
-                <w:sz w:val="18"/>
-                <w:szCs w:val="18"/>
-              </w:rPr>
-            </w:pPr>
-            <w:r>
-              <w:t>&lt;&lt;SAFirstName&gt;&gt;</w:t>
-            </w:r>
-          </w:p>
-        </w:tc>
-        <w:tc>
-          <w:tcPr>
-            <w:tcW w:w="1242" w:type="dxa"/>
-            <w:vAlign w:val="center"/>
-          </w:tcPr>
-          <w:p>
-            <w:pPr>
-              <w:ind w:left="43"/>
-              <w:rPr>
-                <w:rFonts w:cstheme="minorHAnsi"/>
-                <w:b/>
-              </w:rPr>
-            </w:pPr>
-            <w:r>
-              <w:rPr>
-                <w:rFonts w:cstheme="minorHAnsi"/>
-                <w:b/>
-              </w:rPr>
-              <w:t>Last Name</w:t>
-            </w:r>
-          </w:p>
-        </w:tc>
-        <w:tc>
-          <w:tcPr>
-            <w:tcW w:w="2923" w:type="dxa"/>
-            <w:vAlign w:val="center"/>
-          </w:tcPr>
-          <w:p>
-            <w:pPr>
-              <w:ind w:left="14"/>
-              <w:rPr>
-                <w:rFonts w:cstheme="minorHAnsi"/>
-                <w:sz w:val="18"/>
-                <w:szCs w:val="18"/>
-              </w:rPr>
-            </w:pPr>
-            <w:r>
-              <w:t>&lt;&lt;SALastName&gt;&gt;</w:t>
-            </w:r>
-          </w:p>
-        </w:tc>
-        <w:tc>
-          <w:tcPr>
-            <w:tcW w:w="1437" w:type="dxa"/>
-            <w:vAlign w:val="center"/>
-          </w:tcPr>
-          <w:p>
-            <w:pPr>
-              <w:ind w:left="43"/>
-              <w:rPr>
-                <w:rFonts w:cstheme="minorHAnsi"/>
-                <w:sz w:val="18"/>
-                <w:szCs w:val="18"/>
-              </w:rPr>
-            </w:pPr>
-            <w:r>
-              <w:rPr>
-                <w:b/>
-              </w:rPr>
-              <w:t>Registration Number</w:t>
-            </w:r>
-          </w:p>
-        </w:tc>
-        <w:tc>
-          <w:tcPr>
-            <w:tcW w:w="1874" w:type="dxa"/>
-            <w:vAlign w:val="center"/>
-          </w:tcPr>
-          <w:p>
-            <w:pPr>
-              <w:ind w:left="14"/>
-              <w:rPr>
-                <w:rFonts w:cstheme="minorHAnsi"/>
-                <w:sz w:val="18"/>
-                <w:szCs w:val="18"/>
-              </w:rPr>
-            </w:pPr>
-            <w:r>
-              <w:t>&lt;&lt;SARegNo&gt;&gt;</w:t>
-            </w:r>
-          </w:p>
-        </w:tc>
-      </w:tr>
-    </w:tbl>
-    <w:p>
-      <w:pPr>
-        <w:spacing w:after="0" w:line="200" w:lineRule="exact"/>
-        <w:rPr>
-          <w:rFonts w:cstheme="minorHAnsi"/>
-          <w:sz w:val="18"/>
-          <w:szCs w:val="18"/>
-        </w:rPr>
-      </w:pPr>
-    </w:p>
-    <w:p>
-      <w:pPr>
-        <w:widowControl/>
-        <w:autoSpaceDE w:val="0"/>
-        <w:autoSpaceDN w:val="0"/>
-        <w:adjustRightInd w:val="0"/>
-        <w:spacing w:after="0" w:line="240" w:lineRule="auto"/>
-        <w:rPr>
-          <w:rFonts w:cstheme="minorHAnsi"/>
-          <w:sz w:val="20"/>
-          <w:szCs w:val="20"/>
-        </w:rPr>
-      </w:pPr>
-      <w:r>
-        <w:rPr>
-          <w:rFonts w:cstheme="minorHAnsi"/>
-          <w:sz w:val="20"/>
-          <w:szCs w:val="20"/>
-        </w:rPr>
-        <w:t>This collection of information is required by 37 CFR 1.76. The information is required to obtain or retain a benefit by the public which is to file (and by the USPTO to process) an application. Confidentiality is governed by 35 U.S.C. 122 and 37 CFR 1.14. This collection is estimated to take 23 minutes to complete, including gathering, preparing, and submitting the completed application data sheet form to the USPTO. Time will vary depending upon the individual case. Any comments on the amount of time you require to complete this form and/or suggestions for reducing this burden, should be sent to the Chief Information Officer, U.S. Patent and</w:t>
-      </w:r>
-    </w:p>
-    <w:p>
-      <w:pPr>
-        <w:widowControl/>
-        <w:autoSpaceDE w:val="0"/>
-        <w:autoSpaceDN w:val="0"/>
-        <w:adjustRightInd w:val="0"/>
-        <w:spacing w:after="0" w:line="240" w:lineRule="auto"/>
-        <w:rPr>
-          <w:rFonts w:cstheme="minorHAnsi"/>
-          <w:b/>
-          <w:sz w:val="20"/>
-          <w:szCs w:val="20"/>
-        </w:rPr>
-      </w:pPr>
-      <w:r>
-        <w:rPr>
-          <w:rFonts w:cstheme="minorHAnsi"/>
-          <w:sz w:val="20"/>
-          <w:szCs w:val="20"/>
-        </w:rPr>
-        <w:t xml:space="preserve">Trademark Office, U.S. Department of Commerce, P.O. Box 1450, Alexandria, VA 22313-1450. DO NOT SEND FEES OR COMPLETED FORMS TO THIS ADDRESS. </w:t>
-      </w:r>
-      <w:r>
-        <w:rPr>
-          <w:rFonts w:cstheme="minorHAnsi"/>
-          <w:b/>
-          <w:sz w:val="20"/>
-          <w:szCs w:val="20"/>
-        </w:rPr>
-        <w:t>SEND TO: Commissioner for Patents, P.O. Box</w:t>
-      </w:r>
-      <w:r>
-        <w:rPr>
-          <w:rFonts w:cstheme="minorHAnsi"/>
-          <w:b/>
-          <w:sz w:val="20"/>
-          <w:szCs w:val="20"/>
-        </w:rPr>
-        <w:t xml:space="preserve"> 1450, Alexandria, VA 22313-14</w:t>
-      </w:r>
     </w:p>
     <w:sectPr>
       <w:headerReference w:type="even" r:id="rId8"/>

</xml_diff>

<commit_message>
Updated multiple merge functions. ADS/UADS merges. GeneralxmitCF.
</commit_message>
<xml_diff>
--- a/project/documents/formaldocuments/ApplicationDataSheet_NEW2.docx
+++ b/project/documents/formaldocuments/ApplicationDataSheet_NEW2.docx
@@ -759,17 +759,27 @@
               <w:ind w:left="43"/>
               <w:rPr>
                 <w:rFonts w:cstheme="minorHAnsi"/>
+                <w:u w:val="single"/>
               </w:rPr>
             </w:pPr>
             <w:r>
+              <w:rPr>
+                <w:u w:val="single"/>
+              </w:rPr>
               <w:t>&lt;&lt;</w:t>
             </w:r>
             <w:proofErr w:type="spellStart"/>
             <w:r>
+              <w:rPr>
+                <w:u w:val="single"/>
+              </w:rPr>
               <w:t>custNoCorresp</w:t>
             </w:r>
             <w:proofErr w:type="spellEnd"/>
             <w:r>
+              <w:rPr>
+                <w:u w:val="single"/>
+              </w:rPr>
               <w:t>&gt;&gt;</w:t>
             </w:r>
           </w:p>
@@ -843,13 +853,31 @@
               <w:ind w:left="43"/>
               <w:rPr>
                 <w:rFonts w:cstheme="minorHAnsi"/>
+                <w:u w:val="single"/>
               </w:rPr>
             </w:pPr>
             <w:r>
               <w:rPr>
                 <w:rFonts w:cstheme="minorHAnsi"/>
-              </w:rPr>
-              <w:t>request@slwip.com</w:t>
+                <w:u w:val="single"/>
+              </w:rPr>
+              <w:t>&lt;&lt;</w:t>
+            </w:r>
+            <w:proofErr w:type="spellStart"/>
+            <w:r>
+              <w:rPr>
+                <w:rFonts w:cstheme="minorHAnsi"/>
+                <w:u w:val="single"/>
+              </w:rPr>
+              <w:t>custNoEmail</w:t>
+            </w:r>
+            <w:proofErr w:type="spellEnd"/>
+            <w:r>
+              <w:rPr>
+                <w:rFonts w:cstheme="minorHAnsi"/>
+                <w:u w:val="single"/>
+              </w:rPr>
+              <w:t>&gt;&gt;</w:t>
             </w:r>
           </w:p>
         </w:tc>
@@ -1031,13 +1059,38 @@
               <w:ind w:left="43"/>
               <w:rPr>
                 <w:rFonts w:cstheme="minorHAnsi"/>
+                <w:u w:val="single"/>
               </w:rPr>
             </w:pPr>
             <w:r>
               <w:rPr>
                 <w:rFonts w:cstheme="minorHAnsi"/>
-              </w:rPr>
-              <w:t>&lt;&lt;title&gt;&gt;</w:t>
+                <w:u w:val="single"/>
+              </w:rPr>
+              <w:t>&lt;&lt;</w:t>
+            </w:r>
+            <w:proofErr w:type="spellStart"/>
+            <w:r>
+              <w:rPr>
+                <w:rFonts w:cstheme="minorHAnsi"/>
+                <w:u w:val="single"/>
+              </w:rPr>
+              <w:t>app</w:t>
+            </w:r>
+            <w:r>
+              <w:rPr>
+                <w:rFonts w:cstheme="minorHAnsi"/>
+                <w:u w:val="single"/>
+              </w:rPr>
+              <w:t>title</w:t>
+            </w:r>
+            <w:proofErr w:type="spellEnd"/>
+            <w:r>
+              <w:rPr>
+                <w:rFonts w:cstheme="minorHAnsi"/>
+                <w:u w:val="single"/>
+              </w:rPr>
+              <w:t>&gt;&gt;</w:t>
             </w:r>
           </w:p>
         </w:tc>
@@ -1130,11 +1183,13 @@
               <w:ind w:left="43"/>
               <w:rPr>
                 <w:rFonts w:eastAsia="Arial" w:cstheme="minorHAnsi"/>
+                <w:u w:val="single"/>
               </w:rPr>
             </w:pPr>
             <w:r>
               <w:rPr>
                 <w:rFonts w:eastAsia="Arial" w:cstheme="minorHAnsi"/>
+                <w:u w:val="single"/>
               </w:rPr>
               <w:t>&lt;&lt;</w:t>
             </w:r>
@@ -1142,6 +1197,14 @@
             <w:r>
               <w:rPr>
                 <w:rFonts w:eastAsia="Arial" w:cstheme="minorHAnsi"/>
+                <w:u w:val="single"/>
+              </w:rPr>
+              <w:t>app</w:t>
+            </w:r>
+            <w:r>
+              <w:rPr>
+                <w:rFonts w:eastAsia="Arial" w:cstheme="minorHAnsi"/>
+                <w:u w:val="single"/>
               </w:rPr>
               <w:t>matterNo</w:t>
             </w:r>
@@ -1149,6 +1212,7 @@
             <w:r>
               <w:rPr>
                 <w:rFonts w:eastAsia="Arial" w:cstheme="minorHAnsi"/>
+                <w:u w:val="single"/>
               </w:rPr>
               <w:t>&gt;&gt;</w:t>
             </w:r>
@@ -1286,14 +1350,34 @@
               <w:rPr>
                 <w:rFonts w:eastAsia="Arial" w:cstheme="minorHAnsi"/>
                 <w:bCs/>
+                <w:u w:val="single"/>
               </w:rPr>
             </w:pPr>
             <w:r>
               <w:rPr>
                 <w:rFonts w:eastAsia="Arial" w:cstheme="minorHAnsi"/>
                 <w:bCs/>
-              </w:rPr>
-              <w:t>Non-Provisional</w:t>
+                <w:u w:val="single"/>
+              </w:rPr>
+              <w:t>&lt;&lt;</w:t>
+            </w:r>
+            <w:proofErr w:type="spellStart"/>
+            <w:r>
+              <w:rPr>
+                <w:rFonts w:eastAsia="Arial" w:cstheme="minorHAnsi"/>
+                <w:bCs/>
+                <w:u w:val="single"/>
+              </w:rPr>
+              <w:t>appprov</w:t>
+            </w:r>
+            <w:proofErr w:type="spellEnd"/>
+            <w:r>
+              <w:rPr>
+                <w:rFonts w:eastAsia="Arial" w:cstheme="minorHAnsi"/>
+                <w:bCs/>
+                <w:u w:val="single"/>
+              </w:rPr>
+              <w:t>&gt;&gt;</w:t>
             </w:r>
           </w:p>
         </w:tc>
@@ -1354,11 +1438,13 @@
               <w:rPr>
                 <w:rFonts w:eastAsia="Arial" w:cstheme="minorHAnsi"/>
                 <w:bCs/>
+                <w:u w:val="single"/>
               </w:rPr>
             </w:pPr>
             <w:r>
               <w:rPr>
                 <w:rFonts w:cs="Arial"/>
+                <w:u w:val="single"/>
               </w:rPr>
               <w:t>&lt;&lt;</w:t>
             </w:r>
@@ -1366,6 +1452,14 @@
             <w:r>
               <w:rPr>
                 <w:rFonts w:cs="Arial"/>
+                <w:u w:val="single"/>
+              </w:rPr>
+              <w:t>app</w:t>
+            </w:r>
+            <w:r>
+              <w:rPr>
+                <w:rFonts w:cs="Arial"/>
+                <w:u w:val="single"/>
               </w:rPr>
               <w:t>matterType</w:t>
             </w:r>
@@ -1373,6 +1467,7 @@
             <w:r>
               <w:rPr>
                 <w:rFonts w:cs="Arial"/>
+                <w:u w:val="single"/>
               </w:rPr>
               <w:t>&gt;&gt;</w:t>
             </w:r>
@@ -1434,11 +1529,13 @@
               <w:ind w:left="43" w:right="-144"/>
               <w:rPr>
                 <w:rFonts w:eastAsia="Arial" w:cstheme="minorHAnsi"/>
+                <w:u w:val="single"/>
               </w:rPr>
             </w:pPr>
             <w:r>
               <w:rPr>
                 <w:rFonts w:eastAsia="Arial" w:cstheme="minorHAnsi"/>
+                <w:u w:val="single"/>
               </w:rPr>
               <w:t>&lt;&lt;</w:t>
             </w:r>
@@ -1446,6 +1543,7 @@
             <w:r>
               <w:rPr>
                 <w:rFonts w:cs="Arial"/>
+                <w:u w:val="single"/>
               </w:rPr>
               <w:t>drawingSheets</w:t>
             </w:r>
@@ -1453,6 +1551,7 @@
             <w:r>
               <w:rPr>
                 <w:rFonts w:cs="Arial"/>
+                <w:u w:val="single"/>
               </w:rPr>
               <w:t>&gt;&gt;</w:t>
             </w:r>
@@ -2044,6 +2143,7 @@
               </w:rPr>
               <w:t xml:space="preserve">  </w:t>
             </w:r>
+            <w:proofErr w:type="gramStart"/>
             <w:r>
               <w:rPr>
                 <w:rFonts w:eastAsia="Arial" w:cstheme="minorHAnsi"/>
@@ -2086,6 +2186,7 @@
               </w:rPr>
               <w:t>Publication</w:t>
             </w:r>
+            <w:proofErr w:type="gramEnd"/>
             <w:r>
               <w:rPr>
                 <w:rFonts w:eastAsia="Arial" w:cstheme="minorHAnsi"/>
@@ -2624,7 +2725,31 @@
                 <w:sz w:val="20"/>
                 <w:szCs w:val="20"/>
               </w:rPr>
-              <w:t xml:space="preserve">having a power of attorney in </w:t>
+              <w:t xml:space="preserve">having </w:t>
+            </w:r>
+            <w:proofErr w:type="gramStart"/>
+            <w:r>
+              <w:rPr>
+                <w:rFonts w:eastAsia="Arial" w:cstheme="minorHAnsi"/>
+                <w:b/>
+                <w:color w:val="010101"/>
+                <w:position w:val="1"/>
+                <w:sz w:val="20"/>
+                <w:szCs w:val="20"/>
+              </w:rPr>
+              <w:t>a power</w:t>
+            </w:r>
+            <w:proofErr w:type="gramEnd"/>
+            <w:r>
+              <w:rPr>
+                <w:rFonts w:eastAsia="Arial" w:cstheme="minorHAnsi"/>
+                <w:b/>
+                <w:color w:val="010101"/>
+                <w:position w:val="1"/>
+                <w:sz w:val="20"/>
+                <w:szCs w:val="20"/>
+              </w:rPr>
+              <w:t xml:space="preserve"> of attorney in </w:t>
             </w:r>
             <w:r>
               <w:rPr>
@@ -2881,6 +3006,7 @@
               </w:rPr>
               <w:t xml:space="preserve"> </w:t>
             </w:r>
+            <w:proofErr w:type="gramStart"/>
             <w:r>
               <w:rPr>
                 <w:rFonts w:eastAsia="Arial" w:cstheme="minorHAnsi"/>
@@ -2912,6 +3038,7 @@
               </w:rPr>
               <w:t>power</w:t>
             </w:r>
+            <w:proofErr w:type="gramEnd"/>
             <w:r>
               <w:rPr>
                 <w:rFonts w:eastAsia="Arial" w:cstheme="minorHAnsi"/>
@@ -3773,7 +3900,7 @@
                 </w:rPr>
                 <w:id w:val="-670645325"/>
                 <w14:checkbox>
-                  <w14:checked w14:val="1"/>
+                  <w14:checked w14:val="0"/>
                   <w14:checkedState w14:val="2612" w14:font="MS Gothic"/>
                   <w14:uncheckedState w14:val="2610" w14:font="MS Gothic"/>
                 </w14:checkbox>
@@ -3787,7 +3914,7 @@
                     <w:sz w:val="24"/>
                     <w:szCs w:val="24"/>
                   </w:rPr>
-                  <w:t>☒</w:t>
+                  <w:t>☐</w:t>
                 </w:r>
               </w:sdtContent>
             </w:sdt>
@@ -4044,6 +4171,7 @@
             <w:pPr>
               <w:rPr>
                 <w:rFonts w:cstheme="minorHAnsi"/>
+                <w:u w:val="single"/>
               </w:rPr>
             </w:pPr>
             <w:r>
@@ -4056,14 +4184,23 @@
               <w:t xml:space="preserve"> </w:t>
             </w:r>
             <w:r>
+              <w:rPr>
+                <w:u w:val="single"/>
+              </w:rPr>
               <w:t>&lt;&lt;</w:t>
             </w:r>
             <w:proofErr w:type="spellStart"/>
             <w:r>
+              <w:rPr>
+                <w:u w:val="single"/>
+              </w:rPr>
               <w:t>custNoCorresp</w:t>
             </w:r>
             <w:proofErr w:type="spellEnd"/>
             <w:r>
+              <w:rPr>
+                <w:u w:val="single"/>
+              </w:rPr>
               <w:t>&gt;&gt;</w:t>
             </w:r>
           </w:p>
@@ -5338,390 +5475,6 @@
         </w:tc>
       </w:tr>
     </w:tbl>
-    <w:tbl>
-      <w:tblPr>
-        <w:tblStyle w:val="TableGrid"/>
-        <w:tblW w:w="10890" w:type="dxa"/>
-        <w:tblInd w:w="85" w:type="dxa"/>
-        <w:tblLook w:val="04A0" w:firstRow="1" w:lastRow="0" w:firstColumn="1" w:lastColumn="0" w:noHBand="0" w:noVBand="1"/>
-      </w:tblPr>
-      <w:tblGrid>
-        <w:gridCol w:w="2723"/>
-        <w:gridCol w:w="2970"/>
-        <w:gridCol w:w="2610"/>
-        <w:gridCol w:w="2587"/>
-      </w:tblGrid>
-      <w:tr>
-        <w:trPr>
-          <w:cantSplit/>
-          <w:trHeight w:val="406"/>
-        </w:trPr>
-        <w:tc>
-          <w:tcPr>
-            <w:tcW w:w="2723" w:type="dxa"/>
-            <w:vAlign w:val="center"/>
-          </w:tcPr>
-          <w:p>
-            <w:pPr>
-              <w:rPr>
-                <w:rFonts w:eastAsia="Arial" w:cstheme="minorHAnsi"/>
-                <w:b/>
-              </w:rPr>
-            </w:pPr>
-            <w:r>
-              <w:rPr>
-                <w:rFonts w:eastAsia="Arial" w:cstheme="minorHAnsi"/>
-                <w:b/>
-              </w:rPr>
-              <w:t>Prior Application Status</w:t>
-            </w:r>
-          </w:p>
-        </w:tc>
-        <w:tc>
-          <w:tcPr>
-            <w:tcW w:w="8167" w:type="dxa"/>
-            <w:gridSpan w:val="3"/>
-            <w:vAlign w:val="center"/>
-          </w:tcPr>
-          <w:p>
-            <w:pPr>
-              <w:ind w:left="43"/>
-              <w:rPr>
-                <w:rFonts w:eastAsia="Arial" w:cstheme="minorHAnsi"/>
-              </w:rPr>
-            </w:pPr>
-            <w:r>
-              <w:rPr>
-                <w:rFonts w:eastAsia="Arial" w:cstheme="minorHAnsi"/>
-              </w:rPr>
-              <w:t>(</w:t>
-            </w:r>
-            <w:r>
-              <w:rPr>
-                <w:rFonts w:eastAsia="Arial" w:cstheme="minorHAnsi"/>
-                <w:color w:val="FF0000"/>
-              </w:rPr>
-              <w:t xml:space="preserve">Please select one: </w:t>
-            </w:r>
-            <w:r>
-              <w:rPr>
-                <w:rFonts w:eastAsia="Arial" w:cstheme="minorHAnsi"/>
-              </w:rPr>
-              <w:t>Patented, Pending, Abandoned, Expired)</w:t>
-            </w:r>
-          </w:p>
-        </w:tc>
-      </w:tr>
-      <w:tr>
-        <w:trPr>
-          <w:cantSplit/>
-          <w:trHeight w:val="334"/>
-        </w:trPr>
-        <w:tc>
-          <w:tcPr>
-            <w:tcW w:w="2723" w:type="dxa"/>
-            <w:vAlign w:val="center"/>
-          </w:tcPr>
-          <w:p>
-            <w:pPr>
-              <w:jc w:val="center"/>
-              <w:rPr>
-                <w:rFonts w:eastAsia="Arial" w:cstheme="minorHAnsi"/>
-                <w:b/>
-              </w:rPr>
-            </w:pPr>
-            <w:r>
-              <w:rPr>
-                <w:rFonts w:eastAsia="Arial" w:cstheme="minorHAnsi"/>
-                <w:b/>
-                <w:color w:val="010101"/>
-              </w:rPr>
-              <w:t>Application</w:t>
-            </w:r>
-            <w:r>
-              <w:rPr>
-                <w:rFonts w:eastAsia="Arial" w:cstheme="minorHAnsi"/>
-                <w:b/>
-                <w:color w:val="010101"/>
-                <w:spacing w:val="28"/>
-              </w:rPr>
-              <w:t xml:space="preserve"> </w:t>
-            </w:r>
-            <w:r>
-              <w:rPr>
-                <w:rFonts w:eastAsia="Arial" w:cstheme="minorHAnsi"/>
-                <w:b/>
-                <w:color w:val="010101"/>
-                <w:w w:val="106"/>
-              </w:rPr>
-              <w:t>Number</w:t>
-            </w:r>
-          </w:p>
-        </w:tc>
-        <w:tc>
-          <w:tcPr>
-            <w:tcW w:w="2970" w:type="dxa"/>
-            <w:vAlign w:val="center"/>
-          </w:tcPr>
-          <w:p>
-            <w:pPr>
-              <w:jc w:val="center"/>
-              <w:rPr>
-                <w:rFonts w:eastAsia="Arial" w:cstheme="minorHAnsi"/>
-                <w:b/>
-              </w:rPr>
-            </w:pPr>
-            <w:r>
-              <w:rPr>
-                <w:rFonts w:eastAsia="Arial" w:cstheme="minorHAnsi"/>
-                <w:b/>
-                <w:color w:val="010101"/>
-              </w:rPr>
-              <w:t>Continuity</w:t>
-            </w:r>
-            <w:r>
-              <w:rPr>
-                <w:rFonts w:eastAsia="Arial" w:cstheme="minorHAnsi"/>
-                <w:b/>
-                <w:color w:val="010101"/>
-                <w:spacing w:val="33"/>
-              </w:rPr>
-              <w:t xml:space="preserve"> </w:t>
-            </w:r>
-            <w:r>
-              <w:rPr>
-                <w:rFonts w:eastAsia="Arial" w:cstheme="minorHAnsi"/>
-                <w:b/>
-                <w:color w:val="010101"/>
-                <w:w w:val="106"/>
-              </w:rPr>
-              <w:t>Type</w:t>
-            </w:r>
-          </w:p>
-        </w:tc>
-        <w:tc>
-          <w:tcPr>
-            <w:tcW w:w="2610" w:type="dxa"/>
-            <w:vAlign w:val="center"/>
-          </w:tcPr>
-          <w:p>
-            <w:pPr>
-              <w:ind w:left="-18"/>
-              <w:rPr>
-                <w:rFonts w:eastAsia="Arial" w:cstheme="minorHAnsi"/>
-                <w:b/>
-              </w:rPr>
-            </w:pPr>
-            <w:r>
-              <w:rPr>
-                <w:rFonts w:eastAsia="Arial" w:cstheme="minorHAnsi"/>
-                <w:b/>
-              </w:rPr>
-              <w:t>Prior Application Number</w:t>
-            </w:r>
-          </w:p>
-        </w:tc>
-        <w:tc>
-          <w:tcPr>
-            <w:tcW w:w="2587" w:type="dxa"/>
-            <w:vAlign w:val="center"/>
-          </w:tcPr>
-          <w:p>
-            <w:pPr>
-              <w:jc w:val="center"/>
-              <w:rPr>
-                <w:rFonts w:eastAsia="Arial" w:cstheme="minorHAnsi"/>
-                <w:b/>
-              </w:rPr>
-            </w:pPr>
-            <w:r>
-              <w:rPr>
-                <w:rFonts w:eastAsia="Arial" w:cstheme="minorHAnsi"/>
-                <w:b/>
-                <w:color w:val="010101"/>
-              </w:rPr>
-              <w:t>Filing</w:t>
-            </w:r>
-            <w:r>
-              <w:rPr>
-                <w:rFonts w:eastAsia="Arial" w:cstheme="minorHAnsi"/>
-                <w:b/>
-                <w:color w:val="010101"/>
-                <w:spacing w:val="22"/>
-              </w:rPr>
-              <w:t xml:space="preserve"> </w:t>
-            </w:r>
-            <w:r>
-              <w:rPr>
-                <w:rFonts w:eastAsia="Arial" w:cstheme="minorHAnsi"/>
-                <w:b/>
-                <w:color w:val="010101"/>
-              </w:rPr>
-              <w:t>or 371(c)</w:t>
-            </w:r>
-            <w:r>
-              <w:rPr>
-                <w:rFonts w:eastAsia="Arial" w:cstheme="minorHAnsi"/>
-                <w:b/>
-                <w:color w:val="010101"/>
-                <w:spacing w:val="23"/>
-              </w:rPr>
-              <w:t xml:space="preserve"> </w:t>
-            </w:r>
-            <w:r>
-              <w:rPr>
-                <w:rFonts w:eastAsia="Arial" w:cstheme="minorHAnsi"/>
-                <w:b/>
-                <w:color w:val="010101"/>
-                <w:spacing w:val="23"/>
-              </w:rPr>
-              <w:t xml:space="preserve">Date </w:t>
-            </w:r>
-            <w:r>
-              <w:rPr>
-                <w:rFonts w:eastAsia="Arial" w:cstheme="minorHAnsi"/>
-                <w:b/>
-                <w:color w:val="010101"/>
-                <w:w w:val="105"/>
-              </w:rPr>
-              <w:t>(</w:t>
-            </w:r>
-            <w:r>
-              <w:rPr>
-                <w:rFonts w:eastAsia="Arial" w:cstheme="minorHAnsi"/>
-                <w:b/>
-                <w:color w:val="010101"/>
-                <w:w w:val="104"/>
-              </w:rPr>
-              <w:t>YYYY-MM-DD</w:t>
-            </w:r>
-            <w:r>
-              <w:rPr>
-                <w:rFonts w:eastAsia="Arial" w:cstheme="minorHAnsi"/>
-                <w:b/>
-                <w:color w:val="010101"/>
-                <w:w w:val="105"/>
-              </w:rPr>
-              <w:t>)</w:t>
-            </w:r>
-          </w:p>
-        </w:tc>
-      </w:tr>
-      <w:tr>
-        <w:trPr>
-          <w:cantSplit/>
-        </w:trPr>
-        <w:tc>
-          <w:tcPr>
-            <w:tcW w:w="2723" w:type="dxa"/>
-          </w:tcPr>
-          <w:p>
-            <w:pPr>
-              <w:ind w:right="-14"/>
-              <w:jc w:val="center"/>
-              <w:rPr>
-                <w:rFonts w:eastAsia="Arial" w:cstheme="minorHAnsi"/>
-                <w:bCs/>
-                <w:color w:val="010101"/>
-                <w:position w:val="-1"/>
-              </w:rPr>
-            </w:pPr>
-          </w:p>
-        </w:tc>
-        <w:tc>
-          <w:tcPr>
-            <w:tcW w:w="2970" w:type="dxa"/>
-            <w:vAlign w:val="center"/>
-          </w:tcPr>
-          <w:p>
-            <w:pPr>
-              <w:tabs>
-                <w:tab w:val="center" w:pos="1578"/>
-              </w:tabs>
-              <w:jc w:val="center"/>
-              <w:rPr>
-                <w:bCs/>
-                <w:color w:val="FF0000"/>
-              </w:rPr>
-            </w:pPr>
-            <w:r>
-              <w:rPr>
-                <w:bCs/>
-                <w:color w:val="FF0000"/>
-              </w:rPr>
-              <w:t>[PARALEGAL TO FILL IN THIS MANUALLY]</w:t>
-            </w:r>
-          </w:p>
-          <w:p>
-            <w:pPr>
-              <w:tabs>
-                <w:tab w:val="center" w:pos="1578"/>
-              </w:tabs>
-              <w:jc w:val="center"/>
-              <w:rPr>
-                <w:rFonts w:eastAsia="Arial" w:cstheme="minorHAnsi"/>
-                <w:b/>
-              </w:rPr>
-            </w:pPr>
-            <w:r>
-              <w:rPr>
-                <w:rFonts w:cstheme="minorHAnsi"/>
-                <w:color w:val="000000"/>
-              </w:rPr>
-              <w:t xml:space="preserve"> (continuation of, division of, continuation-in-part of, a 371 of international, substitution of, reissue of, </w:t>
-            </w:r>
-            <w:r>
-              <w:rPr>
-                <w:rFonts w:cstheme="minorHAnsi"/>
-                <w:color w:val="000000"/>
-              </w:rPr>
-              <w:t>Claims benefit of provisional</w:t>
-            </w:r>
-            <w:r>
-              <w:rPr>
-                <w:rFonts w:cstheme="minorHAnsi"/>
-                <w:color w:val="000000"/>
-              </w:rPr>
-              <w:t>)</w:t>
-            </w:r>
-          </w:p>
-        </w:tc>
-        <w:tc>
-          <w:tcPr>
-            <w:tcW w:w="2610" w:type="dxa"/>
-          </w:tcPr>
-          <w:p>
-            <w:pPr>
-              <w:ind w:right="-14"/>
-              <w:jc w:val="center"/>
-              <w:rPr>
-                <w:rFonts w:eastAsia="Arial" w:cstheme="minorHAnsi"/>
-                <w:bCs/>
-                <w:color w:val="010101"/>
-                <w:position w:val="-1"/>
-              </w:rPr>
-            </w:pPr>
-          </w:p>
-        </w:tc>
-        <w:tc>
-          <w:tcPr>
-            <w:tcW w:w="2587" w:type="dxa"/>
-          </w:tcPr>
-          <w:p>
-            <w:pPr>
-              <w:ind w:right="-14"/>
-              <w:jc w:val="center"/>
-              <w:rPr>
-                <w:rFonts w:eastAsia="Arial" w:cstheme="minorHAnsi"/>
-                <w:bCs/>
-                <w:color w:val="010101"/>
-                <w:position w:val="-1"/>
-              </w:rPr>
-            </w:pPr>
-          </w:p>
-        </w:tc>
-      </w:tr>
-    </w:tbl>
     <w:p>
       <w:pPr>
         <w:spacing w:after="0" w:line="120" w:lineRule="auto"/>
@@ -5736,2104 +5489,6 @@
           <w:szCs w:val="18"/>
         </w:rPr>
       </w:pPr>
-    </w:p>
-    <w:p>
-      <w:pPr>
-        <w:spacing w:before="25" w:after="0" w:line="304" w:lineRule="exact"/>
-        <w:ind w:left="134" w:right="-20"/>
-        <w:rPr>
-          <w:rFonts w:eastAsia="Arial" w:cstheme="minorHAnsi"/>
-          <w:b/>
-          <w:bCs/>
-          <w:color w:val="010101"/>
-          <w:position w:val="-1"/>
-          <w:sz w:val="28"/>
-          <w:szCs w:val="24"/>
-        </w:rPr>
-      </w:pPr>
-    </w:p>
-    <w:p>
-      <w:pPr>
-        <w:spacing w:before="25" w:after="0" w:line="304" w:lineRule="exact"/>
-        <w:ind w:left="134" w:right="-20"/>
-        <w:rPr>
-          <w:rFonts w:eastAsia="Arial" w:cstheme="minorHAnsi"/>
-          <w:b/>
-          <w:bCs/>
-          <w:color w:val="010101"/>
-          <w:position w:val="-1"/>
-          <w:sz w:val="28"/>
-          <w:szCs w:val="24"/>
-        </w:rPr>
-      </w:pPr>
-      <w:r>
-        <w:rPr>
-          <w:rFonts w:eastAsia="Arial" w:cstheme="minorHAnsi"/>
-          <w:b/>
-          <w:bCs/>
-          <w:color w:val="010101"/>
-          <w:position w:val="-1"/>
-          <w:sz w:val="28"/>
-          <w:szCs w:val="24"/>
-        </w:rPr>
-        <w:t>Foreign</w:t>
-      </w:r>
-      <w:r>
-        <w:rPr>
-          <w:rFonts w:eastAsia="Arial" w:cstheme="minorHAnsi"/>
-          <w:b/>
-          <w:bCs/>
-          <w:color w:val="010101"/>
-          <w:spacing w:val="33"/>
-          <w:position w:val="-1"/>
-          <w:sz w:val="28"/>
-          <w:szCs w:val="24"/>
-        </w:rPr>
-        <w:t xml:space="preserve"> </w:t>
-      </w:r>
-      <w:r>
-        <w:rPr>
-          <w:rFonts w:eastAsia="Arial" w:cstheme="minorHAnsi"/>
-          <w:b/>
-          <w:bCs/>
-          <w:color w:val="010101"/>
-          <w:position w:val="-1"/>
-          <w:sz w:val="28"/>
-          <w:szCs w:val="24"/>
-        </w:rPr>
-        <w:t>Priority</w:t>
-      </w:r>
-      <w:r>
-        <w:rPr>
-          <w:rFonts w:eastAsia="Arial" w:cstheme="minorHAnsi"/>
-          <w:b/>
-          <w:bCs/>
-          <w:color w:val="010101"/>
-          <w:spacing w:val="23"/>
-          <w:position w:val="-1"/>
-          <w:sz w:val="28"/>
-          <w:szCs w:val="24"/>
-        </w:rPr>
-        <w:t xml:space="preserve"> </w:t>
-      </w:r>
-      <w:r>
-        <w:rPr>
-          <w:rFonts w:eastAsia="Arial" w:cstheme="minorHAnsi"/>
-          <w:b/>
-          <w:bCs/>
-          <w:color w:val="010101"/>
-          <w:w w:val="103"/>
-          <w:position w:val="-1"/>
-          <w:sz w:val="28"/>
-          <w:szCs w:val="24"/>
-        </w:rPr>
-        <w:t>Information:</w:t>
-      </w:r>
-    </w:p>
-    <w:tbl>
-      <w:tblPr>
-        <w:tblW w:w="0" w:type="auto"/>
-        <w:tblInd w:w="109" w:type="dxa"/>
-        <w:tblLayout w:type="fixed"/>
-        <w:tblCellMar>
-          <w:left w:w="0" w:type="dxa"/>
-          <w:right w:w="0" w:type="dxa"/>
-        </w:tblCellMar>
-        <w:tblLook w:val="01E0" w:firstRow="1" w:lastRow="1" w:firstColumn="1" w:lastColumn="1" w:noHBand="0" w:noVBand="0"/>
-      </w:tblPr>
-      <w:tblGrid>
-        <w:gridCol w:w="2594"/>
-        <w:gridCol w:w="2340"/>
-        <w:gridCol w:w="3330"/>
-        <w:gridCol w:w="2610"/>
-      </w:tblGrid>
-      <w:tr>
-        <w:trPr>
-          <w:trHeight w:hRule="exact" w:val="2023"/>
-        </w:trPr>
-        <w:tc>
-          <w:tcPr>
-            <w:tcW w:w="10874" w:type="dxa"/>
-            <w:gridSpan w:val="4"/>
-            <w:tcBorders>
-              <w:top w:val="single" w:sz="2" w:space="0" w:color="000000"/>
-              <w:left w:val="single" w:sz="2" w:space="0" w:color="000000"/>
-              <w:bottom w:val="single" w:sz="2" w:space="0" w:color="000000"/>
-              <w:right w:val="single" w:sz="2" w:space="0" w:color="000000"/>
-            </w:tcBorders>
-          </w:tcPr>
-          <w:p>
-            <w:pPr>
-              <w:spacing w:before="49" w:after="0" w:line="265" w:lineRule="auto"/>
-              <w:ind w:right="140"/>
-              <w:jc w:val="both"/>
-              <w:rPr>
-                <w:rFonts w:eastAsia="Arial" w:cstheme="minorHAnsi"/>
-                <w:b/>
-                <w:color w:val="010101"/>
-                <w:sz w:val="20"/>
-                <w:szCs w:val="20"/>
-              </w:rPr>
-            </w:pPr>
-            <w:r>
-              <w:rPr>
-                <w:rFonts w:eastAsia="Arial" w:cstheme="minorHAnsi"/>
-                <w:b/>
-                <w:color w:val="010101"/>
-                <w:sz w:val="20"/>
-                <w:szCs w:val="20"/>
-              </w:rPr>
-              <w:t>This section allows for the applicant to claim priority to a foreign application. Providing this information in the application data sheet constitutes the claim for priority as required by 35 U.S.C. 119(b) and 37 CFR 1.55.  When priority is claimed to a foreign application that is eligible for retrieval under the priority document exchange program (PDX)</w:t>
-            </w:r>
-            <w:proofErr w:type="spellStart"/>
-            <w:r>
-              <w:rPr>
-                <w:rFonts w:eastAsia="Arial" w:cstheme="minorHAnsi"/>
-                <w:b/>
-                <w:color w:val="010101"/>
-                <w:sz w:val="20"/>
-                <w:szCs w:val="20"/>
-              </w:rPr>
-              <w:t>i</w:t>
-            </w:r>
-            <w:proofErr w:type="spellEnd"/>
-            <w:r>
-              <w:rPr>
-                <w:rFonts w:eastAsia="Arial" w:cstheme="minorHAnsi"/>
-                <w:b/>
-                <w:color w:val="010101"/>
-                <w:sz w:val="20"/>
-                <w:szCs w:val="20"/>
-              </w:rPr>
-              <w:t xml:space="preserve"> the information will be used by the Office to automatically attempt retrieval pursuant to 37 CFR 1.55(</w:t>
-            </w:r>
-            <w:proofErr w:type="spellStart"/>
-            <w:r>
-              <w:rPr>
-                <w:rFonts w:eastAsia="Arial" w:cstheme="minorHAnsi"/>
-                <w:b/>
-                <w:color w:val="010101"/>
-                <w:sz w:val="20"/>
-                <w:szCs w:val="20"/>
-              </w:rPr>
-              <w:t>i</w:t>
-            </w:r>
-            <w:proofErr w:type="spellEnd"/>
-            <w:r>
-              <w:rPr>
-                <w:rFonts w:eastAsia="Arial" w:cstheme="minorHAnsi"/>
-                <w:b/>
-                <w:color w:val="010101"/>
-                <w:sz w:val="20"/>
-                <w:szCs w:val="20"/>
-              </w:rPr>
-              <w:t>)(1) and (2).  Under the P</w:t>
-            </w:r>
-            <w:r>
-              <w:rPr>
-                <w:rFonts w:eastAsia="Arial" w:cstheme="minorHAnsi"/>
-                <w:b/>
-                <w:color w:val="010101"/>
-                <w:sz w:val="20"/>
-                <w:szCs w:val="20"/>
-              </w:rPr>
-              <w:t>D</w:t>
-            </w:r>
-            <w:r>
-              <w:rPr>
-                <w:rFonts w:eastAsia="Arial" w:cstheme="minorHAnsi"/>
-                <w:b/>
-                <w:color w:val="010101"/>
-                <w:sz w:val="20"/>
-                <w:szCs w:val="20"/>
-              </w:rPr>
-              <w:t xml:space="preserve">X program, applicant bears the ultimate responsibility for ensuring that a copy of the foreign application is received by the Office from the participating foreign intellectual property office, or a certified copy of the foreign priority application is filed, within the </w:t>
-            </w:r>
-            <w:proofErr w:type="gramStart"/>
-            <w:r>
-              <w:rPr>
-                <w:rFonts w:eastAsia="Arial" w:cstheme="minorHAnsi"/>
-                <w:b/>
-                <w:color w:val="010101"/>
-                <w:sz w:val="20"/>
-                <w:szCs w:val="20"/>
-              </w:rPr>
-              <w:t>time period</w:t>
-            </w:r>
-            <w:proofErr w:type="gramEnd"/>
-            <w:r>
-              <w:rPr>
-                <w:rFonts w:eastAsia="Arial" w:cstheme="minorHAnsi"/>
-                <w:b/>
-                <w:color w:val="010101"/>
-                <w:sz w:val="20"/>
-                <w:szCs w:val="20"/>
-              </w:rPr>
-              <w:t xml:space="preserve"> specified in 37 CFR 1.55(g)(1).</w:t>
-            </w:r>
-          </w:p>
-        </w:tc>
-      </w:tr>
-      <w:tr>
-        <w:trPr>
-          <w:trHeight w:hRule="exact" w:val="295"/>
-        </w:trPr>
-        <w:tc>
-          <w:tcPr>
-            <w:tcW w:w="10874" w:type="dxa"/>
-            <w:gridSpan w:val="4"/>
-            <w:tcBorders>
-              <w:top w:val="single" w:sz="2" w:space="0" w:color="000000"/>
-              <w:left w:val="single" w:sz="2" w:space="0" w:color="000000"/>
-              <w:bottom w:val="single" w:sz="2" w:space="0" w:color="000000"/>
-              <w:right w:val="single" w:sz="2" w:space="0" w:color="000000"/>
-            </w:tcBorders>
-          </w:tcPr>
-          <w:p>
-            <w:pPr>
-              <w:spacing w:after="0" w:line="270" w:lineRule="exact"/>
-              <w:ind w:right="1278"/>
-              <w:jc w:val="right"/>
-              <w:rPr>
-                <w:rFonts w:eastAsia="Arial" w:cstheme="minorHAnsi"/>
-                <w:sz w:val="20"/>
-                <w:szCs w:val="20"/>
-              </w:rPr>
-            </w:pPr>
-          </w:p>
-        </w:tc>
-      </w:tr>
-      <w:tr>
-        <w:trPr>
-          <w:trHeight w:hRule="exact" w:val="353"/>
-        </w:trPr>
-        <w:tc>
-          <w:tcPr>
-            <w:tcW w:w="2594" w:type="dxa"/>
-            <w:tcBorders>
-              <w:top w:val="single" w:sz="2" w:space="0" w:color="000000"/>
-              <w:left w:val="single" w:sz="2" w:space="0" w:color="000000"/>
-              <w:bottom w:val="single" w:sz="2" w:space="0" w:color="000000"/>
-              <w:right w:val="single" w:sz="2" w:space="0" w:color="000000"/>
-            </w:tcBorders>
-            <w:vAlign w:val="center"/>
-          </w:tcPr>
-          <w:p>
-            <w:pPr>
-              <w:spacing w:after="0" w:line="240" w:lineRule="auto"/>
-              <w:jc w:val="center"/>
-              <w:rPr>
-                <w:rFonts w:eastAsia="Arial" w:cstheme="minorHAnsi"/>
-                <w:b/>
-              </w:rPr>
-            </w:pPr>
-            <w:r>
-              <w:rPr>
-                <w:rFonts w:eastAsia="Arial" w:cstheme="minorHAnsi"/>
-                <w:b/>
-                <w:color w:val="010101"/>
-              </w:rPr>
-              <w:t>Application</w:t>
-            </w:r>
-            <w:r>
-              <w:rPr>
-                <w:rFonts w:eastAsia="Arial" w:cstheme="minorHAnsi"/>
-                <w:b/>
-                <w:color w:val="010101"/>
-                <w:spacing w:val="28"/>
-              </w:rPr>
-              <w:t xml:space="preserve"> </w:t>
-            </w:r>
-            <w:r>
-              <w:rPr>
-                <w:rFonts w:eastAsia="Arial" w:cstheme="minorHAnsi"/>
-                <w:b/>
-                <w:color w:val="010101"/>
-                <w:w w:val="106"/>
-              </w:rPr>
-              <w:t>Number</w:t>
-            </w:r>
-          </w:p>
-        </w:tc>
-        <w:tc>
-          <w:tcPr>
-            <w:tcW w:w="2340" w:type="dxa"/>
-            <w:tcBorders>
-              <w:top w:val="single" w:sz="2" w:space="0" w:color="000000"/>
-              <w:left w:val="single" w:sz="2" w:space="0" w:color="000000"/>
-              <w:bottom w:val="single" w:sz="2" w:space="0" w:color="000000"/>
-              <w:right w:val="single" w:sz="2" w:space="0" w:color="000000"/>
-            </w:tcBorders>
-            <w:vAlign w:val="center"/>
-          </w:tcPr>
-          <w:p>
-            <w:pPr>
-              <w:spacing w:after="0" w:line="240" w:lineRule="auto"/>
-              <w:jc w:val="center"/>
-              <w:rPr>
-                <w:rFonts w:eastAsia="Arial" w:cstheme="minorHAnsi"/>
-                <w:b/>
-              </w:rPr>
-            </w:pPr>
-            <w:r>
-              <w:rPr>
-                <w:rFonts w:eastAsia="Arial" w:cstheme="minorHAnsi"/>
-                <w:b/>
-                <w:color w:val="010101"/>
-                <w:w w:val="104"/>
-              </w:rPr>
-              <w:t>Count</w:t>
-            </w:r>
-            <w:r>
-              <w:rPr>
-                <w:rFonts w:eastAsia="Arial" w:cstheme="minorHAnsi"/>
-                <w:b/>
-                <w:color w:val="010101"/>
-                <w:spacing w:val="-1"/>
-                <w:w w:val="105"/>
-              </w:rPr>
-              <w:t>r</w:t>
-            </w:r>
-            <w:r>
-              <w:rPr>
-                <w:rFonts w:eastAsia="Arial" w:cstheme="minorHAnsi"/>
-                <w:b/>
-                <w:color w:val="000023"/>
-                <w:w w:val="107"/>
-              </w:rPr>
-              <w:t>y</w:t>
-            </w:r>
-          </w:p>
-        </w:tc>
-        <w:tc>
-          <w:tcPr>
-            <w:tcW w:w="3330" w:type="dxa"/>
-            <w:tcBorders>
-              <w:top w:val="single" w:sz="2" w:space="0" w:color="000000"/>
-              <w:left w:val="single" w:sz="2" w:space="0" w:color="000000"/>
-              <w:bottom w:val="single" w:sz="2" w:space="0" w:color="000000"/>
-              <w:right w:val="single" w:sz="2" w:space="0" w:color="000000"/>
-            </w:tcBorders>
-            <w:vAlign w:val="center"/>
-          </w:tcPr>
-          <w:p>
-            <w:pPr>
-              <w:spacing w:after="0" w:line="240" w:lineRule="auto"/>
-              <w:jc w:val="center"/>
-              <w:rPr>
-                <w:rFonts w:eastAsia="Arial" w:cstheme="minorHAnsi"/>
-                <w:b/>
-              </w:rPr>
-            </w:pPr>
-            <w:r>
-              <w:rPr>
-                <w:rFonts w:eastAsia="Arial" w:cstheme="minorHAnsi"/>
-                <w:b/>
-                <w:color w:val="010101"/>
-              </w:rPr>
-              <w:t>Parent</w:t>
-            </w:r>
-            <w:r>
-              <w:rPr>
-                <w:rFonts w:eastAsia="Arial" w:cstheme="minorHAnsi"/>
-                <w:b/>
-                <w:color w:val="010101"/>
-                <w:spacing w:val="31"/>
-              </w:rPr>
-              <w:t xml:space="preserve"> </w:t>
-            </w:r>
-            <w:r>
-              <w:rPr>
-                <w:rFonts w:eastAsia="Arial" w:cstheme="minorHAnsi"/>
-                <w:b/>
-                <w:color w:val="010101"/>
-              </w:rPr>
-              <w:t>Filing</w:t>
-            </w:r>
-            <w:r>
-              <w:rPr>
-                <w:rFonts w:eastAsia="Arial" w:cstheme="minorHAnsi"/>
-                <w:b/>
-                <w:color w:val="010101"/>
-                <w:spacing w:val="22"/>
-              </w:rPr>
-              <w:t xml:space="preserve"> </w:t>
-            </w:r>
-            <w:r>
-              <w:rPr>
-                <w:rFonts w:eastAsia="Arial" w:cstheme="minorHAnsi"/>
-                <w:b/>
-                <w:color w:val="010101"/>
-              </w:rPr>
-              <w:t>Date</w:t>
-            </w:r>
-            <w:r>
-              <w:rPr>
-                <w:rFonts w:eastAsia="Arial" w:cstheme="minorHAnsi"/>
-                <w:b/>
-                <w:color w:val="010101"/>
-                <w:spacing w:val="24"/>
-              </w:rPr>
-              <w:t xml:space="preserve"> </w:t>
-            </w:r>
-            <w:r>
-              <w:rPr>
-                <w:rFonts w:eastAsia="Arial" w:cstheme="minorHAnsi"/>
-                <w:b/>
-                <w:color w:val="010101"/>
-                <w:w w:val="104"/>
-              </w:rPr>
-              <w:t>(</w:t>
-            </w:r>
-            <w:r>
-              <w:rPr>
-                <w:rFonts w:eastAsia="Arial" w:cstheme="minorHAnsi"/>
-                <w:b/>
-                <w:color w:val="010101"/>
-                <w:w w:val="103"/>
-              </w:rPr>
-              <w:t>YYYY-MM-DD</w:t>
-            </w:r>
-            <w:r>
-              <w:rPr>
-                <w:rFonts w:eastAsia="Arial" w:cstheme="minorHAnsi"/>
-                <w:b/>
-                <w:color w:val="010101"/>
-                <w:w w:val="104"/>
-              </w:rPr>
-              <w:t>)</w:t>
-            </w:r>
-          </w:p>
-        </w:tc>
-        <w:tc>
-          <w:tcPr>
-            <w:tcW w:w="2610" w:type="dxa"/>
-            <w:tcBorders>
-              <w:top w:val="single" w:sz="2" w:space="0" w:color="000000"/>
-              <w:left w:val="single" w:sz="2" w:space="0" w:color="000000"/>
-              <w:bottom w:val="single" w:sz="2" w:space="0" w:color="000000"/>
-              <w:right w:val="single" w:sz="2" w:space="0" w:color="000000"/>
-            </w:tcBorders>
-            <w:vAlign w:val="center"/>
-          </w:tcPr>
-          <w:p>
-            <w:pPr>
-              <w:spacing w:after="0" w:line="240" w:lineRule="auto"/>
-              <w:jc w:val="center"/>
-              <w:rPr>
-                <w:rFonts w:eastAsia="Arial" w:cstheme="minorHAnsi"/>
-                <w:b/>
-              </w:rPr>
-            </w:pPr>
-            <w:r>
-              <w:rPr>
-                <w:rFonts w:eastAsia="Arial" w:cstheme="minorHAnsi"/>
-                <w:b/>
-                <w:color w:val="010101"/>
-              </w:rPr>
-              <w:t>Access Code (if applicable)</w:t>
-            </w:r>
-          </w:p>
-        </w:tc>
-      </w:tr>
-      <w:tr>
-        <w:trPr>
-          <w:trHeight w:hRule="exact" w:val="360"/>
-        </w:trPr>
-        <w:tc>
-          <w:tcPr>
-            <w:tcW w:w="2594" w:type="dxa"/>
-            <w:tcBorders>
-              <w:top w:val="single" w:sz="2" w:space="0" w:color="000000"/>
-              <w:left w:val="single" w:sz="2" w:space="0" w:color="000000"/>
-              <w:bottom w:val="single" w:sz="2" w:space="0" w:color="000000"/>
-              <w:right w:val="single" w:sz="2" w:space="0" w:color="000000"/>
-            </w:tcBorders>
-            <w:vAlign w:val="center"/>
-          </w:tcPr>
-          <w:p>
-            <w:pPr>
-              <w:spacing w:after="0" w:line="240" w:lineRule="auto"/>
-              <w:ind w:left="43"/>
-              <w:jc w:val="center"/>
-              <w:rPr>
-                <w:rFonts w:cstheme="minorHAnsi"/>
-              </w:rPr>
-            </w:pPr>
-            <w:r>
-              <w:rPr>
-                <w:rFonts w:cstheme="minorHAnsi"/>
-              </w:rPr>
-              <w:t>&lt;&lt;</w:t>
-            </w:r>
-            <w:proofErr w:type="spellStart"/>
-            <w:r>
-              <w:rPr>
-                <w:rFonts w:cstheme="minorHAnsi"/>
-              </w:rPr>
-              <w:t>foreignNo</w:t>
-            </w:r>
-            <w:proofErr w:type="spellEnd"/>
-            <w:r>
-              <w:rPr>
-                <w:rFonts w:cstheme="minorHAnsi"/>
-              </w:rPr>
-              <w:t>&gt;&gt;</w:t>
-            </w:r>
-          </w:p>
-        </w:tc>
-        <w:tc>
-          <w:tcPr>
-            <w:tcW w:w="2340" w:type="dxa"/>
-            <w:tcBorders>
-              <w:top w:val="single" w:sz="2" w:space="0" w:color="000000"/>
-              <w:left w:val="single" w:sz="2" w:space="0" w:color="000000"/>
-              <w:bottom w:val="single" w:sz="2" w:space="0" w:color="000000"/>
-              <w:right w:val="single" w:sz="2" w:space="0" w:color="000000"/>
-            </w:tcBorders>
-            <w:vAlign w:val="center"/>
-          </w:tcPr>
-          <w:p>
-            <w:pPr>
-              <w:spacing w:after="0" w:line="240" w:lineRule="auto"/>
-              <w:ind w:left="43"/>
-              <w:jc w:val="center"/>
-              <w:rPr>
-                <w:rFonts w:cstheme="minorHAnsi"/>
-              </w:rPr>
-            </w:pPr>
-            <w:r>
-              <w:rPr>
-                <w:rFonts w:cstheme="minorHAnsi"/>
-              </w:rPr>
-              <w:t>&lt;&lt;</w:t>
-            </w:r>
-            <w:proofErr w:type="spellStart"/>
-            <w:r>
-              <w:rPr>
-                <w:rFonts w:cstheme="minorHAnsi"/>
-              </w:rPr>
-              <w:t>foreignCntry</w:t>
-            </w:r>
-            <w:proofErr w:type="spellEnd"/>
-            <w:r>
-              <w:rPr>
-                <w:rFonts w:cstheme="minorHAnsi"/>
-              </w:rPr>
-              <w:t>&gt;&gt;</w:t>
-            </w:r>
-          </w:p>
-        </w:tc>
-        <w:tc>
-          <w:tcPr>
-            <w:tcW w:w="3330" w:type="dxa"/>
-            <w:tcBorders>
-              <w:top w:val="single" w:sz="2" w:space="0" w:color="000000"/>
-              <w:left w:val="single" w:sz="2" w:space="0" w:color="000000"/>
-              <w:bottom w:val="single" w:sz="2" w:space="0" w:color="000000"/>
-              <w:right w:val="single" w:sz="2" w:space="0" w:color="000000"/>
-            </w:tcBorders>
-            <w:vAlign w:val="center"/>
-          </w:tcPr>
-          <w:p>
-            <w:pPr>
-              <w:spacing w:after="0" w:line="240" w:lineRule="auto"/>
-              <w:ind w:left="43"/>
-              <w:jc w:val="center"/>
-              <w:rPr>
-                <w:rFonts w:cstheme="minorHAnsi"/>
-              </w:rPr>
-            </w:pPr>
-            <w:r>
-              <w:rPr>
-                <w:rFonts w:cstheme="minorHAnsi"/>
-              </w:rPr>
-              <w:t>&lt;&lt;</w:t>
-            </w:r>
-            <w:proofErr w:type="spellStart"/>
-            <w:r>
-              <w:rPr>
-                <w:rFonts w:cstheme="minorHAnsi"/>
-              </w:rPr>
-              <w:t>foreignFiledDate</w:t>
-            </w:r>
-            <w:proofErr w:type="spellEnd"/>
-            <w:r>
-              <w:rPr>
-                <w:rFonts w:cstheme="minorHAnsi"/>
-              </w:rPr>
-              <w:t>&gt;&gt;</w:t>
-            </w:r>
-          </w:p>
-        </w:tc>
-        <w:tc>
-          <w:tcPr>
-            <w:tcW w:w="2610" w:type="dxa"/>
-            <w:tcBorders>
-              <w:top w:val="single" w:sz="2" w:space="0" w:color="000000"/>
-              <w:left w:val="single" w:sz="2" w:space="0" w:color="000000"/>
-              <w:bottom w:val="single" w:sz="2" w:space="0" w:color="000000"/>
-              <w:right w:val="single" w:sz="2" w:space="0" w:color="000000"/>
-            </w:tcBorders>
-            <w:vAlign w:val="center"/>
-          </w:tcPr>
-          <w:p>
-            <w:pPr>
-              <w:spacing w:after="0" w:line="240" w:lineRule="auto"/>
-              <w:ind w:left="43" w:right="-20"/>
-              <w:jc w:val="center"/>
-              <w:rPr>
-                <w:rFonts w:eastAsia="Arial" w:cstheme="minorHAnsi"/>
-              </w:rPr>
-            </w:pPr>
-          </w:p>
-        </w:tc>
-      </w:tr>
-    </w:tbl>
-    <w:p>
-      <w:pPr>
-        <w:spacing w:after="0" w:line="120" w:lineRule="auto"/>
-        <w:ind w:right="-14" w:firstLine="187"/>
-        <w:rPr>
-          <w:rFonts w:eastAsia="Arial" w:cstheme="minorHAnsi"/>
-          <w:b/>
-          <w:sz w:val="28"/>
-          <w:szCs w:val="28"/>
-        </w:rPr>
-      </w:pPr>
-    </w:p>
-    <w:p>
-      <w:pPr>
-        <w:spacing w:after="0" w:line="120" w:lineRule="auto"/>
-        <w:ind w:right="-14"/>
-        <w:rPr>
-          <w:rFonts w:eastAsia="Arial" w:cstheme="minorHAnsi"/>
-          <w:b/>
-          <w:sz w:val="28"/>
-          <w:szCs w:val="28"/>
-        </w:rPr>
-      </w:pPr>
-    </w:p>
-    <w:p>
-      <w:pPr>
-        <w:widowControl/>
-        <w:ind w:left="180"/>
-        <w:rPr>
-          <w:rFonts w:eastAsia="Arial" w:cstheme="minorHAnsi"/>
-          <w:b/>
-          <w:sz w:val="28"/>
-          <w:szCs w:val="28"/>
-        </w:rPr>
-      </w:pPr>
-      <w:r>
-        <w:rPr>
-          <w:rFonts w:eastAsia="Arial" w:cstheme="minorHAnsi"/>
-          <w:b/>
-          <w:sz w:val="28"/>
-          <w:szCs w:val="28"/>
-        </w:rPr>
-        <w:t xml:space="preserve">Statement under 37 CFR 1.55 or 1.78 for AIA (First Inventor to File) </w:t>
-      </w:r>
-      <w:r>
-        <w:rPr>
-          <w:rFonts w:eastAsia="Arial" w:cstheme="minorHAnsi"/>
-          <w:b/>
-          <w:sz w:val="28"/>
-          <w:szCs w:val="28"/>
-        </w:rPr>
-        <w:t>Transition</w:t>
-      </w:r>
-      <w:r>
-        <w:rPr>
-          <w:rFonts w:eastAsia="Arial" w:cstheme="minorHAnsi"/>
-          <w:b/>
-          <w:sz w:val="28"/>
-          <w:szCs w:val="28"/>
-        </w:rPr>
-        <w:t xml:space="preserve"> Applications</w:t>
-      </w:r>
-    </w:p>
-    <w:tbl>
-      <w:tblPr>
-        <w:tblStyle w:val="TableGrid"/>
-        <w:tblW w:w="0" w:type="auto"/>
-        <w:tblInd w:w="85" w:type="dxa"/>
-        <w:tblLook w:val="04A0" w:firstRow="1" w:lastRow="0" w:firstColumn="1" w:lastColumn="0" w:noHBand="0" w:noVBand="1"/>
-      </w:tblPr>
-      <w:tblGrid>
-        <w:gridCol w:w="10905"/>
-      </w:tblGrid>
-      <w:tr>
-        <w:tc>
-          <w:tcPr>
-            <w:tcW w:w="10905" w:type="dxa"/>
-          </w:tcPr>
-          <w:p>
-            <w:pPr>
-              <w:widowControl/>
-              <w:autoSpaceDE w:val="0"/>
-              <w:autoSpaceDN w:val="0"/>
-              <w:adjustRightInd w:val="0"/>
-              <w:rPr>
-                <w:rFonts w:cstheme="minorHAnsi"/>
-                <w:bCs/>
-                <w:sz w:val="24"/>
-                <w:szCs w:val="24"/>
-              </w:rPr>
-            </w:pPr>
-            <w:sdt>
-              <w:sdtPr>
-                <w:rPr>
-                  <w:rFonts w:cstheme="minorHAnsi"/>
-                  <w:b/>
-                  <w:sz w:val="28"/>
-                  <w:szCs w:val="28"/>
-                </w:rPr>
-                <w:id w:val="1160123996"/>
-                <w14:checkbox>
-                  <w14:checked w14:val="0"/>
-                  <w14:checkedState w14:val="2612" w14:font="MS Gothic"/>
-                  <w14:uncheckedState w14:val="2610" w14:font="MS Gothic"/>
-                </w14:checkbox>
-              </w:sdtPr>
-              <w:sdtContent>
-                <w:r>
-                  <w:rPr>
-                    <w:rFonts w:ascii="MS Gothic" w:eastAsia="MS Gothic" w:hAnsi="MS Gothic" w:cstheme="minorHAnsi" w:hint="eastAsia"/>
-                    <w:b/>
-                    <w:sz w:val="28"/>
-                    <w:szCs w:val="28"/>
-                  </w:rPr>
-                  <w:t>☐</w:t>
-                </w:r>
-              </w:sdtContent>
-            </w:sdt>
-            <w:r>
-              <w:rPr>
-                <w:rFonts w:cstheme="minorHAnsi"/>
-                <w:b/>
-                <w:sz w:val="24"/>
-                <w:szCs w:val="24"/>
-              </w:rPr>
-              <w:t xml:space="preserve">  </w:t>
-            </w:r>
-            <w:r>
-              <w:rPr>
-                <w:rFonts w:cstheme="minorHAnsi"/>
-                <w:bCs/>
-                <w:sz w:val="24"/>
-                <w:szCs w:val="24"/>
-              </w:rPr>
-              <w:t xml:space="preserve">This application (1) claims priority to or the benefit of an application filed before </w:t>
-            </w:r>
-            <w:r>
-              <w:rPr>
-                <w:rFonts w:cstheme="minorHAnsi"/>
-                <w:bCs/>
-                <w:sz w:val="24"/>
-                <w:szCs w:val="24"/>
-              </w:rPr>
-              <w:t>March</w:t>
-            </w:r>
-            <w:r>
-              <w:rPr>
-                <w:rFonts w:cstheme="minorHAnsi"/>
-                <w:bCs/>
-                <w:sz w:val="24"/>
-                <w:szCs w:val="24"/>
-              </w:rPr>
-              <w:t xml:space="preserve"> 16, </w:t>
-            </w:r>
-            <w:proofErr w:type="gramStart"/>
-            <w:r>
-              <w:rPr>
-                <w:rFonts w:cstheme="minorHAnsi"/>
-                <w:bCs/>
-                <w:sz w:val="24"/>
-                <w:szCs w:val="24"/>
-              </w:rPr>
-              <w:t>2013</w:t>
-            </w:r>
-            <w:proofErr w:type="gramEnd"/>
-            <w:r>
-              <w:rPr>
-                <w:rFonts w:cstheme="minorHAnsi"/>
-                <w:bCs/>
-                <w:sz w:val="24"/>
-                <w:szCs w:val="24"/>
-              </w:rPr>
-              <w:t xml:space="preserve"> and (2) also contains, or contained at any time, a claim to a claimed invention that has an effe</w:t>
-            </w:r>
-            <w:r>
-              <w:rPr>
-                <w:rFonts w:cstheme="minorHAnsi"/>
-                <w:bCs/>
-                <w:sz w:val="24"/>
-                <w:szCs w:val="24"/>
-              </w:rPr>
-              <w:t>c</w:t>
-            </w:r>
-            <w:r>
-              <w:rPr>
-                <w:rFonts w:cstheme="minorHAnsi"/>
-                <w:bCs/>
-                <w:sz w:val="24"/>
-                <w:szCs w:val="24"/>
-              </w:rPr>
-              <w:t>tive filing date on or after March 16, 2013.</w:t>
-            </w:r>
-          </w:p>
-          <w:p>
-            <w:pPr>
-              <w:widowControl/>
-              <w:autoSpaceDE w:val="0"/>
-              <w:autoSpaceDN w:val="0"/>
-              <w:adjustRightInd w:val="0"/>
-              <w:rPr>
-                <w:rFonts w:cstheme="minorHAnsi"/>
-                <w:bCs/>
-                <w:sz w:val="24"/>
-                <w:szCs w:val="24"/>
-              </w:rPr>
-            </w:pPr>
-            <w:r>
-              <w:rPr>
-                <w:rFonts w:cstheme="minorHAnsi"/>
-                <w:bCs/>
-                <w:sz w:val="24"/>
-                <w:szCs w:val="24"/>
-              </w:rPr>
-              <w:lastRenderedPageBreak/>
-              <w:t xml:space="preserve">NOTE: </w:t>
-            </w:r>
-            <w:r>
-              <w:rPr>
-                <w:rFonts w:cstheme="minorHAnsi"/>
-                <w:bCs/>
-                <w:sz w:val="24"/>
-                <w:szCs w:val="24"/>
-              </w:rPr>
-              <w:t>By providing this statement under 37 CFR 1.55 or 1.78, this application, with a filing date on or after March 16, 2013, will be examined under the first inventor to file provisions of the AIA.</w:t>
-            </w:r>
-          </w:p>
-        </w:tc>
-      </w:tr>
-    </w:tbl>
-    <w:p>
-      <w:pPr>
-        <w:spacing w:after="0" w:line="240" w:lineRule="auto"/>
-        <w:ind w:right="-14"/>
-        <w:rPr>
-          <w:rFonts w:eastAsia="Arial" w:cstheme="minorHAnsi"/>
-          <w:b/>
-          <w:sz w:val="16"/>
-          <w:szCs w:val="16"/>
-        </w:rPr>
-      </w:pPr>
-    </w:p>
-    <w:p>
-      <w:pPr>
-        <w:spacing w:after="0" w:line="240" w:lineRule="auto"/>
-        <w:ind w:right="-14" w:firstLine="187"/>
-        <w:rPr>
-          <w:rFonts w:eastAsia="Arial" w:cstheme="minorHAnsi"/>
-          <w:b/>
-          <w:sz w:val="28"/>
-          <w:szCs w:val="28"/>
-        </w:rPr>
-      </w:pPr>
-      <w:r>
-        <w:rPr>
-          <w:rFonts w:eastAsia="Arial" w:cstheme="minorHAnsi"/>
-          <w:b/>
-          <w:sz w:val="28"/>
-          <w:szCs w:val="28"/>
-        </w:rPr>
-        <w:t>Authorization or Opt-Out of Authorization to Permit Access:</w:t>
-      </w:r>
-    </w:p>
-    <w:tbl>
-      <w:tblPr>
-        <w:tblStyle w:val="TableGrid"/>
-        <w:tblW w:w="0" w:type="auto"/>
-        <w:tblInd w:w="85" w:type="dxa"/>
-        <w:tblLook w:val="04A0" w:firstRow="1" w:lastRow="0" w:firstColumn="1" w:lastColumn="0" w:noHBand="0" w:noVBand="1"/>
-      </w:tblPr>
-      <w:tblGrid>
-        <w:gridCol w:w="10905"/>
-      </w:tblGrid>
-      <w:tr>
-        <w:trPr>
-          <w:cantSplit/>
-          <w:trHeight w:val="538"/>
-        </w:trPr>
-        <w:tc>
-          <w:tcPr>
-            <w:tcW w:w="10905" w:type="dxa"/>
-            <w:vAlign w:val="center"/>
-          </w:tcPr>
-          <w:p>
-            <w:pPr>
-              <w:spacing w:before="74"/>
-              <w:ind w:right="-20"/>
-              <w:rPr>
-                <w:rFonts w:cstheme="minorHAnsi"/>
-                <w:b/>
-                <w:sz w:val="20"/>
-                <w:szCs w:val="20"/>
-              </w:rPr>
-            </w:pPr>
-            <w:r>
-              <w:rPr>
-                <w:rFonts w:cstheme="minorHAnsi"/>
-                <w:b/>
-                <w:sz w:val="20"/>
-                <w:szCs w:val="20"/>
-              </w:rPr>
-              <w:t>When this Application Data Sheet is properly signed and filed with the application, applicant has provided written authority to permit a participating foreign intellectual property (IP) office access to the instant application-as-filed (see paragraph A in subsection 1 below) and the European Patent Office (EPO) access to any search results from the instant application (see paragraph B in subsection 1 below).</w:t>
-            </w:r>
-          </w:p>
-          <w:p>
-            <w:pPr>
-              <w:ind w:right="-14"/>
-              <w:rPr>
-                <w:rFonts w:cstheme="minorHAnsi"/>
-                <w:b/>
-                <w:sz w:val="20"/>
-                <w:szCs w:val="20"/>
-              </w:rPr>
-            </w:pPr>
-          </w:p>
-          <w:p>
-            <w:pPr>
-              <w:ind w:right="-14"/>
-              <w:rPr>
-                <w:rFonts w:cstheme="minorHAnsi"/>
-                <w:b/>
-                <w:sz w:val="20"/>
-                <w:szCs w:val="20"/>
-              </w:rPr>
-            </w:pPr>
-            <w:r>
-              <w:rPr>
-                <w:rFonts w:cstheme="minorHAnsi"/>
-                <w:b/>
-                <w:sz w:val="20"/>
-                <w:szCs w:val="20"/>
-              </w:rPr>
-              <w:t xml:space="preserve">Should applicant choose not to provide an authorization identified in subsection 1 below, applicant </w:t>
-            </w:r>
-            <w:r>
-              <w:rPr>
-                <w:rFonts w:cstheme="minorHAnsi"/>
-                <w:b/>
-                <w:sz w:val="20"/>
-                <w:szCs w:val="20"/>
-                <w:u w:val="single"/>
-              </w:rPr>
-              <w:t>must opt-out</w:t>
-            </w:r>
-            <w:r>
-              <w:rPr>
-                <w:rFonts w:cstheme="minorHAnsi"/>
-                <w:b/>
-                <w:sz w:val="20"/>
-                <w:szCs w:val="20"/>
-              </w:rPr>
-              <w:t xml:space="preserve"> of the authorization by checking the corresponding box A or B or both in subsection 2 below.</w:t>
-            </w:r>
-          </w:p>
-          <w:p>
-            <w:pPr>
-              <w:ind w:right="-14"/>
-              <w:rPr>
-                <w:rFonts w:cstheme="minorHAnsi"/>
-                <w:b/>
-                <w:sz w:val="20"/>
-                <w:szCs w:val="20"/>
-              </w:rPr>
-            </w:pPr>
-          </w:p>
-          <w:p>
-            <w:pPr>
-              <w:ind w:right="-14"/>
-              <w:rPr>
-                <w:rFonts w:cstheme="minorHAnsi"/>
-                <w:b/>
-                <w:sz w:val="24"/>
-                <w:szCs w:val="24"/>
-              </w:rPr>
-            </w:pPr>
-            <w:r>
-              <w:rPr>
-                <w:rFonts w:cstheme="minorHAnsi"/>
-                <w:b/>
-                <w:sz w:val="20"/>
-                <w:szCs w:val="20"/>
-                <w:u w:val="single"/>
-              </w:rPr>
-              <w:t>NOTE</w:t>
-            </w:r>
-            <w:r>
-              <w:rPr>
-                <w:rFonts w:cstheme="minorHAnsi"/>
-                <w:b/>
-                <w:sz w:val="20"/>
-                <w:szCs w:val="20"/>
-              </w:rPr>
-              <w:t xml:space="preserve">: This section of the Application Data Sheet is </w:t>
-            </w:r>
-            <w:r>
-              <w:rPr>
-                <w:rFonts w:cstheme="minorHAnsi"/>
-                <w:b/>
-                <w:sz w:val="20"/>
-                <w:szCs w:val="20"/>
-                <w:u w:val="single"/>
-              </w:rPr>
-              <w:t>ONLY</w:t>
-            </w:r>
-            <w:r>
-              <w:rPr>
-                <w:rFonts w:cstheme="minorHAnsi"/>
-                <w:b/>
-                <w:sz w:val="20"/>
-                <w:szCs w:val="20"/>
-              </w:rPr>
-              <w:t xml:space="preserve"> reviewed and processed with the </w:t>
-            </w:r>
-            <w:r>
-              <w:rPr>
-                <w:rFonts w:cstheme="minorHAnsi"/>
-                <w:b/>
-                <w:sz w:val="20"/>
-                <w:szCs w:val="20"/>
-                <w:u w:val="single"/>
-              </w:rPr>
-              <w:t>INITIAL</w:t>
-            </w:r>
-            <w:r>
-              <w:rPr>
-                <w:rFonts w:cstheme="minorHAnsi"/>
-                <w:b/>
-                <w:sz w:val="20"/>
-                <w:szCs w:val="20"/>
-              </w:rPr>
-              <w:t xml:space="preserve"> filing of an application. After the initial filing of an application, an Application Data Sheet cannot be used to provide or rescind authorization for access by a foreign IP office(s). Instead, Form PTO/SB/39 or PTO/SB/69 must be used as appropriate.</w:t>
-            </w:r>
-          </w:p>
-        </w:tc>
-      </w:tr>
-      <w:tr>
-        <w:trPr>
-          <w:cantSplit/>
-          <w:trHeight w:val="5329"/>
-        </w:trPr>
-        <w:tc>
-          <w:tcPr>
-            <w:tcW w:w="10905" w:type="dxa"/>
-          </w:tcPr>
-          <w:p>
-            <w:pPr>
-              <w:widowControl/>
-              <w:autoSpaceDE w:val="0"/>
-              <w:autoSpaceDN w:val="0"/>
-              <w:adjustRightInd w:val="0"/>
-              <w:rPr>
-                <w:rFonts w:cstheme="minorHAnsi"/>
-                <w:b/>
-                <w:sz w:val="20"/>
-                <w:szCs w:val="20"/>
-              </w:rPr>
-            </w:pPr>
-          </w:p>
-          <w:p>
-            <w:pPr>
-              <w:widowControl/>
-              <w:autoSpaceDE w:val="0"/>
-              <w:autoSpaceDN w:val="0"/>
-              <w:adjustRightInd w:val="0"/>
-              <w:rPr>
-                <w:rFonts w:cstheme="minorHAnsi"/>
-                <w:b/>
-                <w:sz w:val="20"/>
-                <w:szCs w:val="20"/>
-              </w:rPr>
-            </w:pPr>
-            <w:r>
-              <w:rPr>
-                <w:rFonts w:cstheme="minorHAnsi"/>
-                <w:b/>
-                <w:sz w:val="20"/>
-                <w:szCs w:val="20"/>
-              </w:rPr>
-              <w:t>1. Authorization to Permit Access by a Foreign Intellectual Property Office(s)</w:t>
-            </w:r>
-          </w:p>
-          <w:p>
-            <w:pPr>
-              <w:widowControl/>
-              <w:autoSpaceDE w:val="0"/>
-              <w:autoSpaceDN w:val="0"/>
-              <w:adjustRightInd w:val="0"/>
-              <w:rPr>
-                <w:rFonts w:cstheme="minorHAnsi"/>
-                <w:b/>
-                <w:sz w:val="20"/>
-                <w:szCs w:val="20"/>
-              </w:rPr>
-            </w:pPr>
-          </w:p>
-          <w:p>
-            <w:pPr>
-              <w:widowControl/>
-              <w:autoSpaceDE w:val="0"/>
-              <w:autoSpaceDN w:val="0"/>
-              <w:adjustRightInd w:val="0"/>
-              <w:rPr>
-                <w:rFonts w:cstheme="minorHAnsi"/>
-                <w:b/>
-                <w:sz w:val="20"/>
-                <w:szCs w:val="20"/>
-              </w:rPr>
-            </w:pPr>
-            <w:r>
-              <w:rPr>
-                <w:rFonts w:cstheme="minorHAnsi"/>
-                <w:b/>
-                <w:sz w:val="20"/>
-                <w:szCs w:val="20"/>
-              </w:rPr>
-              <w:t>A.</w:t>
-            </w:r>
-            <w:r>
-              <w:rPr>
-                <w:rFonts w:cstheme="minorHAnsi"/>
-                <w:b/>
-                <w:sz w:val="20"/>
-                <w:szCs w:val="20"/>
-                <w:u w:val="single"/>
-              </w:rPr>
-              <w:t xml:space="preserve"> Priority Document Exchange (PDX)</w:t>
-            </w:r>
-            <w:r>
-              <w:rPr>
-                <w:rFonts w:cstheme="minorHAnsi"/>
-                <w:b/>
-                <w:sz w:val="20"/>
-                <w:szCs w:val="20"/>
-              </w:rPr>
-              <w:t xml:space="preserve"> - Unless box A in subsection 2 (opt-out of authorization) is checked, the</w:t>
-            </w:r>
-          </w:p>
-          <w:p>
-            <w:pPr>
-              <w:widowControl/>
-              <w:autoSpaceDE w:val="0"/>
-              <w:autoSpaceDN w:val="0"/>
-              <w:adjustRightInd w:val="0"/>
-              <w:rPr>
-                <w:rFonts w:cstheme="minorHAnsi"/>
-                <w:b/>
-                <w:sz w:val="20"/>
-                <w:szCs w:val="20"/>
-              </w:rPr>
-            </w:pPr>
-            <w:r>
-              <w:rPr>
-                <w:rFonts w:cstheme="minorHAnsi"/>
-                <w:b/>
-                <w:sz w:val="20"/>
-                <w:szCs w:val="20"/>
-              </w:rPr>
-              <w:t xml:space="preserve">undersigned hereby </w:t>
-            </w:r>
-            <w:r>
-              <w:rPr>
-                <w:rFonts w:cstheme="minorHAnsi"/>
-                <w:b/>
-                <w:sz w:val="20"/>
-                <w:szCs w:val="20"/>
-                <w:u w:val="single"/>
-              </w:rPr>
-              <w:t>grants the USPTO authority</w:t>
-            </w:r>
-            <w:r>
-              <w:rPr>
-                <w:rFonts w:cstheme="minorHAnsi"/>
-                <w:b/>
-                <w:sz w:val="20"/>
-                <w:szCs w:val="20"/>
-              </w:rPr>
-              <w:t xml:space="preserve"> to provide the European Patent Office (EPO), the Japan Patent Office</w:t>
-            </w:r>
-          </w:p>
-          <w:p>
-            <w:pPr>
-              <w:widowControl/>
-              <w:autoSpaceDE w:val="0"/>
-              <w:autoSpaceDN w:val="0"/>
-              <w:adjustRightInd w:val="0"/>
-              <w:rPr>
-                <w:rFonts w:cstheme="minorHAnsi"/>
-                <w:b/>
-                <w:sz w:val="20"/>
-                <w:szCs w:val="20"/>
-              </w:rPr>
-            </w:pPr>
-            <w:r>
-              <w:rPr>
-                <w:rFonts w:cstheme="minorHAnsi"/>
-                <w:b/>
-                <w:sz w:val="20"/>
-                <w:szCs w:val="20"/>
-              </w:rPr>
-              <w:t>(JPO), the Korean Intellectual Property Office (KIPO), the State Intellectual Property Office of the People’s Republic of</w:t>
-            </w:r>
-          </w:p>
-          <w:p>
-            <w:pPr>
-              <w:widowControl/>
-              <w:autoSpaceDE w:val="0"/>
-              <w:autoSpaceDN w:val="0"/>
-              <w:adjustRightInd w:val="0"/>
-              <w:rPr>
-                <w:rFonts w:cstheme="minorHAnsi"/>
-                <w:b/>
-                <w:sz w:val="20"/>
-                <w:szCs w:val="20"/>
-              </w:rPr>
-            </w:pPr>
-            <w:r>
-              <w:rPr>
-                <w:rFonts w:cstheme="minorHAnsi"/>
-                <w:b/>
-                <w:sz w:val="20"/>
-                <w:szCs w:val="20"/>
-              </w:rPr>
-              <w:t>China (SIPO), the World Intellectual Property Organization (WIPO), and any other foreign intellectual property office</w:t>
-            </w:r>
-          </w:p>
-          <w:p>
-            <w:pPr>
-              <w:widowControl/>
-              <w:autoSpaceDE w:val="0"/>
-              <w:autoSpaceDN w:val="0"/>
-              <w:adjustRightInd w:val="0"/>
-              <w:rPr>
-                <w:rFonts w:cstheme="minorHAnsi"/>
-                <w:b/>
-                <w:sz w:val="20"/>
-                <w:szCs w:val="20"/>
-              </w:rPr>
-            </w:pPr>
-            <w:r>
-              <w:rPr>
-                <w:rFonts w:cstheme="minorHAnsi"/>
-                <w:b/>
-                <w:sz w:val="20"/>
-                <w:szCs w:val="20"/>
-              </w:rPr>
-              <w:t xml:space="preserve">participating with the USPTO in a bilateral or multilateral priority document exchange agreement in which </w:t>
-            </w:r>
-            <w:proofErr w:type="gramStart"/>
-            <w:r>
-              <w:rPr>
-                <w:rFonts w:cstheme="minorHAnsi"/>
-                <w:b/>
-                <w:sz w:val="20"/>
-                <w:szCs w:val="20"/>
-              </w:rPr>
-              <w:t>a foreign</w:t>
-            </w:r>
-            <w:proofErr w:type="gramEnd"/>
-          </w:p>
-          <w:p>
-            <w:pPr>
-              <w:widowControl/>
-              <w:autoSpaceDE w:val="0"/>
-              <w:autoSpaceDN w:val="0"/>
-              <w:adjustRightInd w:val="0"/>
-              <w:rPr>
-                <w:rFonts w:cstheme="minorHAnsi"/>
-                <w:b/>
-                <w:sz w:val="20"/>
-                <w:szCs w:val="20"/>
-              </w:rPr>
-            </w:pPr>
-            <w:r>
-              <w:rPr>
-                <w:rFonts w:cstheme="minorHAnsi"/>
-                <w:b/>
-                <w:sz w:val="20"/>
-                <w:szCs w:val="20"/>
-              </w:rPr>
-              <w:t>application claiming priority to the instant patent application is filed, access to: (1) the instant patent application-as-filed</w:t>
-            </w:r>
-          </w:p>
-          <w:p>
-            <w:pPr>
-              <w:widowControl/>
-              <w:autoSpaceDE w:val="0"/>
-              <w:autoSpaceDN w:val="0"/>
-              <w:adjustRightInd w:val="0"/>
-              <w:rPr>
-                <w:rFonts w:cstheme="minorHAnsi"/>
-                <w:b/>
-                <w:sz w:val="20"/>
-                <w:szCs w:val="20"/>
-              </w:rPr>
-            </w:pPr>
-            <w:r>
-              <w:rPr>
-                <w:rFonts w:cstheme="minorHAnsi"/>
-                <w:b/>
-                <w:sz w:val="20"/>
-                <w:szCs w:val="20"/>
-              </w:rPr>
-              <w:t>and its related bibliographic data, (2) any foreign or domestic application to which priority or benefit is claimed by the</w:t>
-            </w:r>
-          </w:p>
-          <w:p>
-            <w:pPr>
-              <w:widowControl/>
-              <w:autoSpaceDE w:val="0"/>
-              <w:autoSpaceDN w:val="0"/>
-              <w:adjustRightInd w:val="0"/>
-              <w:rPr>
-                <w:rFonts w:cstheme="minorHAnsi"/>
-                <w:b/>
-                <w:sz w:val="20"/>
-                <w:szCs w:val="20"/>
-              </w:rPr>
-            </w:pPr>
-            <w:r>
-              <w:rPr>
-                <w:rFonts w:cstheme="minorHAnsi"/>
-                <w:b/>
-                <w:sz w:val="20"/>
-                <w:szCs w:val="20"/>
-              </w:rPr>
-              <w:t>instant application and its related bibliographic data, and (3) the date of filing of this Authorization. See 37 CFR 1.14(h)</w:t>
-            </w:r>
-          </w:p>
-          <w:p>
-            <w:pPr>
-              <w:widowControl/>
-              <w:autoSpaceDE w:val="0"/>
-              <w:autoSpaceDN w:val="0"/>
-              <w:adjustRightInd w:val="0"/>
-              <w:rPr>
-                <w:rFonts w:cstheme="minorHAnsi"/>
-                <w:b/>
-                <w:sz w:val="20"/>
-                <w:szCs w:val="20"/>
-              </w:rPr>
-            </w:pPr>
-            <w:r>
-              <w:rPr>
-                <w:rFonts w:cstheme="minorHAnsi"/>
-                <w:b/>
-                <w:sz w:val="20"/>
-                <w:szCs w:val="20"/>
-              </w:rPr>
-              <w:t>(1).</w:t>
-            </w:r>
-          </w:p>
-          <w:p>
-            <w:pPr>
-              <w:widowControl/>
-              <w:autoSpaceDE w:val="0"/>
-              <w:autoSpaceDN w:val="0"/>
-              <w:adjustRightInd w:val="0"/>
-              <w:rPr>
-                <w:rFonts w:cstheme="minorHAnsi"/>
-                <w:b/>
-                <w:sz w:val="20"/>
-                <w:szCs w:val="20"/>
-              </w:rPr>
-            </w:pPr>
-          </w:p>
-          <w:p>
-            <w:pPr>
-              <w:widowControl/>
-              <w:autoSpaceDE w:val="0"/>
-              <w:autoSpaceDN w:val="0"/>
-              <w:adjustRightInd w:val="0"/>
-              <w:rPr>
-                <w:rFonts w:cstheme="minorHAnsi"/>
-                <w:b/>
-                <w:sz w:val="20"/>
-                <w:szCs w:val="20"/>
-              </w:rPr>
-            </w:pPr>
-            <w:r>
-              <w:rPr>
-                <w:rFonts w:cstheme="minorHAnsi"/>
-                <w:b/>
-                <w:sz w:val="20"/>
-                <w:szCs w:val="20"/>
-              </w:rPr>
-              <w:t xml:space="preserve">B. </w:t>
-            </w:r>
-            <w:r>
-              <w:rPr>
-                <w:rFonts w:cstheme="minorHAnsi"/>
-                <w:b/>
-                <w:sz w:val="20"/>
-                <w:szCs w:val="20"/>
-                <w:u w:val="single"/>
-              </w:rPr>
-              <w:t>Search Results from U.S. Application to EPO</w:t>
-            </w:r>
-            <w:r>
-              <w:rPr>
-                <w:rFonts w:cstheme="minorHAnsi"/>
-                <w:b/>
-                <w:sz w:val="20"/>
-                <w:szCs w:val="20"/>
-              </w:rPr>
-              <w:t xml:space="preserve"> - Unless box B in subsection 2 (opt-out of authorization) is checked,</w:t>
-            </w:r>
-          </w:p>
-          <w:p>
-            <w:pPr>
-              <w:widowControl/>
-              <w:autoSpaceDE w:val="0"/>
-              <w:autoSpaceDN w:val="0"/>
-              <w:adjustRightInd w:val="0"/>
-              <w:rPr>
-                <w:rFonts w:cstheme="minorHAnsi"/>
-                <w:b/>
-                <w:sz w:val="20"/>
-                <w:szCs w:val="20"/>
-              </w:rPr>
-            </w:pPr>
-            <w:r>
-              <w:rPr>
-                <w:rFonts w:cstheme="minorHAnsi"/>
-                <w:b/>
-                <w:sz w:val="20"/>
-                <w:szCs w:val="20"/>
-              </w:rPr>
-              <w:t xml:space="preserve">the undersigned hereby </w:t>
-            </w:r>
-            <w:r>
-              <w:rPr>
-                <w:rFonts w:cstheme="minorHAnsi"/>
-                <w:b/>
-                <w:sz w:val="20"/>
-                <w:szCs w:val="20"/>
-                <w:u w:val="single"/>
-              </w:rPr>
-              <w:t>grants the USPTO authority</w:t>
-            </w:r>
-            <w:r>
-              <w:rPr>
-                <w:rFonts w:cstheme="minorHAnsi"/>
-                <w:b/>
-                <w:sz w:val="20"/>
-                <w:szCs w:val="20"/>
-              </w:rPr>
-              <w:t xml:space="preserve"> to provide the EPO access to the bibliographic data and search</w:t>
-            </w:r>
-          </w:p>
-          <w:p>
-            <w:pPr>
-              <w:widowControl/>
-              <w:autoSpaceDE w:val="0"/>
-              <w:autoSpaceDN w:val="0"/>
-              <w:adjustRightInd w:val="0"/>
-              <w:rPr>
-                <w:rFonts w:cstheme="minorHAnsi"/>
-                <w:b/>
-                <w:sz w:val="20"/>
-                <w:szCs w:val="20"/>
-              </w:rPr>
-            </w:pPr>
-            <w:r>
-              <w:rPr>
-                <w:rFonts w:cstheme="minorHAnsi"/>
-                <w:b/>
-                <w:sz w:val="20"/>
-                <w:szCs w:val="20"/>
-              </w:rPr>
-              <w:t>results from the instant patent application when a European patent application claiming priority to the instant patent</w:t>
-            </w:r>
-          </w:p>
-          <w:p>
-            <w:pPr>
-              <w:widowControl/>
-              <w:autoSpaceDE w:val="0"/>
-              <w:autoSpaceDN w:val="0"/>
-              <w:adjustRightInd w:val="0"/>
-              <w:rPr>
-                <w:rFonts w:cstheme="minorHAnsi"/>
-                <w:b/>
-                <w:sz w:val="20"/>
-                <w:szCs w:val="20"/>
-              </w:rPr>
-            </w:pPr>
-            <w:r>
-              <w:rPr>
-                <w:rFonts w:cstheme="minorHAnsi"/>
-                <w:b/>
-                <w:sz w:val="20"/>
-                <w:szCs w:val="20"/>
-              </w:rPr>
-              <w:t>application is filed. See 37 CFR 1.14(h)(2).</w:t>
-            </w:r>
-          </w:p>
-          <w:p>
-            <w:pPr>
-              <w:widowControl/>
-              <w:autoSpaceDE w:val="0"/>
-              <w:autoSpaceDN w:val="0"/>
-              <w:adjustRightInd w:val="0"/>
-              <w:rPr>
-                <w:rFonts w:cstheme="minorHAnsi"/>
-                <w:b/>
-                <w:sz w:val="20"/>
-                <w:szCs w:val="20"/>
-              </w:rPr>
-            </w:pPr>
-          </w:p>
-          <w:p>
-            <w:pPr>
-              <w:widowControl/>
-              <w:autoSpaceDE w:val="0"/>
-              <w:autoSpaceDN w:val="0"/>
-              <w:adjustRightInd w:val="0"/>
-              <w:rPr>
-                <w:rFonts w:cstheme="minorHAnsi"/>
-                <w:b/>
-                <w:sz w:val="20"/>
-                <w:szCs w:val="20"/>
-              </w:rPr>
-            </w:pPr>
-            <w:r>
-              <w:rPr>
-                <w:rFonts w:cstheme="minorHAnsi"/>
-                <w:b/>
-                <w:sz w:val="20"/>
-                <w:szCs w:val="20"/>
-              </w:rPr>
-              <w:t>The applicant is reminded that the EPO’s Rule 141(1) EPC (European Patent Convention) requires applicants to submit a</w:t>
-            </w:r>
-          </w:p>
-          <w:p>
-            <w:pPr>
-              <w:widowControl/>
-              <w:autoSpaceDE w:val="0"/>
-              <w:autoSpaceDN w:val="0"/>
-              <w:adjustRightInd w:val="0"/>
-              <w:rPr>
-                <w:rFonts w:cstheme="minorHAnsi"/>
-                <w:b/>
-                <w:sz w:val="20"/>
-                <w:szCs w:val="20"/>
-              </w:rPr>
-            </w:pPr>
-            <w:r>
-              <w:rPr>
-                <w:rFonts w:cstheme="minorHAnsi"/>
-                <w:b/>
-                <w:sz w:val="20"/>
-                <w:szCs w:val="20"/>
-              </w:rPr>
-              <w:t>copy of search results from the instant application without delay in a European patent application that claims priority to</w:t>
-            </w:r>
-          </w:p>
-          <w:p>
-            <w:r>
-              <w:rPr>
-                <w:rFonts w:cstheme="minorHAnsi"/>
-                <w:b/>
-                <w:sz w:val="20"/>
-                <w:szCs w:val="20"/>
-              </w:rPr>
-              <w:t>the instant application.</w:t>
-            </w:r>
-          </w:p>
-        </w:tc>
-      </w:tr>
-      <w:tr>
-        <w:trPr>
-          <w:cantSplit/>
-          <w:trHeight w:val="3349"/>
-        </w:trPr>
-        <w:tc>
-          <w:tcPr>
-            <w:tcW w:w="10905" w:type="dxa"/>
-          </w:tcPr>
-          <w:p>
-            <w:pPr>
-              <w:widowControl/>
-              <w:autoSpaceDE w:val="0"/>
-              <w:autoSpaceDN w:val="0"/>
-              <w:adjustRightInd w:val="0"/>
-              <w:rPr>
-                <w:rFonts w:cstheme="minorHAnsi"/>
-                <w:b/>
-                <w:sz w:val="20"/>
-                <w:szCs w:val="20"/>
-              </w:rPr>
-            </w:pPr>
-          </w:p>
-          <w:p>
-            <w:pPr>
-              <w:widowControl/>
-              <w:autoSpaceDE w:val="0"/>
-              <w:autoSpaceDN w:val="0"/>
-              <w:adjustRightInd w:val="0"/>
-              <w:rPr>
-                <w:rFonts w:cstheme="minorHAnsi"/>
-                <w:b/>
-                <w:sz w:val="20"/>
-                <w:szCs w:val="20"/>
-              </w:rPr>
-            </w:pPr>
-            <w:r>
-              <w:rPr>
-                <w:rFonts w:cstheme="minorHAnsi"/>
-                <w:b/>
-                <w:sz w:val="20"/>
-                <w:szCs w:val="20"/>
-              </w:rPr>
-              <w:t>2. Opt-Out of Authorizations to Permit Access by a Foreign Intellectual Property Office(s)</w:t>
-            </w:r>
-          </w:p>
-          <w:p>
-            <w:pPr>
-              <w:widowControl/>
-              <w:autoSpaceDE w:val="0"/>
-              <w:autoSpaceDN w:val="0"/>
-              <w:adjustRightInd w:val="0"/>
-              <w:rPr>
-                <w:rFonts w:cstheme="minorHAnsi"/>
-                <w:b/>
-                <w:sz w:val="20"/>
-                <w:szCs w:val="20"/>
-              </w:rPr>
-            </w:pPr>
-          </w:p>
-          <w:p>
-            <w:pPr>
-              <w:widowControl/>
-              <w:autoSpaceDE w:val="0"/>
-              <w:autoSpaceDN w:val="0"/>
-              <w:adjustRightInd w:val="0"/>
-              <w:rPr>
-                <w:rFonts w:cstheme="minorHAnsi"/>
-                <w:b/>
-                <w:sz w:val="20"/>
-                <w:szCs w:val="20"/>
-              </w:rPr>
-            </w:pPr>
-            <w:r>
-              <w:rPr>
-                <w:rFonts w:cstheme="minorHAnsi"/>
-                <w:b/>
-                <w:sz w:val="20"/>
-                <w:szCs w:val="20"/>
-              </w:rPr>
-              <w:t xml:space="preserve">       </w:t>
-            </w:r>
-            <w:r>
-              <w:rPr>
-                <w:rFonts w:cstheme="minorHAnsi"/>
-                <w:b/>
-                <w:sz w:val="20"/>
-                <w:szCs w:val="20"/>
-              </w:rPr>
-              <w:t xml:space="preserve">A. Applicant </w:t>
-            </w:r>
-            <w:r>
-              <w:rPr>
-                <w:rFonts w:cstheme="minorHAnsi"/>
-                <w:b/>
-                <w:sz w:val="20"/>
-                <w:szCs w:val="20"/>
-                <w:u w:val="single"/>
-              </w:rPr>
-              <w:t>DOES NOT</w:t>
-            </w:r>
-            <w:r>
-              <w:rPr>
-                <w:rFonts w:cstheme="minorHAnsi"/>
-                <w:b/>
-                <w:sz w:val="20"/>
-                <w:szCs w:val="20"/>
-              </w:rPr>
-              <w:t xml:space="preserve"> authorize the USPTO to permit </w:t>
-            </w:r>
-            <w:proofErr w:type="gramStart"/>
-            <w:r>
-              <w:rPr>
-                <w:rFonts w:cstheme="minorHAnsi"/>
-                <w:b/>
-                <w:sz w:val="20"/>
-                <w:szCs w:val="20"/>
-              </w:rPr>
-              <w:t>a participating</w:t>
-            </w:r>
-            <w:proofErr w:type="gramEnd"/>
-            <w:r>
-              <w:rPr>
-                <w:rFonts w:cstheme="minorHAnsi"/>
-                <w:b/>
-                <w:sz w:val="20"/>
-                <w:szCs w:val="20"/>
-              </w:rPr>
-              <w:t xml:space="preserve"> foreign IP office access to the instant</w:t>
-            </w:r>
-          </w:p>
-          <w:p>
-            <w:pPr>
-              <w:widowControl/>
-              <w:autoSpaceDE w:val="0"/>
-              <w:autoSpaceDN w:val="0"/>
-              <w:adjustRightInd w:val="0"/>
-              <w:rPr>
-                <w:rFonts w:cstheme="minorHAnsi"/>
-                <w:b/>
-                <w:sz w:val="20"/>
-                <w:szCs w:val="20"/>
-              </w:rPr>
-            </w:pPr>
-            <w:sdt>
-              <w:sdtPr>
-                <w:rPr>
-                  <w:rFonts w:cstheme="minorHAnsi"/>
-                  <w:b/>
-                  <w:sz w:val="28"/>
-                  <w:szCs w:val="28"/>
-                </w:rPr>
-                <w:id w:val="-1852022959"/>
-                <w14:checkbox>
-                  <w14:checked w14:val="0"/>
-                  <w14:checkedState w14:val="2612" w14:font="MS Gothic"/>
-                  <w14:uncheckedState w14:val="2610" w14:font="MS Gothic"/>
-                </w14:checkbox>
-              </w:sdtPr>
-              <w:sdtContent>
-                <w:r>
-                  <w:rPr>
-                    <w:rFonts w:ascii="MS Gothic" w:eastAsia="MS Gothic" w:hAnsi="MS Gothic" w:cstheme="minorHAnsi" w:hint="eastAsia"/>
-                    <w:b/>
-                    <w:sz w:val="28"/>
-                    <w:szCs w:val="28"/>
-                  </w:rPr>
-                  <w:t>☐</w:t>
-                </w:r>
-              </w:sdtContent>
-            </w:sdt>
-            <w:r>
-              <w:rPr>
-                <w:rFonts w:cstheme="minorHAnsi"/>
-                <w:b/>
-                <w:sz w:val="28"/>
-                <w:szCs w:val="28"/>
-              </w:rPr>
-              <w:t xml:space="preserve"> </w:t>
-            </w:r>
-            <w:r>
-              <w:rPr>
-                <w:rFonts w:cstheme="minorHAnsi"/>
-                <w:b/>
-                <w:sz w:val="20"/>
-                <w:szCs w:val="20"/>
-              </w:rPr>
-              <w:t>application-as-filed. If this box is checked, the USPTO will not be providing a participating foreign IP office with</w:t>
-            </w:r>
-          </w:p>
-          <w:p>
-            <w:pPr>
-              <w:widowControl/>
-              <w:autoSpaceDE w:val="0"/>
-              <w:autoSpaceDN w:val="0"/>
-              <w:adjustRightInd w:val="0"/>
-              <w:rPr>
-                <w:rFonts w:cstheme="minorHAnsi"/>
-                <w:b/>
-                <w:sz w:val="20"/>
-                <w:szCs w:val="20"/>
-              </w:rPr>
-            </w:pPr>
-            <w:r>
-              <w:rPr>
-                <w:rFonts w:cstheme="minorHAnsi"/>
-                <w:b/>
-                <w:sz w:val="20"/>
-                <w:szCs w:val="20"/>
-              </w:rPr>
-              <w:t xml:space="preserve">      </w:t>
-            </w:r>
-            <w:r>
-              <w:rPr>
-                <w:rFonts w:cstheme="minorHAnsi"/>
-                <w:b/>
-                <w:sz w:val="20"/>
-                <w:szCs w:val="20"/>
-              </w:rPr>
-              <w:t xml:space="preserve">  </w:t>
-            </w:r>
-            <w:r>
-              <w:rPr>
-                <w:rFonts w:cstheme="minorHAnsi"/>
-                <w:b/>
-                <w:sz w:val="20"/>
-                <w:szCs w:val="20"/>
-              </w:rPr>
-              <w:t>any documents and information identified in subsection 1A above.</w:t>
-            </w:r>
-          </w:p>
-          <w:p>
-            <w:pPr>
-              <w:widowControl/>
-              <w:autoSpaceDE w:val="0"/>
-              <w:autoSpaceDN w:val="0"/>
-              <w:adjustRightInd w:val="0"/>
-              <w:rPr>
-                <w:rFonts w:cstheme="minorHAnsi"/>
-                <w:b/>
-                <w:sz w:val="20"/>
-                <w:szCs w:val="20"/>
-              </w:rPr>
-            </w:pPr>
-          </w:p>
-          <w:p>
-            <w:pPr>
-              <w:widowControl/>
-              <w:autoSpaceDE w:val="0"/>
-              <w:autoSpaceDN w:val="0"/>
-              <w:adjustRightInd w:val="0"/>
-              <w:rPr>
-                <w:rFonts w:cstheme="minorHAnsi"/>
-                <w:b/>
-                <w:sz w:val="20"/>
-                <w:szCs w:val="20"/>
-              </w:rPr>
-            </w:pPr>
-            <w:sdt>
-              <w:sdtPr>
-                <w:rPr>
-                  <w:rFonts w:cstheme="minorHAnsi"/>
-                  <w:b/>
-                  <w:sz w:val="28"/>
-                </w:rPr>
-                <w:id w:val="1367333391"/>
-                <w14:checkbox>
-                  <w14:checked w14:val="0"/>
-                  <w14:checkedState w14:val="2612" w14:font="MS Gothic"/>
-                  <w14:uncheckedState w14:val="2610" w14:font="MS Gothic"/>
-                </w14:checkbox>
-              </w:sdtPr>
-              <w:sdtContent>
-                <w:r>
-                  <w:rPr>
-                    <w:rFonts w:ascii="MS Gothic" w:eastAsia="MS Gothic" w:hAnsi="MS Gothic" w:cstheme="minorHAnsi" w:hint="eastAsia"/>
-                    <w:b/>
-                    <w:sz w:val="28"/>
-                  </w:rPr>
-                  <w:t>☐</w:t>
-                </w:r>
-              </w:sdtContent>
-            </w:sdt>
-            <w:r>
-              <w:rPr>
-                <w:rFonts w:cstheme="minorHAnsi"/>
-                <w:b/>
-                <w:sz w:val="24"/>
-                <w:szCs w:val="20"/>
-              </w:rPr>
-              <w:t xml:space="preserve">  </w:t>
-            </w:r>
-            <w:r>
-              <w:rPr>
-                <w:rFonts w:cstheme="minorHAnsi"/>
-                <w:b/>
-                <w:sz w:val="20"/>
-                <w:szCs w:val="20"/>
-              </w:rPr>
-              <w:t xml:space="preserve">B. Applicant </w:t>
-            </w:r>
-            <w:r>
-              <w:rPr>
-                <w:rFonts w:cstheme="minorHAnsi"/>
-                <w:b/>
-                <w:sz w:val="20"/>
-                <w:szCs w:val="20"/>
-                <w:u w:val="single"/>
-              </w:rPr>
-              <w:t>DOES NOT</w:t>
-            </w:r>
-            <w:r>
-              <w:rPr>
-                <w:rFonts w:cstheme="minorHAnsi"/>
-                <w:b/>
-                <w:sz w:val="20"/>
-                <w:szCs w:val="20"/>
-              </w:rPr>
-              <w:t xml:space="preserve"> authorize the USPTO to transmit to the EPO any search results from the instant patent</w:t>
-            </w:r>
-          </w:p>
-          <w:p>
-            <w:pPr>
-              <w:widowControl/>
-              <w:autoSpaceDE w:val="0"/>
-              <w:autoSpaceDN w:val="0"/>
-              <w:adjustRightInd w:val="0"/>
-              <w:rPr>
-                <w:rFonts w:cstheme="minorHAnsi"/>
-                <w:b/>
-                <w:sz w:val="20"/>
-                <w:szCs w:val="20"/>
-              </w:rPr>
-            </w:pPr>
-            <w:r>
-              <w:rPr>
-                <w:rFonts w:cstheme="minorHAnsi"/>
-                <w:b/>
-                <w:sz w:val="20"/>
-                <w:szCs w:val="20"/>
-              </w:rPr>
-              <w:t xml:space="preserve">       </w:t>
-            </w:r>
-            <w:r>
-              <w:rPr>
-                <w:rFonts w:cstheme="minorHAnsi"/>
-                <w:b/>
-                <w:sz w:val="20"/>
-                <w:szCs w:val="20"/>
-              </w:rPr>
-              <w:t>application. If this box is checked, the USPTO will not be providing the EPO with search results from the instant</w:t>
-            </w:r>
-          </w:p>
-          <w:p>
-            <w:pPr>
-              <w:widowControl/>
-              <w:autoSpaceDE w:val="0"/>
-              <w:autoSpaceDN w:val="0"/>
-              <w:adjustRightInd w:val="0"/>
-              <w:rPr>
-                <w:rFonts w:cstheme="minorHAnsi"/>
-                <w:b/>
-                <w:sz w:val="20"/>
-                <w:szCs w:val="20"/>
-              </w:rPr>
-            </w:pPr>
-            <w:r>
-              <w:rPr>
-                <w:rFonts w:cstheme="minorHAnsi"/>
-                <w:b/>
-                <w:sz w:val="20"/>
-                <w:szCs w:val="20"/>
-              </w:rPr>
-              <w:t xml:space="preserve">       </w:t>
-            </w:r>
-            <w:r>
-              <w:rPr>
-                <w:rFonts w:cstheme="minorHAnsi"/>
-                <w:b/>
-                <w:sz w:val="20"/>
-                <w:szCs w:val="20"/>
-              </w:rPr>
-              <w:t>application.</w:t>
-            </w:r>
-          </w:p>
-          <w:p>
-            <w:pPr>
-              <w:widowControl/>
-              <w:autoSpaceDE w:val="0"/>
-              <w:autoSpaceDN w:val="0"/>
-              <w:adjustRightInd w:val="0"/>
-              <w:rPr>
-                <w:rFonts w:cstheme="minorHAnsi"/>
-                <w:b/>
-                <w:sz w:val="20"/>
-                <w:szCs w:val="20"/>
-              </w:rPr>
-            </w:pPr>
-          </w:p>
-          <w:p>
-            <w:pPr>
-              <w:widowControl/>
-              <w:autoSpaceDE w:val="0"/>
-              <w:autoSpaceDN w:val="0"/>
-              <w:adjustRightInd w:val="0"/>
-              <w:rPr>
-                <w:rFonts w:cstheme="minorHAnsi"/>
-                <w:b/>
-                <w:sz w:val="20"/>
-                <w:szCs w:val="20"/>
-              </w:rPr>
-            </w:pPr>
-            <w:r>
-              <w:rPr>
-                <w:rFonts w:cstheme="minorHAnsi"/>
-                <w:b/>
-                <w:sz w:val="20"/>
-                <w:szCs w:val="20"/>
-              </w:rPr>
-              <w:t>NOTE: Once the application has published or is otherwise publicly available, the USPTO may provide access to the</w:t>
-            </w:r>
-          </w:p>
-          <w:p>
-            <w:pPr>
-              <w:widowControl/>
-              <w:autoSpaceDE w:val="0"/>
-              <w:autoSpaceDN w:val="0"/>
-              <w:adjustRightInd w:val="0"/>
-              <w:rPr>
-                <w:rFonts w:cstheme="minorHAnsi"/>
-                <w:b/>
-                <w:sz w:val="20"/>
-                <w:szCs w:val="20"/>
-              </w:rPr>
-            </w:pPr>
-            <w:r>
-              <w:rPr>
-                <w:rFonts w:cstheme="minorHAnsi"/>
-                <w:b/>
-                <w:sz w:val="20"/>
-                <w:szCs w:val="20"/>
-              </w:rPr>
-              <w:t>application in accordance with 37 CFR 1.14.</w:t>
-            </w:r>
-          </w:p>
-        </w:tc>
-      </w:tr>
-    </w:tbl>
-    <w:p>
-      <w:pPr>
-        <w:spacing w:after="0" w:line="120" w:lineRule="auto"/>
-        <w:ind w:firstLine="187"/>
-        <w:rPr>
-          <w:b/>
-          <w:sz w:val="28"/>
-          <w:szCs w:val="28"/>
-        </w:rPr>
-      </w:pPr>
-    </w:p>
-    <w:p>
-      <w:pPr>
-        <w:spacing w:after="0" w:line="240" w:lineRule="auto"/>
-        <w:ind w:firstLine="180"/>
-        <w:rPr>
-          <w:b/>
-          <w:sz w:val="28"/>
-          <w:szCs w:val="28"/>
-        </w:rPr>
-      </w:pPr>
-      <w:r>
-        <w:rPr>
-          <w:b/>
-          <w:sz w:val="28"/>
-          <w:szCs w:val="28"/>
-        </w:rPr>
-        <w:t>Applicant Information:</w:t>
-      </w:r>
     </w:p>
     <w:sectPr>
       <w:headerReference w:type="default" r:id="rId8"/>

</xml_diff>